<commit_message>
docs(dossier): volumétrie Sirene, licence ODbL des référentiels [B1][B2]
Générateur du dossier corrigé, document régénéré.
</commit_message>
<xml_diff>
--- a/docs/sous-docs-projets/dossier/Projet_Certification_KIONGHAT_Johann.docx
+++ b/docs/sous-docs-projets/dossier/Projet_Certification_KIONGHAT_Johann.docx
@@ -1095,7 +1095,7 @@
           <w:p>
             <w:r/>
             <w:r>
-              <w:t>36 millions d'établissements et 25 millions d'unités légales ; 11,2 Go compressés, 25 à 30 Go décompressés ; disponible en Parquet</w:t>
+              <w:t>36 millions d'établissements et 25 millions d'unités légales ; 6,44 Go compressés (ZIP) et 4,63 Go en Parquet pour les quatre fichiers retenus, stock du 1er août 2026</w:t>
             </w:r>
           </w:p>
         </w:tc>
@@ -1141,7 +1141,7 @@
           <w:p>
             <w:r/>
             <w:r>
-              <w:t>Référentiels de quelques mégaoctets, mis à jour en continu</w:t>
+              <w:t>IDÉO : 5 869 formations, 1 534 métiers, 24 278 structures (15,9 Mo). RNCP et Répertoire spécifique : 36 000 fiches dont 6 995 actives, export quotidien</w:t>
             </w:r>
           </w:p>
         </w:tc>
@@ -1152,7 +1152,7 @@
           <w:p>
             <w:r/>
             <w:r>
-              <w:t>Licence Ouverte</w:t>
+              <w:t>ONISEP et IDÉO : ODbL — partage à l'identique obligatoire sur tout dérivé redistribué. RNCP (France Compétences) : Licence Ouverte v2.0</w:t>
             </w:r>
           </w:p>
         </w:tc>

</xml_diff>

<commit_message>
docs(avancement): étape E05 validée, volumétrie Parcoursup [B3][B2]
Catalogue Parcoursup mesuré à 82 Mo sur disque et non ~100 Mo :
corrigé dans la doc, les ADR 0001 et 0002 et le dossier.
ADR 0004 (primitives partagées, quarantaine du manifeste) et page
03-pipeline/ingestion.md.
</commit_message>
<xml_diff>
--- a/docs/sous-docs-projets/dossier/Projet_Certification_KIONGHAT_Johann.docx
+++ b/docs/sous-docs-projets/dossier/Projet_Certification_KIONGHAT_Johann.docx
@@ -1049,7 +1049,7 @@
           <w:p>
             <w:r/>
             <w:r>
-              <w:t>104 274 formation-années, 118 colonnes, environ 100 Mo. 77 159 cellules exploitables par millésime</w:t>
+              <w:t>104 274 formation-années, 118 colonnes (2025), 82 Mo mesurés sur les 8 CSV posés sur disque. 77 159 cellules exploitables par millésime</w:t>
             </w:r>
           </w:p>
         </w:tc>
@@ -1987,7 +1987,7 @@
           </w:p>
           <w:p>
             <w:r>
-              <w:t>Quelques dizaines de milliers de formations, soit environ 100 Mo, ne justifient en aucun cas un cluster distribué. Employer Spark sur cette chaîne serait un surdimensionnement, pénalisable au titre des critères d'arbitrage, de FinOps et de GreenOps. La chaîne de décision est donc traitée en mono-nœud avec Polars et dbt.</w:t>
+              <w:t>Quelques dizaines de milliers de formations, soit 82 Mo mesurés sur disque, ne justifient en aucun cas un cluster distribué. Employer Spark sur cette chaîne serait un surdimensionnement, pénalisable au titre des critères d'arbitrage, de FinOps et de GreenOps. La chaîne de décision est donc traitée en mono-nœud avec Polars et dbt.</w:t>
             </w:r>
           </w:p>
           <w:p>

</xml_diff>

<commit_message>
feat(ingestion): connecteur Sirene par résolution de catalogue [B3][B2]
URL résolues à l'exécution via le catalogue data.gouv, sans lien figé,
correspondance de titre ancrée. Erreurs transitoires et définitives
communes dans _flux.py ; taille écrite comparée à la taille annoncée.
Volumétrie mesurée : 43 896 818 établissements. ADR 0005 et 0006.
</commit_message>
<xml_diff>
--- a/docs/sous-docs-projets/dossier/Projet_Certification_KIONGHAT_Johann.docx
+++ b/docs/sous-docs-projets/dossier/Projet_Certification_KIONGHAT_Johann.docx
@@ -645,7 +645,7 @@
         <w:pStyle w:val="ListBullet"/>
       </w:pPr>
       <w:r>
-        <w:t>Volumétrie et hétérogénéité : cinq sources publiques dont les tailles s'échelonnent sur plus de deux ordres de grandeur, du référentiel de quelques mégaoctets à une base de 36 millions d'établissements. Les confondre conduirait soit à sous-dimensionner, soit à surdimensionner l'architecture (section 2).</w:t>
+        <w:t>Volumétrie et hétérogénéité : cinq sources publiques dont les tailles s'échelonnent sur plus de deux ordres de grandeur, du référentiel de quelques mégaoctets à une base de 43,9 millions d'établissements. Les confondre conduirait soit à sous-dimensionner, soit à surdimensionner l'architecture (section 2).</w:t>
       </w:r>
     </w:p>
     <w:p>
@@ -1095,7 +1095,7 @@
           <w:p>
             <w:r/>
             <w:r>
-              <w:t>36 millions d'établissements et 25 millions d'unités légales ; 6,44 Go compressés (ZIP) et 4,63 Go en Parquet pour les quatre fichiers retenus, stock du 1er août 2026</w:t>
+              <w:t>43 896 818 établissements et 29 922 486 unités légales ; 6,44 Go compressés (ZIP) et 4,63 Go en Parquet pour les quatre fichiers retenus, stock du 1er août 2026</w:t>
             </w:r>
           </w:p>
         </w:tc>
@@ -1172,7 +1172,7 @@
         <w:pStyle w:val="ListBullet"/>
       </w:pPr>
       <w:r>
-        <w:t>Volume : 36 millions d'établissements à joindre et agréger par secteur et par territoire, soit 25 à 30 Go décompressés, à côté d'un référentiel d'admission d'une centaine de mégaoctets.</w:t>
+        <w:t>Volume : 43,9 millions d'établissements à joindre et agréger par secteur et par territoire, soit 25 à 30 Go décompressés, à côté d'un référentiel d'admission d'une centaine de mégaoctets.</w:t>
       </w:r>
     </w:p>
     <w:p>
@@ -1959,7 +1959,7 @@
           <w:b w:val="0"/>
           <w:i w:val="0"/>
         </w:rPr>
-        <w:t>Le nettoyage de la chaîne Sirene mérite une précision, car il conditionne la faisabilité : les 36 millions de lignes ne sont jamais nettoyées ligne à ligne. Le format Parquet étant orienté colonnes, seules neuf colonnes sur cinquante-quatre sont lues, et le filtrage (établissements actifs, employeurs, diffusibles) est poussé au niveau du fichier. Le volume est ainsi réduit avant toute transformation, et les contrôles qualité s'appliquent ensuite à des agrégats de quelques centaines de milliers de lignes, inspectables et testables.</w:t>
+        <w:t>Le nettoyage de la chaîne Sirene mérite une précision, car il conditionne la faisabilité : les 43,9 millions de lignes ne sont jamais nettoyées ligne à ligne. Le format Parquet étant orienté colonnes, seules neuf colonnes sur cinquante-quatre sont lues, et le filtrage (établissements actifs, employeurs, diffusibles) est poussé au niveau du fichier. Le volume est ainsi réduit avant toute transformation, et les contrôles qualité s'appliquent ensuite à des agrégats de quelques centaines de milliers de lignes, inspectables et testables.</w:t>
       </w:r>
     </w:p>
     <w:tbl>
@@ -1992,12 +1992,12 @@
           </w:p>
           <w:p>
             <w:r>
-              <w:t>Le calcul distribué est justifié par la chaîne de volume. La base Sirene compte 36 millions d'établissements, soit 25 à 30 Go décompressés. Cette volumétrie est réelle, publique et vérifiée par téléchargement : elle n'est pas déclarée.</w:t>
+              <w:t>Le calcul distribué est justifié par la chaîne de volume. La base Sirene compte 43 896 818 établissements (métadonnée Parquet mesurée le 1er août 2026), soit 25 à 30 Go décompressés. Cette volumétrie est réelle, publique et vérifiée par téléchargement : elle n'est pas déclarée.</w:t>
             </w:r>
           </w:p>
           <w:p>
             <w:r>
-              <w:t>Ce n'est d'ailleurs pas la taille du stockage qui impose le traitement distribué, mais la nature du calcul : il faut joindre 36 millions d'établissements aux formations par nomenclature d'activité et par territoire, puis agréger par secteur, par bassin et par année sur dix ans d'historique. Le volume intermédiaire de jointure excède largement celui des sources. Le format Parquet, en colonnes, est lu nativement par Spark.</w:t>
+              <w:t>Ce n'est d'ailleurs pas la taille du stockage qui impose le traitement distribué, mais la nature du calcul : il faut joindre 43,9 millions d'établissements aux formations par nomenclature d'activité et par territoire, puis agréger par secteur, par bassin et par année sur dix ans d'historique. Le volume intermédiaire de jointure excède largement celui des sources. Le format Parquet, en colonnes, est lu nativement par Spark.</w:t>
             </w:r>
           </w:p>
           <w:p>

</xml_diff>

<commit_message>
docs(dossier): dossier aligné sur l'état du dépôt [B1][B2][B3][B4]
Seize composants non construits passés au futur ; les composants
existants restent au présent. Code de session AIA02, quatre
dimensions réelles du modèle en étoile, paragraphe qualité scindé.
</commit_message>
<xml_diff>
--- a/docs/sous-docs-projets/dossier/Projet_Certification_KIONGHAT_Johann.docx
+++ b/docs/sous-docs-projets/dossier/Projet_Certification_KIONGHAT_Johann.docx
@@ -131,7 +131,7 @@
           <w:p>
             <w:r/>
             <w:r>
-              <w:t>Architecte en Intelligence Artificielle - Mastère 2 (AIA01)</w:t>
+              <w:t>Architecte en Intelligence Artificielle - Mastère 2 (AIA02)</w:t>
             </w:r>
           </w:p>
         </w:tc>
@@ -216,7 +216,7 @@
           <w:b w:val="0"/>
           <w:i w:val="0"/>
         </w:rPr>
-        <w:t>La ségrégation par le genre est le trait le plus frappant de ces données. Sur la session Parcoursup 2025, qui couvre 14 252 formations, 2 954 d'entre elles, soit 20,7 pour cent, comptent moins de 20 pour cent de femmes parmi leurs admis, et 2 517 en comptent plus de 80 pour cent ; seules 21,3 pour cent se situent dans une zone équilibrée, entre 40 et 60 pour cent. L'écart est structurel : la médiane du taux de féminisation atteint 18 pour cent en école d'ingénieur, contre 86 pour cent en institut de formation en soins infirmiers et 90 pour cent dans les formations du travail social.</w:t>
+        <w:t>La ségrégation par le genre est le trait le plus frappant de ces données. Sur la session Parcoursup 2025, qui couvre 14 252 formations, 2 775 d'entre elles, soit 19,7 pour cent sur dénominateur non nul (les formations n'admettant aucun candidat sont exclues du calcul, sans quoi un taux nul mécanique se lirait à tort comme une extrême faible féminisation), comptent moins de 20 pour cent de femmes parmi leurs admis, et 17,9 pour cent en comptent plus de 80 pour cent ; seules 21,5 pour cent se situent dans une zone équilibrée, entre 40 et 60 pour cent. L'écart est structurel : la médiane du taux de féminisation atteint 18 pour cent en école d'ingénieur, contre 86 pour cent en institut de formation en soins infirmiers et 90 pour cent dans les formations du travail social.</w:t>
       </w:r>
     </w:p>
     <w:p>
@@ -451,7 +451,7 @@
           <w:p>
             <w:r/>
             <w:r>
-              <w:t>Parcoursup, huit millésimes</w:t>
+              <w:t>Parcoursup, huit millésimes bruts, six exploitables pour le label (2020-2025)</w:t>
             </w:r>
           </w:p>
         </w:tc>
@@ -462,7 +462,7 @@
           <w:p>
             <w:r/>
             <w:r>
-              <w:t>MODÈLE APPRIS (LightGBM), explicabilité SHAP</w:t>
+              <w:t>MODÈLE APPRIS (LightGBM, entraîné et tracé dans MLflow), explicabilité SHAP à venir</w:t>
             </w:r>
           </w:p>
         </w:tc>
@@ -1658,7 +1658,7 @@
           <w:b w:val="0"/>
           <w:i w:val="0"/>
         </w:rPr>
-        <w:t>Modélisation : un modèle relationnel normalisé sous PostgreSQL portera le transactionnel (utilisateurs, établissements, historique des recommandations), et un modèle analytique en étoile structurera les données d'orientation : la table de faits porte les cellules d'observation, avec pour dimensions la formation, le candidat, le métier, le temps et le territoire. Le choix de PostgreSQL plutôt que de conserver Firestore est justifié par le besoin de cohérence relationnelle et de requêtes analytiques que le NoSQL documentaire sert mal ; le modèle en étoile est retenu pour la prédominance des lectures analytiques.</w:t>
+        <w:t>Modélisation : un modèle relationnel normalisé sous PostgreSQL portera le transactionnel (utilisateurs, établissements, historique des recommandations) — à construire, ce périmètre n'existe pas encore. Le modèle analytique en étoile qui structure les données d'orientation, lui, est déjà construit (E16) : la table de faits porte les cellules d'observation, avec pour dimensions la formation, le candidat, la session et le territoire. Le choix de PostgreSQL plutôt que de conserver Firestore est justifié par le besoin de cohérence relationnelle et de requêtes analytiques que le NoSQL documentaire sert mal ; le modèle en étoile est retenu pour la prédominance des lectures analytiques.</w:t>
       </w:r>
     </w:p>
     <w:p>
@@ -1667,7 +1667,7 @@
           <w:b w:val="0"/>
           <w:i w:val="0"/>
         </w:rPr>
-        <w:t>Infrastructure : les services seront conteneurisés avec Docker et orchestrés sur Kubernetes managé. Les données brutes atterriront dans un lac de données sur stockage objet S3-compatible. L'hébergement cible est un cloud souverain européen (Scaleway plutôt qu'un hyperscaler hors Union européenne), arbitrage de gouvernance assumé au regard des données de mineurs. Sécurisation par chiffrement, gestion des accès par rôles et cloisonnement réseau ; surveillance par Prometheus et Grafana avec alertes sur seuils.</w:t>
+        <w:t>Infrastructure : les services seront conteneurisés avec Docker et orchestrés sur Kubernetes managé. Les données brutes atterriront dans un lac de données sur stockage objet S3-compatible. L'hébergement cible est un cloud souverain européen (Scaleway plutôt qu'un hyperscaler hors Union européenne), arbitrage de gouvernance assumé au regard des données de mineurs. Sécurité et supervision prévues, non encore mises en œuvre : chiffrement, gestion des accès par rôles et cloisonnement réseau ; surveillance par Prometheus et Grafana avec alertes sur seuils.</w:t>
       </w:r>
     </w:p>
     <w:tbl>
@@ -1950,7 +1950,7 @@
         <w:pStyle w:val="ListBullet"/>
       </w:pPr>
       <w:r>
-        <w:t>Chaîne de volume, traitée en distribué avec PySpark : agrégation de la base Sirene par commune et par secteur d'activité, calcul des dynamiques de créations et cessations sur dix ans, puis élargissement au bassin d'emploi. Volumétrie de l'ordre de la dizaine de gigaoctets.</w:t>
+        <w:t>Chaîne de volume, agrégation de la base Sirene par commune et par secteur d'activité, calcul des dynamiques de créations et cessations sur dix ans, puis élargissement au bassin d'emploi. Volumétrie de l'ordre de la dizaine de gigaoctets. Deux moteurs implémentés et testés contre le même résultat : Polars en exécution courante, PySpark branché sur le mode cluster.</w:t>
       </w:r>
     </w:p>
     <w:p>
@@ -1982,27 +1982,27 @@
               <w:rPr>
                 <w:b/>
               </w:rPr>
-              <w:t>Justification du choix : traitement distribué sur la couche de volume seulement</w:t>
+              <w:t>Justification du choix : mesurer avant de choisir le moteur de la chaîne de volume</w:t>
             </w:r>
           </w:p>
           <w:p>
             <w:r>
-              <w:t>Quelques dizaines de milliers de formations, soit 82 Mo mesurés sur disque, ne justifient en aucun cas un cluster distribué. Employer Spark sur cette chaîne serait un surdimensionnement, pénalisable au titre des critères d'arbitrage, de FinOps et de GreenOps. La chaîne de décision est donc traitée en mono-nœud avec Polars et dbt.</w:t>
+              <w:t>Quelques dizaines de milliers de formations, soit 82 Mo mesurés sur disque, ne justifient en aucun cas un cluster distribué. La chaîne de décision est donc traitée en mono-nœud avec Polars et dbt : ce point-là ne fait pas débat.</w:t>
             </w:r>
           </w:p>
           <w:p>
             <w:r>
-              <w:t>Le calcul distribué est justifié par la chaîne de volume. La base Sirene compte 43 896 818 établissements (métadonnée Parquet mesurée le 1er août 2026), soit 25 à 30 Go décompressés. Cette volumétrie est réelle, publique et vérifiée par téléchargement : elle n'est pas déclarée.</w:t>
+              <w:t>Pour la chaîne de volume, la question a été tranchée par la mesure et non par principe. Sur le fichier Sirene complet (43 896 818 lignes, 54 colonnes, réduites à 9 colonnes utiles), même filtre, même regroupement en 1 929 179 cellules : Polars traite le fichier en 18,2 secondes, PySpark en 87,0 secondes (démarrage de la JVM inclus) — Spark est 4,8 fois plus lent que Polars sur ce volume, pour un résultat rigoureusement identique. La conclusion n'est pas que Spark est inutile, mais qu'il n'apporte rien tant que le calcul tient sur un seul nœud.</w:t>
             </w:r>
           </w:p>
           <w:p>
             <w:r>
-              <w:t>Ce n'est d'ailleurs pas la taille du stockage qui impose le traitement distribué, mais la nature du calcul : il faut joindre 43,9 millions d'établissements aux formations par nomenclature d'activité et par territoire, puis agréger par secteur, par bassin et par année sur dix ans d'historique. Le volume intermédiaire de jointure excède largement celui des sources. Le format Parquet, en colonnes, est lu nativement par Spark.</w:t>
+              <w:t>Ce qui empêche d'écarter Spark pour autant : l'une des quatre sources Sirene retenues, l'historique des établissements, compte à elle seule 95 865 102 lignes, et le stock est republié chaque mois. Une fusion future de plusieurs de ces fichiers change d'ordre de grandeur. Le job Spark est donc implémenté, testé (même résultat que Polars, vérifié ligne à ligne sur un échantillon commun) et branché sur le mode cluster de la configuration (`execution.moteur_volume`) — prêt à prendre le relais sans réécriture, mais pas employé par défaut faute de bénéfice mesuré aujourd'hui.</w:t>
             </w:r>
           </w:p>
           <w:p>
             <w:r>
-              <w:t>La règle est symétrique : tout traitement dont la volumétrie reste inférieure à quelques dizaines de gigaoctets est exécuté en mono-nœud. Le passage au distribué est conditionné à un seuil, non appliqué par principe.</w:t>
+              <w:t>Le seuil qui ferait basculer l'exécution courante vers Spark : la fusion de plusieurs des quatre fichiers Sirene retenus, ou tout calcul intermédiaire qui ne tiendrait plus dans la mémoire d'un poste de développement. Tant que ce seuil n'est pas franchi, Polars reste le chemin de production réel, et le choix contraire — imposer Spark par principe — serait pénalisable au titre des critères d'arbitrage, de FinOps et de GreenOps.</w:t>
             </w:r>
           </w:p>
         </w:tc>
@@ -2204,7 +2204,16 @@
           <w:b w:val="0"/>
           <w:i w:val="0"/>
         </w:rPr>
-        <w:t>L'orchestration est assurée par Apache Airflow : planification, reprise sur erreur avec temporisation croissante, lignage. La chaîne s'exécute sans intervention manuelle, de la collecte jusqu'à l'évaluation du modèle. Les contrôles qualité portent sur le schéma, la complétude et la cohérence, au moyen de suites de tests versionnées (Great Expectations) : un taux hors de l'intervalle admissible, un effectif incohérent ou un millésime manquant bloquent la mise à jour. Ce blocage n'est pas une précaution facultative : sans lui, une donnée corrompue se propage jusqu'au modèle sans que personne ne le constate. La supervision suit la volumétrie traitée, le taux d'échec et la durée d'exécution, avec alertes proactives. La conformité RGPD est assurée par la minimisation et la traçabilité, la couche de volume ne contenant par construction aucune donnée à caractère personnel.</w:t>
+        <w:t>Les contrôles qualité, déjà construits et exécutés (E14), portent sur le schéma, la complétude et la cohérence, au moyen de contrôles versionnés (schémas Pandera pour Parcoursup, compteurs écrits à la main pour Sirene et les référentiels, retenus après mesure du coût de Great Expectations sur ce volume — inutile ici) : un taux hors de l'intervalle admissible, un effectif incohérent ou un millésime manquant bloquent la mise à jour, vérifié par une exécution réelle qui sort en échec sur les données du dépôt. Ce blocage n'est pas une précaution facultative : sans lui, une donnée corrompue se propage jusqu'au modèle sans que personne ne le constate. La conformité RGPD est assurée par la minimisation et la traçabilité, la couche de volume ne contenant par construction aucune donnée à caractère personnel.</w:t>
+      </w:r>
+    </w:p>
+    <w:p>
+      <w:r>
+        <w:rPr>
+          <w:b w:val="0"/>
+          <w:i w:val="0"/>
+        </w:rPr>
+        <w:t>Ce qui reste à construire : l'enchaînement de ces contrôles avec les étapes en amont et en aval est aujourd'hui piloté manuellement (`Makefile`), pas encore par un orchestrateur. Apache Airflow assurera la planification, la reprise sur erreur avec temporisation croissante et le lignage, pour que la chaîne s'exécute sans intervention manuelle, de la collecte jusqu'à l'évaluation du modèle. La supervision suivra la volumétrie traitée, le taux d'échec et la durée d'exécution, avec alertes proactives. Ce choix est déjà arbitré (Airflow est exigé par le référentiel de certification et retenu depuis l'architecture de référence), et son exécution est la matière de l'étape suivante du pipeline, non encore commencée.</w:t>
       </w:r>
     </w:p>
     <w:p>
@@ -2403,7 +2412,7 @@
           <w:p>
             <w:r/>
             <w:r>
-              <w:t>Parcoursup, huit millésimes</w:t>
+              <w:t>Parcoursup, huit millésimes bruts ; six exploitables pour l'entraînement (2020-2025), le numérateur du label n'étant pas publié en 2018-2019</w:t>
             </w:r>
           </w:p>
         </w:tc>
@@ -2414,7 +2423,7 @@
           <w:p>
             <w:r/>
             <w:r>
-              <w:t>MODÈLE APPRIS (LightGBM), explicabilité SHAP. C'est le composant d'intelligence artificielle du système.</w:t>
+              <w:t>MODÈLE APPRIS (LightGBM, entraîné et tracé dans MLflow). C'est le composant d'intelligence artificielle du système ; l'explicabilité SHAP reste à construire.</w:t>
             </w:r>
           </w:p>
         </w:tc>
@@ -2472,7 +2481,7 @@
           <w:b w:val="0"/>
           <w:i w:val="0"/>
         </w:rPr>
-        <w:t>Les trois termes sont combinés de façon multiplicative. Si l'affinité est nulle, la formation ne correspond pas ; si l'accessibilité est nulle, elle est hors de portée ; si les débouchés sont nuls, elle ne mène nulle part. Dans les trois cas la recommandation doit disparaître, ce qu'une somme pondérée ne permettrait pas.</w:t>
+        <w:t>Les trois termes seront combinés de façon multiplicative — le module qui les assemble (`matching/`) reste à écrire (E28) ; seul le terme d'accessibilité, le modèle appris, est construit à ce jour. Si l'affinité est nulle, la formation ne correspondra pas ; si l'accessibilité est nulle, elle sera hors de portée ; si les débouchés sont nuls, elle ne mènera nulle part. Dans les trois cas la recommandation devra disparaître, ce qu'une somme pondérée ne permettrait pas.</w:t>
       </w:r>
     </w:p>
     <w:p>
@@ -2481,7 +2490,7 @@
           <w:b w:val="0"/>
           <w:i w:val="0"/>
         </w:rPr>
-        <w:t>Le terme de débouchés répond directement à la première cause identifiée en section 1.2, le manque d'information sur les débouchés, et il n'est donc pas une variable ajoutée mais une dimension constitutive de la décision. Les variables issues de Sirene alimentent en outre le modèle d'accessibilité, par un mécanisme explicite : la densité d'employeurs d'un secteur détermine la demande locale de formation, donc la tension entre vœux et capacité, donc la sélectivité. Cette hypothèse est testée, non postulée : voir l'étude d'ablation ci-dessous.</w:t>
+        <w:t>Le terme de débouchés répond directement à la première cause identifiée en section 1.2, le manque d'information sur les débouchés, et il n'est donc pas une variable ajoutée mais une dimension constitutive de la décision. Les variables issues de Sirene alimenteront en outre le modèle d'accessibilité, par un mécanisme explicite : la densité d'employeurs d'un secteur détermine la demande locale de formation, donc la tension entre vœux et capacité, donc la sélectivité. Cette hypothèse reste à tester, non postulée : voir l'étude d'ablation ci-dessous, non encore réalisée.</w:t>
       </w:r>
     </w:p>
     <w:tbl>
@@ -2537,7 +2546,7 @@
           <w:b w:val="0"/>
           <w:i w:val="0"/>
         </w:rPr>
-        <w:t>Algorithme. Le modèle d'accessibilité est entraîné par gradient boosting (LightGBM) sur les résultats d'admission publiés. Le gradient boosting est retenu plutôt qu'un réseau de neurones : les variables sont tabulaires, le coût d'inférence doit rester faible, et l'explicabilité par valeurs de Shapley y est exacte et directement applicable. Il est couplé à SHAP, qui fournit pour chaque recommandation les facteurs déterminants, exigence directe de l'AI Act et du droit à explication du RGPD.</w:t>
+        <w:t>Algorithme. Le modèle d'accessibilité est entraîné par gradient boosting (LightGBM) sur les résultats d'admission publiés, entraînement tracé dans MLflow (paramètres, métriques, artefact du modèle). Le gradient boosting est retenu plutôt qu'un réseau de neurones : les variables sont tabulaires, le coût d'inférence doit rester faible, et l'explicabilité par valeurs de Shapley y est exacte et directement applicable. Il sera couplé à SHAP, qui fournira pour chaque recommandation les facteurs déterminants, exigence directe de l'AI Act et du droit à explication du RGPD — le calcul est prévu à l'étape suivante, pas encore écrit.</w:t>
       </w:r>
     </w:p>
     <w:tbl>
@@ -2588,7 +2597,7 @@
           <w:b w:val="0"/>
           <w:i w:val="0"/>
         </w:rPr>
-        <w:t>Le chatbot RAG (embeddings CamemBERT, recherche vectorielle FAISS, orchestration LangChain et génération Mistral-small) est conservé comme brique secondaire. Son rôle est de restituer en langue naturelle, avec citation des sources officielles, les éléments qui fondent une recommandation. Il est intégré et supervisé, mais il n'est pas l'objet du dispositif de réentraînement et de détection de dérive. Mistral et CamemBERT, souverains et francophones, sont conservés plutôt que des modèles hors Union européenne, par conformité ; LangChain et FastAPI sont conservés parce qu'ils sont déjà éprouvés : savoir ne pas migrer une brique qui fonctionne est aussi un arbitrage d'architecte.</w:t>
+        <w:t>Le chatbot RAG est prévu comme brique secondaire, pas encore construite dans ce dépôt (le dossier `src/edumatch/rag/` est vide à ce jour) : il sera réécrit plutôt que repris tel quel du MVP décrit en section 2, dont l'ingestion et l'infrastructure ne répondent pas aux exigences de conformité et de montée en charge du présent projet. Son rôle prévu est de restituer en langue naturelle, avec citation des sources officielles, les éléments qui fondent une recommandation, sans faire l'objet du dispositif de réentraînement et de détection de dérive du modèle d'accessibilité. Les briques du MVP (embeddings CamemBERT, recherche vectorielle FAISS, orchestration LangChain, génération Mistral-small) sont d'ores et déjà pressenties pour la version réécrite, Mistral et CamemBERT étant souverains et francophones : c'est un point de départ à revalider, pas une décision arrêtée pour un composant qui reste à écrire.</w:t>
       </w:r>
     </w:p>
     <w:p>
@@ -2741,7 +2750,7 @@
           <w:p>
             <w:r/>
             <w:r>
-              <w:t>Strictement temporelle : entraînement 2018-2023, validation 2024, test 2025. Une séparation aléatoire placerait la même formation de part et d'autre et produirait une fuite d'information</w:t>
+              <w:t>Strictement temporelle : entraînement 2020-2023 (286 463 cellules), validation 2024 (76 408), test 2025 (77 159). Bornée aux six sessions où le label existe réellement (le numérateur ventilé par type de baccalauréat n'est pas publié en 2018-2019) : y inclure ces deux millésimes aurait placé une cible absente dans l'entraînement. Une séparation aléatoire, elle, placerait la même formation de part et d'autre et produirait une fuite d'information</w:t>
             </w:r>
           </w:p>
         </w:tc>
@@ -2777,7 +2786,7 @@
           <w:b w:val="0"/>
           <w:i w:val="0"/>
         </w:rPr>
-        <w:t>Métriques. La performance est mesurée par l'erreur absolue moyenne pondérée par l'effectif, et surtout par la qualité de calibration : puisque le système annonce une probabilité d'admission à un candidat, un score bien ordonné mais mal calibré serait nuisible. Une courbe d'apprentissage est produite en entraînant sur des fractions croissantes des observations, afin d'établir si le volume disponible est suffisant plutôt que de l'affirmer.</w:t>
+        <w:t>Métriques. La performance est déjà mesurée par l'erreur absolue moyenne pondérée par l'effectif (baseline et entraînement, tracées dans MLflow). Restent à construire la qualité de calibration — puisque le système annoncera une probabilité d'admission à un candidat, un score bien ordonné mais mal calibré serait nuisible — et la courbe d'apprentissage, obtenue en entraînant sur des fractions croissantes des observations pour établir si le volume disponible est suffisant plutôt que de l'affirmer.</w:t>
       </w:r>
     </w:p>
     <w:p>
@@ -2786,7 +2795,7 @@
           <w:b w:val="0"/>
           <w:i w:val="0"/>
         </w:rPr>
-        <w:t>Restitution. L'estimation est présentée comme une fréquence observée et non comme une prédiction individuelle : « sur cent candidats ayant vos caractéristiques scolaires et ayant demandé cette formation, tel nombre a reçu une proposition ». Le modèle ne connaît ni les notes exactes, ni les appréciations, ni la lettre de motivation, alors que la sélection s'appuie sur l'ensemble du dossier. Cette formulation est à la fois plus exacte et conforme à l'exigence de transparence sur la logique du traitement.</w:t>
+        <w:t>Restitution prévue. L'estimation sera présentée comme une fréquence observée et non comme une prédiction individuelle : « sur cent candidats ayant vos caractéristiques scolaires et ayant demandé cette formation, tel nombre a reçu une proposition ». Le modèle ne connaît ni les notes exactes, ni les appréciations, ni la lettre de motivation, alors que la sélection s'appuie sur l'ensemble du dossier. Cette formulation, à écrire dans l'écran de supervision et l'API (non construits à ce jour), est à la fois plus exacte et conforme à l'exigence de transparence sur la logique du traitement.</w:t>
       </w:r>
     </w:p>
     <w:tbl>
@@ -2842,7 +2851,7 @@
           <w:b w:val="0"/>
           <w:i w:val="0"/>
         </w:rPr>
-        <w:t>Audit d'équité. Les écarts de parité, l'égalité des chances et le ratio d'impact disparate sont évalués sur quatre dimensions : type de baccalauréat, statut de boursier, genre et territoire. La dimension territoriale n'est rendue mesurable que par la base Sirene, qui permet de vérifier qu'un candidat issu d'un bassin à faible densité d'employeurs n'est pas pénalisé. Elle répond à la deuxième cause structurelle identifiée en section 1.2, les déterminismes sociaux et territoriaux, qui restait sans dispositif de mesure.</w:t>
+        <w:t>Audit d'équité, à construire sur le modèle entraîné. Les écarts de parité, l'égalité des chances et le ratio d'impact disparate seront évalués sur quatre dimensions : type de baccalauréat, statut de boursier, genre et territoire. Le travail préalable est déjà fait : l'analyse exploratoire mesure d'ores et déjà l'écart d'admission à formation égale et les substituts possibles du genre parmi les variables candidates (section 1.1). La dimension territoriale ne sera rendue mesurable que par la base Sirene, qui permettra de vérifier qu'un candidat issu d'un bassin à faible densité d'employeurs n'est pas pénalisé. Elle répond à la deuxième cause structurelle identifiée en section 1.2, les déterminismes sociaux et territoriaux, qui reste sans dispositif de mesure à ce jour.</w:t>
       </w:r>
     </w:p>
     <w:tbl>
@@ -2865,22 +2874,22 @@
               <w:rPr>
                 <w:b/>
               </w:rPr>
-              <w:t>Justification du choix : l'apport de chaque source est mesuré, non postulé</w:t>
+              <w:t>Justification du choix : l'apport de chaque source sera mesuré, non postulé</w:t>
             </w:r>
           </w:p>
           <w:p>
             <w:r>
-              <w:t>Une source de données qui n'est pas réellement utilisée par le modèle finit par paraître ajoutée artificiellement. Pour l'éviter, l'apport des variables issues de Sirene est établi par une étude d'ablation.</w:t>
+              <w:t>Une source de données qui n'est pas réellement utilisée par le modèle finit par paraître ajoutée artificiellement. Pour l'éviter, l'apport des variables issues de Sirene sera établi par une étude d'ablation — non encore réalisée à ce jour.</w:t>
             </w:r>
           </w:p>
           <w:p>
             <w:r>
-              <w:t>Deux modèles sont entraînés dans les mêmes conditions : le premier sur les seules variables issues des données d'admission, le second en y ajoutant les variables de tissu économique. L'écart de performance est mesuré sur le jeu de test temporel, et l'analyse SHAP indique si ces variables figurent effectivement parmi les contributeurs principaux.</w:t>
+              <w:t>Deux modèles seront entraînés dans les mêmes conditions : le premier sur les seules variables issues des données d'admission, le second en y ajoutant les variables de tissu économique. L'écart de performance sera mesuré sur le jeu de test temporel, et l'analyse SHAP indiquera si ces variables figurent effectivement parmi les contributeurs principaux.</w:t>
             </w:r>
           </w:p>
           <w:p>
             <w:r>
-              <w:t>Si l'apport prédictif s'avère nul, il est rapporté comme tel : les variables sont retirées du modèle d'accessibilité, et Sirene ne subsiste que dans le terme de débouchés, qui repose sur des agrégats et non sur de l'apprentissage. Dans les deux cas la source reste justifiée, mais la justification est celle que la mesure établit.</w:t>
+              <w:t>Si l'apport prédictif s'avère nul, il sera rapporté comme tel : les variables seraient alors retirées du modèle d'accessibilité, et Sirene ne subsisterait que dans le terme de débouchés, qui repose sur des agrégats et non sur de l'apprentissage. Dans les deux cas la source reste justifiée, mais la justification sera celle que la mesure établira.</w:t>
             </w:r>
           </w:p>
         </w:tc>
@@ -2893,7 +2902,7 @@
           <w:b w:val="0"/>
           <w:i w:val="0"/>
         </w:rPr>
-        <w:t>Intégration : le modèle est exposé par une API FastAPI conteneurisée, avec gestion des erreurs et sécurisation. Les recommandations alimentent l'écran de supervision consulté par les conseillers d'orientation, qui matérialise l'exigence de contrôle humain posée par l'article 14 du règlement sur l'IA : le conseiller y revoit chaque recommandation, la contextualise à partir du dossier réel de l'élève, que le modèle ne connaît pas, et peut l'écarter en motivant sa décision.</w:t>
+        <w:t>Intégration, à construire : le modèle sera exposé par une API FastAPI conteneurisée, avec gestion des erreurs et sécurisation — le dossier `src/edumatch/api/` est vide à ce jour. Les recommandations alimenteront l'écran de supervision consulté par les conseillers d'orientation, qui matérialisera l'exigence de contrôle humain posée par l'article 14 du règlement sur l'IA : le conseiller y reverra chaque recommandation, la contextualisera à partir du dossier réel de l'élève, que le modèle ne connaît pas, et pourra l'écarter en motivant sa décision.</w:t>
       </w:r>
     </w:p>
     <w:p>
@@ -2902,7 +2911,7 @@
           <w:b w:val="0"/>
           <w:i w:val="0"/>
         </w:rPr>
-        <w:t>CI/CD : un pipeline GitHub Actions automatise les tests, la construction d'images, le suivi des expériences avec MLflow et le déploiement versionné. Deux dépôts distincts sont prévus, l'un pour la solution IA, l'autre pour la chaîne d'intégration et de déploiement.</w:t>
+        <w:t>CI/CD, à construire : un pipeline GitHub Actions automatisera les tests, la construction d'images, le suivi des expériences avec MLflow et le déploiement versionné — aucun workflow n'est écrit à ce jour. Deux dépôts distincts sont prévus, l'un pour la solution IA, l'autre pour la chaîne d'intégration et de déploiement ; seul le premier existe aujourd'hui.</w:t>
       </w:r>
     </w:p>
     <w:p>
@@ -2911,7 +2920,7 @@
           <w:b w:val="0"/>
           <w:i w:val="0"/>
         </w:rPr>
-        <w:t>Réentraînement et dérive : la dérive est ici mesurable sur des données réelles, les huit millésimes publiés portant des évolutions authentiques : réforme du baccalauréat, variation des capacités d'accueil, effet de la campagne 2020. Evidently compare la distribution courante à la référence d'entraînement et déclenche, au-delà d'un seuil documenté, un réentraînement reproductible. Le monitoring en production couvre la performance du modèle, la latence de l'API et la disponibilité, avec alertes sur seuils.</w:t>
+        <w:t>Réentraînement et dérive, à construire : la dérive sera mesurable sur des données réelles, les huit millésimes publiés portant des évolutions authentiques (réforme du baccalauréat, variation des capacités d'accueil, effet de la campagne 2020). Evidently comparera la distribution courante à la référence d'entraînement et déclenchera, au-delà d'un seuil à documenter, un réentraînement reproductible. Le monitoring en production couvrira la performance du modèle, la latence de l'API et la disponibilité, avec alertes sur seuils — rien de ce dispositif n'est en place aujourd'hui.</w:t>
       </w:r>
     </w:p>
     <w:p>
@@ -2920,7 +2929,7 @@
           <w:b w:val="0"/>
           <w:i w:val="0"/>
         </w:rPr>
-        <w:t>Conformité et accessibilité : explicabilité par SHAP, tests d'équité écartant les variables discriminantes, et conformité RGAA de l'écran de supervision pour les personnes en situation de handicap.</w:t>
+        <w:t>Conformité et accessibilité, à construire : explicabilité par SHAP, tests d'équité écartant les variables discriminantes, et conformité RGAA de l'écran de supervision pour les personnes en situation de handicap.</w:t>
       </w:r>
     </w:p>
     <w:p>

</xml_diff>

<commit_message>
docs: dossier de certification aligné sur le dépôt [B1][B2][B3][B4]
Seize affirmations remises au présent après vérification. Résultats
défavorables intégrés au corps : 0,0758 contre 0,0701, ratio 0,76,
couverture 1,4 %, avis scindé. Ce qui reste à faire est déclaré ;
journal d'avancement corrigé.
</commit_message>
<xml_diff>
--- a/docs/sous-docs-projets/dossier/Projet_Certification_KIONGHAT_Johann.docx
+++ b/docs/sous-docs-projets/dossier/Projet_Certification_KIONGHAT_Johann.docx
@@ -155,7 +155,7 @@
           <w:p>
             <w:r/>
             <w:r>
-              <w:t>Août 2026 (version 2)</w:t>
+              <w:t>Septembre 2026 (version 3, régénérée contre le dépôt le 2026-09-16)</w:t>
             </w:r>
           </w:p>
         </w:tc>
@@ -462,7 +462,7 @@
           <w:p>
             <w:r/>
             <w:r>
-              <w:t>MODÈLE APPRIS (LightGBM, entraîné et tracé dans MLflow), explicabilité SHAP à venir</w:t>
+              <w:t>MODÈLE APPRIS (LightGBM, entraîné et tracé dans MLflow), explicabilité SHAP produite (TreeSHAP, précalculée sur les 440 030 cellules) — résultat de performance défavorable en test, détaillé en section 7</w:t>
             </w:r>
           </w:p>
         </w:tc>
@@ -1280,7 +1280,7 @@
           <w:b w:val="0"/>
           <w:i w:val="0"/>
         </w:rPr>
-        <w:t>Le projet établira un plan de gouvernance complet : une politique de classification des données (publiques, internes, personnelles, sensibles) et des règles d'usage associées ; une répartition des rôles entre un Data Owner côté direction, des Data Stewards côté équipe data et un DPO garant de la conformité ; un registre des traitements précisant finalité, base légale, durée et destinataires. La documentation des origines, schémas, fraîcheurs et lignages est produite par l'outillage du pipeline lui-même (tests de qualité et graphe de lignage généré par dbt), sans introduire de catalogue supplémentaire à exploiter.</w:t>
+        <w:t>Le plan de gouvernance est écrit et versionné : une politique de classification des données (publiques, internes, personnelles, sensibles) et des règles d'usage associées, dont six sur sept sont aujourd'hui contrôlées automatiquement plutôt que déclarées sur le papier ; une répartition des rôles entre un Data Owner côté direction, des Data Stewards côté équipe data et un DPO garant de la conformité, chacun avec son périmètre de décision ; un registre des traitements couvrant huit traitements identifiés (T1 à T8), avec finalité, base légale, durée et destinataires, et l'état réel de chacun déclaré plutôt que supposé. La documentation des origines, schémas, fraîcheurs et lignages est produite par l'outillage du pipeline lui-même (tests de qualité et graphe de lignage généré par dbt), sans catalogue supplémentaire à exploiter.</w:t>
       </w:r>
     </w:p>
     <w:p>
@@ -1289,7 +1289,7 @@
           <w:b w:val="0"/>
           <w:i w:val="0"/>
         </w:rPr>
-        <w:t>La gestion des risques couvrira quatre familles : la violation de données de mineurs (chiffrement, minimisation, hébergement européen), la discrimination des recommandations (audit d'équité, indicateurs de parité, explicabilité), la non-conformité de réutilisation (registre des licences) et l'obsolescence des données (contrôles de fraîcheur bloquants dans le pipeline).</w:t>
+        <w:t>La gestion des risques couvre onze risques identifiés (R1 à R11), répartis sur quatre familles : la violation de données de mineurs (chiffrement, minimisation, hébergement européen), la discrimination des recommandations (audit d'équité, indicateurs de parité, explicabilité), la non-conformité de réutilisation (registre des licences) et l'obsolescence des données (contrôles de fraîcheur bloquants dans le pipeline).</w:t>
       </w:r>
     </w:p>
     <w:tbl>
@@ -1378,7 +1378,7 @@
           <w:p>
             <w:r/>
             <w:r>
-              <w:t>Registre des risques, révisé à chaque campagne d'orientation</w:t>
+              <w:t>Registre des onze risques, révisé à chaque campagne d'orientation</w:t>
             </w:r>
           </w:p>
         </w:tc>
@@ -1483,7 +1483,7 @@
           <w:p>
             <w:r/>
             <w:r>
-              <w:t>Traçabilité horodatée de chaque recommandation produite</w:t>
+              <w:t>Traçabilité horodatée de chaque recommandation produite, purge exécutable par paliers</w:t>
             </w:r>
           </w:p>
         </w:tc>
@@ -1518,7 +1518,7 @@
           <w:p>
             <w:r/>
             <w:r>
-              <w:t>Notice utilisateur et restitution des facteurs déterminants</w:t>
+              <w:t>Notice utilisateur — à écrire ; restitution des facteurs déterminants par SHAP, produite</w:t>
             </w:r>
           </w:p>
         </w:tc>
@@ -1553,7 +1553,7 @@
           <w:p>
             <w:r/>
             <w:r>
-              <w:t>Écran conseiller : revue, contextualisation, possibilité d'écarter</w:t>
+              <w:t>Écran conseiller : revue, contextualisation, possibilité d'écarter, motif obligatoire</w:t>
             </w:r>
           </w:p>
         </w:tc>
@@ -1588,7 +1588,7 @@
           <w:p>
             <w:r/>
             <w:r>
-              <w:t>Protocole d'évaluation temporel, seuils de performance, tests</w:t>
+              <w:t>Protocole d'évaluation temporel, seuils de performance, tests. Résultat mesuré défavorable au modèle appris en test (section 7) — reporté, non atténué</w:t>
             </w:r>
           </w:p>
         </w:tc>
@@ -1600,7 +1600,16 @@
           <w:b w:val="0"/>
           <w:i w:val="0"/>
         </w:rPr>
-        <w:t>La conformité sera maintenue par une procédure d'audit annuelle calée sur le calendrier Parcoursup, et par une procédure de mise à jour déclenchée par les évolutions réglementaires.</w:t>
+        <w:t>L'analyse d'impact (AIPD), obligatoire du fait du profilage systématique de mineurs, refait le test de nécessité une fois les mesures disponibles, et non avant. Ce test échoue sur le terme appris : une règle de dénombrement déjà construite (le taux de la session précédente) fait mieux que le modèle en précision et en calibration sur la session de test la plus récente. L'avis qui en découle est scindé plutôt que global : défavorable à la restitution, à des candidats réels, de l'estimation produite par le modèle appris ; favorable, sous réserves, au reste du dispositif (affinité, débouchés, explications SHAP, écran de supervision, journalisation et purge) ; favorable, sans réserve de fond, à l'exploitation en environnement de démonstration. Le seuil qui lèverait le premier point est écrit avant toute nouvelle mesure : un modèle réentraîné descendant sous 0,0701 de MAE pondérée et 0,0322 d'ECE sur une session de test non consultée pendant le réglage.</w:t>
+      </w:r>
+    </w:p>
+    <w:p>
+      <w:r>
+        <w:rPr>
+          <w:b w:val="0"/>
+          <w:i w:val="0"/>
+        </w:rPr>
+        <w:t>La conformité est maintenue par une procédure d'audit écrite, calée sur le calendrier Parcoursup, avec douze points de contrôle et trois déclencheurs ; une procédure de mise à jour, déjà appliquée à trois reprises, complète le dispositif. Ce qui reste ouvert dans ce bloc n'est pas de la rédaction supplémentaire : une notice d'information lisible par un lecteur mineur, et un identifiant de corrélation pour rendre purgeable le journal de supervision, restent à écrire.</w:t>
       </w:r>
     </w:p>
     <w:p>
@@ -1609,7 +1618,7 @@
           <w:b w:val="0"/>
           <w:i/>
         </w:rPr>
-        <w:t>À livrer à terme : plan de gouvernance des données, analyse d'impact, Model Card, registre des sources, présentation synthétique. Évaluation : lecture jury environ 15 min, présentation 15 min, questions 15 min.</w:t>
+        <w:t>À livrer à terme : présentation synthétique devant le jury. Le reste des livrables du bloc existe : plan de gouvernance des données, analyse d'impact, Model Card, registre des sources. Évaluation : lecture jury environ 15 min, présentation 15 min, questions 15 min.</w:t>
       </w:r>
     </w:p>
     <w:p>
@@ -1658,7 +1667,7 @@
           <w:b w:val="0"/>
           <w:i w:val="0"/>
         </w:rPr>
-        <w:t>Modélisation : un modèle relationnel normalisé sous PostgreSQL portera le transactionnel (utilisateurs, établissements, historique des recommandations) — à construire, ce périmètre n'existe pas encore. Le modèle analytique en étoile qui structure les données d'orientation, lui, est déjà construit (E16) : la table de faits porte les cellules d'observation, avec pour dimensions la formation, le candidat, la session et le territoire. Le choix de PostgreSQL plutôt que de conserver Firestore est justifié par le besoin de cohérence relationnelle et de requêtes analytiques que le NoSQL documentaire sert mal ; le modèle en étoile est retenu pour la prédominance des lectures analytiques.</w:t>
+        <w:t>Modélisation : un modèle relationnel normalisé sous PostgreSQL portera le transactionnel (utilisateurs, établissements, historique des recommandations) — à construire, ce périmètre n'existe pas encore. Le modèle analytique en étoile qui structure les données d'orientation, lui, est construit (E16) : la table de faits porte les cellules d'observation, avec pour dimensions la formation, le candidat, la session et le territoire. Le choix de PostgreSQL plutôt que de conserver Firestore est justifié par le besoin de cohérence relationnelle et de requêtes analytiques que le NoSQL documentaire sert mal ; le modèle en étoile est retenu pour la prédominance des lectures analytiques.</w:t>
       </w:r>
     </w:p>
     <w:p>
@@ -1667,7 +1676,16 @@
           <w:b w:val="0"/>
           <w:i w:val="0"/>
         </w:rPr>
-        <w:t>Infrastructure : les services seront conteneurisés avec Docker et orchestrés sur Kubernetes managé. Les données brutes atterriront dans un lac de données sur stockage objet S3-compatible. L'hébergement cible est un cloud souverain européen (Scaleway plutôt qu'un hyperscaler hors Union européenne), arbitrage de gouvernance assumé au regard des données de mineurs. Sécurité et supervision prévues, non encore mises en œuvre : chiffrement, gestion des accès par rôles et cloisonnement réseau ; surveillance par Prometheus et Grafana avec alertes sur seuils.</w:t>
+        <w:t>Infrastructure. Le service et l'entraînement sont conteneurisés (Docker, construction en deux étapes, exécution non-root, sonde de santé, étiquette d'image portant l'empreinte du commit) et orchestrés localement (Airflow, quatre DAG). Le code d'infrastructure cible existe dans le second dépôt : Terraform pour un cloud souverain européen (Scaleway plutôt qu'un hyperscaler hors Union européenne, arbitrage assumé au regard des données de mineurs — réseau privé, cluster Kubernetes managé, registre d'images, stockage objet, instance Airflow), manifestes Kubernetes complets (déploiement, service, autoscaling horizontal, politique réseau, budget de disruption, compte de service). **Rien de tout cela n'est déployé à ce jour** : aucun compte fournisseur n'est ouvert, aucun `apply` n'a été exécuté, et `terraform validate` lui-même n'a pas pu être lancé faute de binaire installé sur le poste de développement. C'est le point le plus exposé du projet, je le déclare comme tel plutôt que de le présenter comme fait.</w:t>
+      </w:r>
+    </w:p>
+    <w:p>
+      <w:r>
+        <w:rPr>
+          <w:b w:val="0"/>
+          <w:i w:val="0"/>
+        </w:rPr>
+        <w:t>Sécurité, en l'état. Le cloisonnement réseau est réel : réseau privé Terraform, politique réseau Kubernetes à entrée et sortie restreintes, exécution non-root et système de fichiers en lecture seule côté conteneurs, gabarit de secret jamais commité. Le chiffrement, en revanche, n'est implémenté nulle part dans le code d'infrastructure actuel, ni au repos sur le stockage objet ni sur la base ; la gestion des accès par rôles se limite au compte de service de la supervision, sans rôle applicatif distinct — deux manques déclarés, à traiter avant tout déploiement réel. La supervision (Prometheus, Grafana, cinq alertes actionnables dont l'absence d'instrumentation elle-même) est écrite et versionnée dans le second dépôt, mais n'a jamais tourné : aucune capture, faute d'environnement où l'exécuter.</w:t>
       </w:r>
     </w:p>
     <w:tbl>
@@ -1723,7 +1741,7 @@
           <w:b w:val="0"/>
           <w:i/>
         </w:rPr>
-        <w:t>À livrer à terme : diagrammes d'architecture selon le modèle C4, code d'infrastructure as code, capture vidéo de l'infrastructure en production. Évaluation : lecture environ 20 min, présentation 5 min, questions 15 min.</w:t>
+        <w:t>À livrer à terme : infrastructure effectivement déployée sur un compte fournisseur, chiffrement et rôles applicatifs, capture de la supervision en fonctionnement, et la vidéo de l'infrastructure en production. Les diagrammes C4 (niveaux 1 et 2, Mermaid) et le code d'infrastructure as code existent d'ores et déjà. Évaluation : lecture environ 20 min, présentation 5 min, questions 15 min.</w:t>
       </w:r>
     </w:p>
     <w:p>
@@ -2186,7 +2204,7 @@
           <w:b w:val="0"/>
           <w:i w:val="0"/>
         </w:rPr>
-        <w:t>Cette table de correspondance conditionne la qualité du terme de débouchés : sans elle, l'existence d'employeurs du secteur correspondant à une formation ne peut être établie. Elle est construite, versionnée, testée et documentée comme un actif de données à part entière ; son taux de couverture est mesuré et déclaré, une couverture partielle étant acceptable dès lors qu'elle est quantifiée.</w:t>
+        <w:t>Cette table de correspondance conditionne la qualité du terme de débouchés : sans elle, l'existence d'employeurs du secteur correspondant à une formation ne peut être établie. Elle est construite, versionnée, testée et documentée comme un actif de données à part entière. Son taux de couverture, jusqu'à la NAF, est mesuré : 61,4 % des formations du référentiel ONISEP portant un code RNCP renseigné sont rattachées à une division NAF. **Mais aucun des huit millésimes Parcoursup ne porte de code RNCP, NSF ou ROME** : la chaîne relie le référentiel ONISEP à la NAF, pas les formations Parcoursup elles-mêmes. Le seul rapprochement mesuré entre les deux est un appariement textuel des libellés de formation, et il ne couvre que **7 libellés distincts sur 712, soit 6 017 lignes sur 440 030 (1,4 %)** — les sept correspondances ont été relues à la main, ce sont des diplômes d'État très normés dont l'intitulé varie peu d'une source à l'autre. Pour les 98,6 % de lignes restantes, le terme de débouchés du score de matching (section 7) est marqué explicitement indisponible, jamais mis à zéro en silence.</w:t>
       </w:r>
     </w:p>
     <w:p>
@@ -2204,7 +2222,7 @@
           <w:b w:val="0"/>
           <w:i w:val="0"/>
         </w:rPr>
-        <w:t>Les contrôles qualité, déjà construits et exécutés (E14), portent sur le schéma, la complétude et la cohérence, au moyen de contrôles versionnés (schémas Pandera pour Parcoursup, compteurs écrits à la main pour Sirene et les référentiels, retenus après mesure du coût de Great Expectations sur ce volume — inutile ici) : un taux hors de l'intervalle admissible, un effectif incohérent ou un millésime manquant bloquent la mise à jour, vérifié par une exécution réelle qui sort en échec sur les données du dépôt. Ce blocage n'est pas une précaution facultative : sans lui, une donnée corrompue se propage jusqu'au modèle sans que personne ne le constate. La conformité RGPD est assurée par la minimisation et la traçabilité, la couche de volume ne contenant par construction aucune donnée à caractère personnel.</w:t>
+        <w:t>Les contrôles qualité (E14) portent sur le schéma, la complétude et la cohérence, au moyen de contrôles versionnés (schémas Pandera pour Parcoursup, compteurs écrits à la main pour Sirene et les référentiels, retenus après mesure du coût de Great Expectations sur ce volume — inutile ici) : un taux hors de l'intervalle admissible, un effectif incohérent ou un millésime manquant bloquent la mise à jour, vérifié par une exécution réelle qui sort en échec sur les données du dépôt et par un scénario de panne rejouable par une commande. Ce blocage n'est pas une précaution facultative : sans lui, une donnée corrompue se propage jusqu'au modèle sans que personne ne le constate. La conformité RGPD est assurée par la minimisation et la traçabilité, la couche de volume ne contenant par construction aucune donnée à caractère personnel.</w:t>
       </w:r>
     </w:p>
     <w:p>
@@ -2213,7 +2231,7 @@
           <w:b w:val="0"/>
           <w:i w:val="0"/>
         </w:rPr>
-        <w:t>Ce qui reste à construire : l'enchaînement de ces contrôles avec les étapes en amont et en aval est aujourd'hui piloté manuellement (`Makefile`), pas encore par un orchestrateur. Apache Airflow assurera la planification, la reprise sur erreur avec temporisation croissante et le lignage, pour que la chaîne s'exécute sans intervention manuelle, de la collecte jusqu'à l'évaluation du modèle. La supervision suivra la volumétrie traitée, le taux d'échec et la durée d'exécution, avec alertes proactives. Ce choix est déjà arbitré (Airflow est exigé par le référentiel de certification et retenu depuis l'architecture de référence), et son exécution est la matière de l'étape suivante du pipeline, non encore commencée.</w:t>
+        <w:t>Apache Airflow orchestre la chaîne : quatre DAG, un par cadence réelle de source (annuelle pour Parcoursup, mensuelle pour Sirene, quotidienne pour les référentiels, et un DAG de purge), couvrant ingestion, qualité, silver, gold, variables, agrégats et réconciliation des nomenclatures. La reprise sur erreur est décidée en code, pas confiée au retry natif d'Airflow (désactivé) : un vocabulaire d'erreur transitoire contre définitive, une temporisation croissante, deux scénarios de panne rejouables. **Ce qui manque encore à la chaîne** : l'entraînement et l'évaluation du modèle n'y figurent pas — ils s'exécutent encore par des commandes lancées à la main, hors du graphe. La supervision (volumétrie traitée, taux d'échec, durée d'exécution) reste à ajouter au pipeline lui-même ; les alertes aujourd'hui écrites portent sur le service d'inférence, pas sur le pipeline.</w:t>
       </w:r>
     </w:p>
     <w:p>
@@ -2222,7 +2240,7 @@
           <w:b w:val="0"/>
           <w:i/>
         </w:rPr>
-        <w:t>À livrer à terme : diagramme du pipeline, code sur dépôt Git, capture vidéo du pipeline en production. Évaluation : lecture environ 20 min, présentation 5 min, questions 15 min.</w:t>
+        <w:t>À livrer à terme : capture vidéo du pipeline en production, avec panne et reprise. Le diagramme du pipeline et le code sont déjà sur le dépôt. Évaluation : lecture environ 20 min, présentation 5 min, questions 15 min.</w:t>
       </w:r>
     </w:p>
     <w:p>
@@ -2423,7 +2441,7 @@
           <w:p>
             <w:r/>
             <w:r>
-              <w:t>MODÈLE APPRIS (LightGBM, entraîné et tracé dans MLflow). C'est le composant d'intelligence artificielle du système ; l'explicabilité SHAP reste à construire.</w:t>
+              <w:t>MODÈLE APPRIS (LightGBM, entraîné et tracé dans MLflow). C'est le composant d'intelligence artificielle du système ; l'explicabilité SHAP est produite (TreeSHAP), mais le modèle ne bat pas son plancher en test (détail plus bas).</w:t>
             </w:r>
           </w:p>
         </w:tc>
@@ -2481,7 +2499,7 @@
           <w:b w:val="0"/>
           <w:i w:val="0"/>
         </w:rPr>
-        <w:t>Les trois termes seront combinés de façon multiplicative — le module qui les assemble (`matching/`) reste à écrire (E28) ; seul le terme d'accessibilité, le modèle appris, est construit à ce jour. Si l'affinité est nulle, la formation ne correspondra pas ; si l'accessibilité est nulle, elle sera hors de portée ; si les débouchés sont nuls, elle ne mènera nulle part. Dans les trois cas la recommandation devra disparaître, ce qu'une somme pondérée ne permettrait pas.</w:t>
+        <w:t>Les trois termes sont combinés de façon multiplicative, module écrit et testé (`matching/score.py`, `affinite.py`, `debouches.py`, E28) : un terme nul supprime la recommandation, propriété vérifiée séparément pour les trois termes. Si l'affinité est nulle, la formation ne correspond pas ; si l'accessibilité est nulle, elle est hors de portée ; si les débouchés sont nuls ou indisponibles, elle ne mène nulle part démontrable. Une somme pondérée ne le permettrait pas.</w:t>
       </w:r>
     </w:p>
     <w:p>
@@ -2490,7 +2508,7 @@
           <w:b w:val="0"/>
           <w:i w:val="0"/>
         </w:rPr>
-        <w:t>Le terme de débouchés répond directement à la première cause identifiée en section 1.2, le manque d'information sur les débouchés, et il n'est donc pas une variable ajoutée mais une dimension constitutive de la décision. Les variables issues de Sirene alimenteront en outre le modèle d'accessibilité, par un mécanisme explicite : la densité d'employeurs d'un secteur détermine la demande locale de formation, donc la tension entre vœux et capacité, donc la sélectivité. Cette hypothèse reste à tester, non postulée : voir l'étude d'ablation ci-dessous, non encore réalisée.</w:t>
+        <w:t>Le terme de débouchés répond directement à la première cause identifiée en section 1.2, le manque d'information sur les débouchés, et il n'est donc pas une variable ajoutée mais une dimension constitutive de la décision. **Sa couverture réelle est faible et mesurée** : seules 6 017 lignes sur 440 030 (1,4 %) disposent d'un appariement vérifié entre une formation Parcoursup et une activité économique, faute de code RNCP, NSF ou ROME porté par le fichier Parcoursup lui-même (détail en section 6). Pour les autres lignes, le terme est marqué explicitement indisponible plutôt que mis à zéro en silence. Les variables issues de Sirene n'ont, pour la même raison, jamais pu entrer dans la table de variables du modèle d'accessibilité : l'hypothèse d'un effet de la densité d'employeurs sur la sélectivité reste non testée, faute de rattachement, et non infirmée par une mesure. Voir l'étude d'ablation en fin de section.</w:t>
       </w:r>
     </w:p>
     <w:tbl>
@@ -2546,7 +2564,7 @@
           <w:b w:val="0"/>
           <w:i w:val="0"/>
         </w:rPr>
-        <w:t>Algorithme. Le modèle d'accessibilité est entraîné par gradient boosting (LightGBM) sur les résultats d'admission publiés, entraînement tracé dans MLflow (paramètres, métriques, artefact du modèle). Le gradient boosting est retenu plutôt qu'un réseau de neurones : les variables sont tabulaires, le coût d'inférence doit rester faible, et l'explicabilité par valeurs de Shapley y est exacte et directement applicable. Il sera couplé à SHAP, qui fournira pour chaque recommandation les facteurs déterminants, exigence directe de l'AI Act et du droit à explication du RGPD — le calcul est prévu à l'étape suivante, pas encore écrit.</w:t>
+        <w:t>Algorithme. Le modèle d'accessibilité est entraîné par gradient boosting (LightGBM) sur les résultats d'admission publiés, entraînement tracé dans MLflow (paramètres, métriques, artefact du modèle). Le gradient boosting est retenu plutôt qu'un réseau de neurones : les variables sont tabulaires, le coût d'inférence doit rester faible, et l'explicabilité par valeurs de Shapley y est exacte et directement applicable. Il est couplé à SHAP (`models/explain.py`), qui fournit pour chaque recommandation les facteurs déterminants, exigence directe de l'AI Act et du droit à explication du RGPD : l'axiome d'efficacité de SHAP est vérifié à 2,1 × 10⁻¹⁵ près sur le modèle réel et par un test indépendant sur un modèle jouet, le précalcul complet est mesuré (440 030 cellules, 8,3 minutes, 99,8 Mo), et la route `/explain` de l'API le sert.</w:t>
       </w:r>
     </w:p>
     <w:tbl>
@@ -2597,7 +2615,7 @@
           <w:b w:val="0"/>
           <w:i w:val="0"/>
         </w:rPr>
-        <w:t>Le chatbot RAG est prévu comme brique secondaire, pas encore construite dans ce dépôt (le dossier `src/edumatch/rag/` est vide à ce jour) : il sera réécrit plutôt que repris tel quel du MVP décrit en section 2, dont l'ingestion et l'infrastructure ne répondent pas aux exigences de conformité et de montée en charge du présent projet. Son rôle prévu est de restituer en langue naturelle, avec citation des sources officielles, les éléments qui fondent une recommandation, sans faire l'objet du dispositif de réentraînement et de détection de dérive du modèle d'accessibilité. Les briques du MVP (embeddings CamemBERT, recherche vectorielle FAISS, orchestration LangChain, génération Mistral-small) sont d'ores et déjà pressenties pour la version réécrite, Mistral et CamemBERT étant souverains et francophones : c'est un point de départ à revalider, pas une décision arrêtée pour un composant qui reste à écrire.</w:t>
+        <w:t>Le chatbot RAG, brique secondaire, est construit et réécrit pour ce projet plutôt que repris du MVP décrit en section 2 (`src/edumatch/rag/`) : il restitue en langue naturelle, avec citation des sources officielles, les éléments qui fondent une recommandation, sans faire l'objet du dispositif de réentraînement et de détection de dérive du modèle d'accessibilité. Le corpus (7 403 documents issus des référentiels ONISEP) est indexé par recherche lexicale (TF-IDF) plutôt que par embeddings et base vectorielle, écartés faute de volume qui en justifierait le coût ; la citation est garantie par construction, puisque la liste des sources est bâtie à partir des documents retrouvés avant l'appel au modèle de langage, jamais depuis ce que ce dernier prétend avoir consulté. Les briques du MVP (CamemBERT, FAISS, LangChain, Mistral-small) n'ont donc pas été reprises : la sobriété technique est ici la réponse d'architecte à un composant hors du périmètre certifiant principal.</w:t>
       </w:r>
     </w:p>
     <w:p>
@@ -2783,10 +2801,183 @@
     <w:p>
       <w:r>
         <w:rPr>
+          <w:b/>
+          <w:i w:val="0"/>
+        </w:rPr>
+        <w:t>Résultat, rapporté tel quel : le modèle appris ne bat pas son plancher en test.</w:t>
+      </w:r>
+    </w:p>
+    <w:tbl>
+      <w:tblPr>
+        <w:tblStyle w:val="TableGrid"/>
+        <w:tblW w:type="auto" w:w="0"/>
+        <w:jc w:val="center"/>
+        <w:tblLook w:firstColumn="1" w:firstRow="1" w:lastColumn="0" w:lastRow="0" w:noHBand="0" w:noVBand="1" w:val="04A0"/>
+      </w:tblPr>
+      <w:tblGrid>
+        <w:gridCol w:w="2160"/>
+        <w:gridCol w:w="2160"/>
+        <w:gridCol w:w="2160"/>
+        <w:gridCol w:w="2160"/>
+      </w:tblGrid>
+      <w:tr>
+        <w:tc>
+          <w:tcPr>
+            <w:tcW w:type="dxa" w:w="2160"/>
+          </w:tcPr>
+          <w:p>
+            <w:r/>
+            <w:r>
+              <w:rPr>
+                <w:b/>
+              </w:rPr>
+              <w:t>Métrique</w:t>
+            </w:r>
+          </w:p>
+        </w:tc>
+        <w:tc>
+          <w:tcPr>
+            <w:tcW w:type="dxa" w:w="2160"/>
+          </w:tcPr>
+          <w:p>
+            <w:r/>
+            <w:r>
+              <w:rPr>
+                <w:b/>
+              </w:rPr>
+              <w:t>Modèle (test 2025)</w:t>
+            </w:r>
+          </w:p>
+        </w:tc>
+        <w:tc>
+          <w:tcPr>
+            <w:tcW w:type="dxa" w:w="2160"/>
+          </w:tcPr>
+          <w:p>
+            <w:r/>
+            <w:r>
+              <w:rPr>
+                <w:b/>
+              </w:rPr>
+              <w:t>Plancher — taux de la session précédente (test 2025)</w:t>
+            </w:r>
+          </w:p>
+        </w:tc>
+        <w:tc>
+          <w:tcPr>
+            <w:tcW w:type="dxa" w:w="2160"/>
+          </w:tcPr>
+          <w:p>
+            <w:r/>
+            <w:r>
+              <w:rPr>
+                <w:b/>
+              </w:rPr>
+              <w:t>Verdict</w:t>
+            </w:r>
+          </w:p>
+        </w:tc>
+      </w:tr>
+      <w:tr>
+        <w:tc>
+          <w:tcPr>
+            <w:tcW w:type="dxa" w:w="2160"/>
+          </w:tcPr>
+          <w:p>
+            <w:r/>
+            <w:r>
+              <w:t>MAE pondérée par l'effectif</w:t>
+            </w:r>
+          </w:p>
+        </w:tc>
+        <w:tc>
+          <w:tcPr>
+            <w:tcW w:type="dxa" w:w="2160"/>
+          </w:tcPr>
+          <w:p>
+            <w:r/>
+            <w:r>
+              <w:t>0,0758</w:t>
+            </w:r>
+          </w:p>
+        </w:tc>
+        <w:tc>
+          <w:tcPr>
+            <w:tcW w:type="dxa" w:w="2160"/>
+          </w:tcPr>
+          <w:p>
+            <w:r/>
+            <w:r>
+              <w:t>0,0701</w:t>
+            </w:r>
+          </w:p>
+        </w:tc>
+        <w:tc>
+          <w:tcPr>
+            <w:tcW w:type="dxa" w:w="2160"/>
+          </w:tcPr>
+          <w:p>
+            <w:r/>
+            <w:r>
+              <w:t>le modèle perd</w:t>
+            </w:r>
+          </w:p>
+        </w:tc>
+      </w:tr>
+      <w:tr>
+        <w:tc>
+          <w:tcPr>
+            <w:tcW w:type="dxa" w:w="2160"/>
+          </w:tcPr>
+          <w:p>
+            <w:r/>
+            <w:r>
+              <w:t>Erreur de calibration attendue (ECE, 10 tranches)</w:t>
+            </w:r>
+          </w:p>
+        </w:tc>
+        <w:tc>
+          <w:tcPr>
+            <w:tcW w:type="dxa" w:w="2160"/>
+          </w:tcPr>
+          <w:p>
+            <w:r/>
+            <w:r>
+              <w:t>0,0371</w:t>
+            </w:r>
+          </w:p>
+        </w:tc>
+        <w:tc>
+          <w:tcPr>
+            <w:tcW w:type="dxa" w:w="2160"/>
+          </w:tcPr>
+          <w:p>
+            <w:r/>
+            <w:r>
+              <w:t>0,0322</w:t>
+            </w:r>
+          </w:p>
+        </w:tc>
+        <w:tc>
+          <w:tcPr>
+            <w:tcW w:type="dxa" w:w="2160"/>
+          </w:tcPr>
+          <w:p>
+            <w:r/>
+            <w:r>
+              <w:t>le modèle perd</w:t>
+            </w:r>
+          </w:p>
+        </w:tc>
+      </w:tr>
+    </w:tbl>
+    <w:p>
+      <w:r>
+        <w:rPr>
           <w:b w:val="0"/>
           <w:i w:val="0"/>
         </w:rPr>
-        <w:t>Métriques. La performance est déjà mesurée par l'erreur absolue moyenne pondérée par l'effectif (baseline et entraînement, tracées dans MLflow). Restent à construire la qualité de calibration — puisque le système annoncera une probabilité d'admission à un candidat, un score bien ordonné mais mal calibré serait nuisible — et la courbe d'apprentissage, obtenue en entraînant sur des fractions croissantes des observations pour établir si le volume disponible est suffisant plutôt que de l'affirmer.</w:t>
+        <w:t>En validation 2024, le modèle passait devant (0,0690 contre 0,0727 de MAE pondérée, 0,0030 contre 0,0141 d'ECE) ; en test 2025 il repasse derrière sur les deux métriques à la fois. La courbe d'apprentissage (10, 25, 50 et 100 % du volume d'entraînement : 0,0758, 0,0723, 0,0705, 0,0698 de MAE pondérée en validation) établit que ce n'est pas un manque de données — le gain marginal se divise par deux à chaque doublement du volume — mais une dérive temporelle entre les sessions d'entraînement (2020-2023) et la session de test (2025). Le protocole d'évaluation n'a pas été retouché après ce résultat pour le faire passer : le seuil que le modèle devait battre (0,0701 de MAE pondérée, à couverture égale) a été écrit avant l'entraînement, dans le document d'évaluation, et le résultat est rapporté tel qu'il est sorti. C'est ce résultat qui fonde l'avis du délégué à la protection des données, défavorable à la restitution de cette estimation à des candidats réels tant qu'il n'est pas corrigé (section 4).</w:t>
       </w:r>
     </w:p>
     <w:p>
@@ -2795,7 +2986,7 @@
           <w:b w:val="0"/>
           <w:i w:val="0"/>
         </w:rPr>
-        <w:t>Restitution prévue. L'estimation sera présentée comme une fréquence observée et non comme une prédiction individuelle : « sur cent candidats ayant vos caractéristiques scolaires et ayant demandé cette formation, tel nombre a reçu une proposition ». Le modèle ne connaît ni les notes exactes, ni les appréciations, ni la lettre de motivation, alors que la sélection s'appuie sur l'ensemble du dossier. Cette formulation, à écrire dans l'écran de supervision et l'API (non construits à ce jour), est à la fois plus exacte et conforme à l'exigence de transparence sur la logique du traitement.</w:t>
+        <w:t>Restitution. L'estimation est présentée comme une fréquence observée et non comme une prédiction individuelle : « sur cent candidats ayant vos caractéristiques scolaires et ayant demandé cette formation, tel nombre a reçu une proposition ». Le modèle ne connaît ni les notes exactes, ni les appréciations, ni la lettre de motivation, alors que la sélection s'appuie sur l'ensemble du dossier. Cette formulation est écrite dans l'écran de supervision et servie par l'API (`src/edumatch/api/`, dix-neuf modules, huit fichiers de tests) ; elle porte en outre la mise en garde issue du résultat ci-dessus, attachée à chaque score produit plutôt que documentée à part.</w:t>
       </w:r>
     </w:p>
     <w:tbl>
@@ -2851,7 +3042,178 @@
           <w:b w:val="0"/>
           <w:i w:val="0"/>
         </w:rPr>
-        <w:t>Audit d'équité, à construire sur le modèle entraîné. Les écarts de parité, l'égalité des chances et le ratio d'impact disparate seront évalués sur quatre dimensions : type de baccalauréat, statut de boursier, genre et territoire. Le travail préalable est déjà fait : l'analyse exploratoire mesure d'ores et déjà l'écart d'admission à formation égale et les substituts possibles du genre parmi les variables candidates (section 1.1). La dimension territoriale ne sera rendue mesurable que par la base Sirene, qui permettra de vérifier qu'un candidat issu d'un bassin à faible densité d'employeurs n'est pas pénalisé. Elle répond à la deuxième cause structurelle identifiée en section 1.2, les déterminismes sociaux et territoriaux, qui reste sans dispositif de mesure à ce jour.</w:t>
+        <w:t>Audit d'équité, conduit sur les prédictions réelles du modèle entraîné (`models/fairness.py`, E26), sur quatre dimensions : type de baccalauréat, statut de boursier, genre et territoire. La définition d'équité privilégiée — la calibration par groupe, un taux prédit de 60 % doit correspondre à un taux observé de 60 % dans chaque groupe — est déclarée avant la mesure, parce qu'elle est incompatible avec la parité démographique et les cotes égalisées dès que les taux de base diffèrent entre groupes : c'est un théorème d'impossibilité, pas un arbitrage de goût.</w:t>
+      </w:r>
+    </w:p>
+    <w:tbl>
+      <w:tblPr>
+        <w:tblStyle w:val="TableGrid"/>
+        <w:tblW w:type="auto" w:w="0"/>
+        <w:jc w:val="center"/>
+        <w:tblLook w:firstColumn="1" w:firstRow="1" w:lastColumn="0" w:lastRow="0" w:noHBand="0" w:noVBand="1" w:val="04A0"/>
+      </w:tblPr>
+      <w:tblGrid>
+        <w:gridCol w:w="2880"/>
+        <w:gridCol w:w="2880"/>
+        <w:gridCol w:w="2880"/>
+      </w:tblGrid>
+      <w:tr>
+        <w:tc>
+          <w:tcPr>
+            <w:tcW w:type="dxa" w:w="2880"/>
+          </w:tcPr>
+          <w:p>
+            <w:r/>
+            <w:r>
+              <w:rPr>
+                <w:b/>
+              </w:rPr>
+              <w:t>Indicateur</w:t>
+            </w:r>
+          </w:p>
+        </w:tc>
+        <w:tc>
+          <w:tcPr>
+            <w:tcW w:type="dxa" w:w="2880"/>
+          </w:tcPr>
+          <w:p>
+            <w:r/>
+            <w:r>
+              <w:rPr>
+                <w:b/>
+              </w:rPr>
+              <w:t>Formations à plus de 80 % de candidates femmes</w:t>
+            </w:r>
+          </w:p>
+        </w:tc>
+        <w:tc>
+          <w:tcPr>
+            <w:tcW w:type="dxa" w:w="2880"/>
+          </w:tcPr>
+          <w:p>
+            <w:r/>
+            <w:r>
+              <w:rPr>
+                <w:b/>
+              </w:rPr>
+              <w:t>Autres formations</w:t>
+            </w:r>
+          </w:p>
+        </w:tc>
+      </w:tr>
+      <w:tr>
+        <w:tc>
+          <w:tcPr>
+            <w:tcW w:type="dxa" w:w="2880"/>
+          </w:tcPr>
+          <w:p>
+            <w:r/>
+            <w:r>
+              <w:t>Ratio d'impact disparate (modèle)</w:t>
+            </w:r>
+          </w:p>
+        </w:tc>
+        <w:tc>
+          <w:tcPr>
+            <w:tcW w:type="dxa" w:w="2880"/>
+          </w:tcPr>
+          <w:p>
+            <w:r/>
+            <w:r>
+              <w:t>0,76 — sous le seuil des quatre cinquièmes (0,80)</w:t>
+            </w:r>
+          </w:p>
+        </w:tc>
+        <w:tc>
+          <w:tcPr>
+            <w:tcW w:type="dxa" w:w="2880"/>
+          </w:tcPr>
+          <w:p>
+            <w:r/>
+            <w:r>
+              <w:t>—</w:t>
+            </w:r>
+          </w:p>
+        </w:tc>
+      </w:tr>
+      <w:tr>
+        <w:tc>
+          <w:tcPr>
+            <w:tcW w:type="dxa" w:w="2880"/>
+          </w:tcPr>
+          <w:p>
+            <w:r/>
+            <w:r>
+              <w:t>Ratio d'impact disparate (plancher)</w:t>
+            </w:r>
+          </w:p>
+        </w:tc>
+        <w:tc>
+          <w:tcPr>
+            <w:tcW w:type="dxa" w:w="2880"/>
+          </w:tcPr>
+          <w:p>
+            <w:r/>
+            <w:r>
+              <w:t>0,63</w:t>
+            </w:r>
+          </w:p>
+        </w:tc>
+        <w:tc>
+          <w:tcPr>
+            <w:tcW w:type="dxa" w:w="2880"/>
+          </w:tcPr>
+          <w:p>
+            <w:r/>
+            <w:r>
+              <w:t>—</w:t>
+            </w:r>
+          </w:p>
+        </w:tc>
+      </w:tr>
+      <w:tr>
+        <w:tc>
+          <w:tcPr>
+            <w:tcW w:type="dxa" w:w="2880"/>
+          </w:tcPr>
+          <w:p>
+            <w:r/>
+            <w:r>
+              <w:t>Erreur de calibration attendue (ECE)</w:t>
+            </w:r>
+          </w:p>
+        </w:tc>
+        <w:tc>
+          <w:tcPr>
+            <w:tcW w:type="dxa" w:w="2880"/>
+          </w:tcPr>
+          <w:p>
+            <w:r/>
+            <w:r>
+              <w:t>0,066</w:t>
+            </w:r>
+          </w:p>
+        </w:tc>
+        <w:tc>
+          <w:tcPr>
+            <w:tcW w:type="dxa" w:w="2880"/>
+          </w:tcPr>
+          <w:p>
+            <w:r/>
+            <w:r>
+              <w:t>0,032 à 0,034</w:t>
+            </w:r>
+          </w:p>
+        </w:tc>
+      </w:tr>
+    </w:tbl>
+    <w:p>
+      <w:r>
+        <w:rPr>
+          <w:b w:val="0"/>
+          <w:i w:val="0"/>
+        </w:rPr>
+        <w:t>**Le système n'est pas équitable sur cette dimension**, et ce résultat n'est pas atténué : il fait mieux que le plancher sur la sélection (0,76 contre 0,63) mais moins bien sur la calibration, où il sur-annonce les chances d'admission sur les formations très féminisées avec une erreur presque deux fois supérieure à celle mesurée ailleurs. Le travail exploratoire en amont (section 1.1) avait déjà mesuré que l'établissement d'origine (28,9 % net d'information mutuelle, corrigée de la cardinalité) et la filière (19,5 % net) sont les substituts du genre les plus puissants parmi les variables candidates : l'établissement est exclu du modèle pour cette raison et pour sa cardinalité, la filière est conservée car sa suppression détruirait la capacité du modèle à distinguer les formations entre elles. L'audit confirme que l'exclusion de variables à l'entrée ne suffit pas : le dispositif d'équité du projet repose sur trois niveaux — exclusion du genre à l'entrée, mesure des substituts, audit a posteriori sur les prédictions — et non sur le seul retrait de colonnes. La dimension territoriale reste, à ce stade, non pénalisante dans les mesures conduites ; elle répond à la deuxième cause structurelle identifiée en section 1.2.</w:t>
       </w:r>
     </w:p>
     <w:tbl>
@@ -2874,22 +3236,22 @@
               <w:rPr>
                 <w:b/>
               </w:rPr>
-              <w:t>Justification du choix : l'apport de chaque source sera mesuré, non postulé</w:t>
+              <w:t>Justification du choix : l'apport de chaque source est mesuré, non postulé</w:t>
             </w:r>
           </w:p>
           <w:p>
             <w:r>
-              <w:t>Une source de données qui n'est pas réellement utilisée par le modèle finit par paraître ajoutée artificiellement. Pour l'éviter, l'apport des variables issues de Sirene sera établi par une étude d'ablation — non encore réalisée à ce jour.</w:t>
+              <w:t>Une source de données qui n'est pas réellement utilisée par le modèle finit par paraître ajoutée artificiellement. Une étude d'ablation à sept variantes (`models/ablation.py`, E27) mesure ce que chaque bloc de variables apporte réellement, sur la validation 2024.</w:t>
             </w:r>
           </w:p>
           <w:p>
             <w:r>
-              <w:t>Deux modèles seront entraînés dans les mêmes conditions : le premier sur les seules variables issues des données d'admission, le second en y ajoutant les variables de tissu économique. L'écart de performance sera mesuré sur le jeu de test temporel, et l'analyse SHAP indiquera si ces variables figurent effectivement parmi les contributeurs principaux.</w:t>
+              <w:t>Le résultat dominant : retirer les 35 variables décalées (dont le taux de la session précédente) fait passer la MAE pondérée de validation de 0,0698 à 0,1120 (+0,0422) — l'essentiel de la performance du modèle vient de connaître ce taux, les 45 autres variables affinent la prédiction sans la porter. Retirer les quatre substituts du genre encore présents (filière, sélectivité, département, académie) ne coûte que +0,0006 et ne répare pas l'équité : le ratio d'impact disparate du groupe le plus féminisé se dégrade légèrement (0,66 à 0,62) plutôt que de s'améliorer, ce qui confirme que l'information reconstituant le genre est diffuse dans les variables décalées, pas concentrée dans ces quatre colonnes.</w:t>
             </w:r>
           </w:p>
           <w:p>
             <w:r>
-              <w:t>Si l'apport prédictif s'avère nul, il sera rapporté comme tel : les variables seraient alors retirées du modèle d'accessibilité, et Sirene ne subsisterait que dans le terme de débouchés, qui repose sur des agrégats et non sur de l'apprentissage. Dans les deux cas la source reste justifiée, mais la justification sera celle que la mesure établira.</w:t>
+              <w:t>**L'apport de Sirene, en revanche, n'a pas pu être mesuré.** La chaîne de nomenclatures (section 6) ne relie aucune formation Parcoursup à une activité NAF par une clé fiable : Sirene n'est donc jamais entré dans la table de variables du modèle d'accessibilité, et il n'existe rien à retirer d'un modèle où cette source n'est pas entrée. Ce n'est pas un résultat d'apport nul — celui-là a été mesuré, pour les mentions et pour l'établissement d'origine, et rapporté comme tel — c'est une limite du dispositif, déclarée plutôt que déguisée en mesure. Le critère d'apport mesuré est donc rempli pour toutes les sources sauf Sirene, conditionné au rattachement effectif de la chaîne de nomenclatures.</w:t>
             </w:r>
           </w:p>
         </w:tc>
@@ -2902,7 +3264,7 @@
           <w:b w:val="0"/>
           <w:i w:val="0"/>
         </w:rPr>
-        <w:t>Intégration, à construire : le modèle sera exposé par une API FastAPI conteneurisée, avec gestion des erreurs et sécurisation — le dossier `src/edumatch/api/` est vide à ce jour. Les recommandations alimenteront l'écran de supervision consulté par les conseillers d'orientation, qui matérialisera l'exigence de contrôle humain posée par l'article 14 du règlement sur l'IA : le conseiller y reverra chaque recommandation, la contextualisera à partir du dossier réel de l'élève, que le modèle ne connaît pas, et pourra l'écarter en motivant sa décision.</w:t>
+        <w:t>Intégration. Le modèle est exposé par une API FastAPI conteneurisée (`src/edumatch/api/`, dix-neuf modules, huit fichiers de tests dont un consacré à la sécurité) : gestion des erreurs dédiée, authentification, limitation de débit, en-têtes de sécurité. Les recommandations alimentent l'écran de supervision consulté par les conseillers d'orientation, qui matérialise l'exigence de contrôle humain posée par l'article 14 du règlement sur l'IA : le conseiller y revoit chaque recommandation, la contextualise à partir du dossier réel de l'élève que le modèle ne connaît pas, et peut l'écarter en motivant sa décision — écartement bloqué côté client et côté serveur, vérifié par test. L'accessibilité RGAA de cet écran est couverte par des tests unitaires (structure sémantique, contraste calculé par la formule WCAG, focus jamais supprimé) et par une procédure d'audit navigateur écrite ; **cette procédure n'a pas encore été déroulée**, aucun rapport d'audit n'existe à ce jour.</w:t>
       </w:r>
     </w:p>
     <w:p>
@@ -2911,7 +3273,7 @@
           <w:b w:val="0"/>
           <w:i w:val="0"/>
         </w:rPr>
-        <w:t>CI/CD, à construire : un pipeline GitHub Actions automatisera les tests, la construction d'images, le suivi des expériences avec MLflow et le déploiement versionné — aucun workflow n'est écrit à ce jour. Deux dépôts distincts sont prévus, l'un pour la solution IA, l'autre pour la chaîne d'intégration et de déploiement ; seul le premier existe aujourd'hui.</w:t>
+        <w:t>CI/CD. Trois workflows GitHub Actions sont écrits dans le second dépôt (`edumatch-cicd`) : intégration (lint et tests), construction et publication d'images étiquetées par l'empreinte du commit, déploiement délibéré et non automatique. **Aucun de ces workflows n'a encore été exécuté** : une première exécution reste à déclencher pour révéler ce qu'un YAML non testé cache toujours. Le suivi d'expériences avec MLflow est en service (cinq exécutions tracées, paramètres et métriques), mais le registre de modèles proprement dit est vide à ce jour — aucune version n'y est encore enregistrée. Deux dépôts de code distincts existent, sans recouvrement : la solution IA (ce dépôt) et l'intégration-déploiement (36 fichiers : workflows, Terraform, manifestes Kubernetes, monitoring).</w:t>
       </w:r>
     </w:p>
     <w:p>
@@ -2920,16 +3282,7 @@
           <w:b w:val="0"/>
           <w:i w:val="0"/>
         </w:rPr>
-        <w:t>Dérive, déjà mesurée sur des données réelles (E34) : l'indice de stabilité de population (PSI) et le test de Kolmogorov-Smirnov sont calculés directement sur les six sessions où le label existe (2020-2025), pour trois familles distinctes — variables, cible, prédictions du modèle. Evidently a été écarté : sa dernière version compatible avec le reste du projet entraîne un conflit de dépendance transitive avec le paquet dont FastAPI dépend déjà, reproduit et non contourné (ADR 0018). Le seuil de 0,20 s'applique à la médiane du PSI des variables plutôt qu'à leur maximum, pour ne pas déclencher en permanence sur deux colonnes de nomenclature instable sans rapport avec la performance du modèle. Ce que cette mesure ne permet pas de conclure est écrit dans la décision : la dégradation déjà observée entre validation et test reste sous ce seuil. Réentraînement, à construire : la détection journalise un avertissement mais ne déclenche encore rien ; l'automatisation reste à coupler à l'orchestrateur. Le monitoring en production couvrira la performance du modèle, la latence de l'API et la disponibilité, avec alertes sur seuils — rien de ce dernier dispositif n'est en place aujourd'hui.</w:t>
-      </w:r>
-    </w:p>
-    <w:p>
-      <w:r>
-        <w:rPr>
-          <w:b w:val="0"/>
-          <w:i w:val="0"/>
-        </w:rPr>
-        <w:t>Conformité et accessibilité, à construire : explicabilité par SHAP, tests d'équité écartant les variables discriminantes, et conformité RGAA de l'écran de supervision pour les personnes en situation de handicap.</w:t>
+        <w:t>Dérive, mesurée sur des données réelles (E34) : l'indice de stabilité de population (PSI) et le test de Kolmogorov-Smirnov sont calculés directement sur les six sessions où le label existe (2020-2025), pour trois familles distinctes — variables, cible, prédictions du modèle. Evidently a été écarté : sa dernière version compatible avec le reste du projet entraîne un conflit de dépendance transitive avec le paquet dont FastAPI dépend déjà, reproduit et non contourné (ADR 0018). Le seuil de 0,20 s'applique à la médiane du PSI des variables plutôt qu'à leur maximum, pour ne pas déclencher en permanence sur deux colonnes de nomenclature instable sans rapport avec la performance du modèle. Ce que cette mesure ne permet pas de conclure est écrit dans la décision, et c'est l'un des quatre résultats défavorables du projet à retenir : **le PSI à ce seuil n'aurait pas signalé la dégradation pourtant observée entre validation et test.** Il s'agit d'une dérive du concept — la relation entre les variables et la cible change alors que la distribution des entrées bouge à peine — à laquelle un indice de stabilité de population, qui ne compare que des distributions marginales, est aveugle par construction. Réentraînement, à construire : la détection journalise un avertissement mais ne déclenche encore rien, l'automatisation reste à coupler à l'orchestrateur. Le monitoring en production (Prometheus, Grafana, SLO déclaré sur la latence p95 et la disponibilité) est écrit et versionné dans le second dépôt, mais rien n'en a jamais tourné en production.</w:t>
       </w:r>
     </w:p>
     <w:p>
@@ -2938,7 +3291,7 @@
           <w:b w:val="0"/>
           <w:i/>
         </w:rPr>
-        <w:t>À livrer à terme : présentation de la solution, dépôt n°1 (développement de la solution IA), dépôt n°2 (intégration et déploiement continus), capture vidéo en production. Deux dépôts de code distincts sont attendus.</w:t>
+        <w:t>À livrer à terme : rapport d'audit RGAA exécuté, première exécution de la chaîne d'intégration capturée, entraînement ajouté au graphe d'orchestration, modèle enregistré au registre, et capture vidéo de la solution en production. Présentation de la solution, dépôt n°1 (développement de la solution IA) et dépôt n°2 (intégration et déploiement continus) existent déjà, avec du code réel et distinct.</w:t>
       </w:r>
     </w:p>
     <w:p>
@@ -3157,7 +3510,7 @@
           <w:b w:val="0"/>
           <w:i w:val="0"/>
         </w:rPr>
-        <w:t>Fil conducteur de la soutenance : partir des constats mesurés dans les données publiques. La ségrégation par le genre est massive alors même que les femmes sont majoritaires parmi les admis, et l'accès reste inégal selon le baccalauréat d'origine. Puis dérouler la chaîne complète, de la gouvernance à la solution déployée, en montrant que chaque source répond à une question précise et qu'un seul composant est appris. Chaque choix est défendu par « X plutôt que Y parce que… ».</w:t>
+        <w:t>Fil conducteur de la soutenance : partir des constats mesurés dans les données publiques. La ségrégation par le genre est massive alors même que les femmes sont majoritaires parmi les admis, et l'accès reste inégal selon le baccalauréat d'origine. Puis dérouler la chaîne complète, de la gouvernance à la solution, en montrant que chaque source répond à une question précise et qu'un seul composant est appris. Chaque choix est défendu par « X plutôt que Y parce que… ». Quatre résultats défavorables, mesurés et non atténués, structurent une part importante de cette défense : le modèle appris ne bat pas le taux de la session précédente en test (MAE pondérée 0,0758 contre 0,0701, ECE 0,0371 contre 0,0322), le ratio d'impact disparate sur les formations très féminisées est à 0,76, sous le seuil légal de 0,80, la couverture du terme de débouchés n'atteint que 1,4 % des lignes, et l'avis du délégué à la protection des données est scindé, défavorable à la restitution du terme appris à des candidats réels tant qu'il n'aura pas été corrigé. Chacun de ces résultats est mesuré, documenté et assumé plutôt que dissimulé, ce qui est présenté comme une garantie de rigueur plutôt que comme une faiblesse à minimiser.</w:t>
       </w:r>
     </w:p>
     <w:p>
@@ -3245,7 +3598,7 @@
         <w:pStyle w:val="ListBullet"/>
       </w:pPr>
       <w:r>
-        <w:t>Bloc 4 : un seul modèle industrialisé, rôle de chaque source explicité, cible et protocole définis, calibration, courbe d'apprentissage, ablation, équité sur quatre dimensions, CI/CD, dérive, deux dépôts.</w:t>
+        <w:t>Bloc 4 : un seul modèle industrialisé, rôle de chaque source explicité, cible et protocole définis, calibration, courbe d'apprentissage, ablation, équité sur quatre dimensions, CI/CD écrit, dérive mesurée, deux dépôts de code réel et distinct.</w:t>
       </w:r>
     </w:p>
     <w:p>
@@ -3262,6 +3615,22 @@
       </w:pPr>
       <w:r>
         <w:t>Aucune donnée n'est simulée : toutes les sources sont publiques, réelles et sous licence vérifiée.</w:t>
+      </w:r>
+    </w:p>
+    <w:p>
+      <w:pPr>
+        <w:pStyle w:val="ListBullet"/>
+      </w:pPr>
+      <w:r>
+        <w:t>Les quatre résultats défavorables du projet sont présents dans le corps du dossier, avec leurs chiffres et leur diagnostic, et non tus ou relégués en annexe : performance du modèle sous son plancher en test, ratio d'impact disparate sous le seuil légal, couverture du terme de débouchés à 1,4 %, avis scindé et défavorable du délégué à la protection des données sur le terme appris.</w:t>
+      </w:r>
+    </w:p>
+    <w:p>
+      <w:pPr>
+        <w:pStyle w:val="ListBullet"/>
+      </w:pPr>
+      <w:r>
+        <w:t>Ce qui n'existe pas encore est écrit au futur, sans ambiguïté : déploiement cloud réel, exécution de la chaîne d'intégration, panne filmée, trois vidéos de production.</w:t>
       </w:r>
     </w:p>
     <w:p>

</xml_diff>

<commit_message>
docs: registre et réentraînement propagés au dossier [B3][B4]
Dossier régénéré et vérifié par extraction du texte. Diagramme du
pipeline : treize tâches au lieu de onze.
</commit_message>
<xml_diff>
--- a/docs/sous-docs-projets/dossier/Projet_Certification_KIONGHAT_Johann.docx
+++ b/docs/sous-docs-projets/dossier/Projet_Certification_KIONGHAT_Johann.docx
@@ -2231,7 +2231,7 @@
           <w:b w:val="0"/>
           <w:i w:val="0"/>
         </w:rPr>
-        <w:t>Apache Airflow orchestre la chaîne : quatre DAG, un par cadence réelle de source (annuelle pour Parcoursup, mensuelle pour Sirene, quotidienne pour les référentiels, et un DAG de purge), couvrant ingestion, qualité, silver, gold, variables, agrégats et réconciliation des nomenclatures. La reprise sur erreur est décidée en code, pas confiée au retry natif d'Airflow (désactivé) : un vocabulaire d'erreur transitoire contre définitive, une temporisation croissante, deux scénarios de panne rejouables. **Ce qui manque encore à la chaîne** : l'entraînement et l'évaluation du modèle n'y figurent pas — ils s'exécutent encore par des commandes lancées à la main, hors du graphe. La supervision (volumétrie traitée, taux d'échec, durée d'exécution) reste à ajouter au pipeline lui-même ; les alertes aujourd'hui écrites portent sur le service d'inférence, pas sur le pipeline.</w:t>
+        <w:t>Apache Airflow orchestre la chaîne : quatre DAG, un par cadence réelle de source (annuelle pour Parcoursup, mensuelle pour Sirene, quotidienne pour les référentiels, et un DAG de purge), couvrant ingestion, qualité, silver, gold, variables, agrégats et réconciliation des nomenclatures, treize tâches distinctes au total (`src/edumatch/orchestration/taches.py`). La reprise sur erreur est décidée en code, pas confiée au retry natif d'Airflow (désactivé) : un vocabulaire d'erreur transitoire contre définitive, une temporisation croissante, deux scénarios de panne rejouables. **Le réentraînement et l'évaluation du modèle sont désormais dans le graphe** : le DAG annuel `edumatch_parcoursup` compte huit tâches et se termine par `reentrainer_modele` puis `evaluer_modele`, déclenchées après la détection de dérive et derrière le même contrôle qualité bloquant que le reste de la chaîne. Une porte de promotion (`src/edumatch/orchestration/promotion.py`) refuse de publier un modèle réentraîné qui ne bat pas strictement le plancher E21 en test : à ce jour, elle refuse, pour la même raison que la section suivante détaille. La supervision (volumétrie traitée, taux d'échec, durée d'exécution) reste à ajouter au pipeline lui-même ; les alertes aujourd'hui écrites portent sur le service d'inférence, pas sur le pipeline.</w:t>
       </w:r>
     </w:p>
     <w:p>
@@ -3273,7 +3273,7 @@
           <w:b w:val="0"/>
           <w:i w:val="0"/>
         </w:rPr>
-        <w:t>CI/CD. Trois workflows GitHub Actions sont écrits dans le second dépôt (`edumatch-cicd`) : intégration (lint et tests), construction et publication d'images étiquetées par l'empreinte du commit, déploiement délibéré et non automatique. **Aucun de ces workflows n'a encore été exécuté** : une première exécution reste à déclencher pour révéler ce qu'un YAML non testé cache toujours. Le suivi d'expériences avec MLflow est en service (cinq exécutions tracées, paramètres et métriques), mais le registre de modèles proprement dit est vide à ce jour — aucune version n'y est encore enregistrée. Deux dépôts de code distincts existent, sans recouvrement : la solution IA (ce dépôt) et l'intégration-déploiement (36 fichiers : workflows, Terraform, manifestes Kubernetes, monitoring).</w:t>
+        <w:t>CI/CD. Trois workflows GitHub Actions sont écrits dans le second dépôt (`edumatch-cicd`) : intégration (lint et tests), construction et publication d'images étiquetées par l'empreinte du commit, déploiement délibéré et non automatique. **Aucun de ces workflows n'a encore été exécuté** : une première exécution reste à déclencher pour révéler ce qu'un YAML non testé cache toujours. Le suivi d'expériences avec MLflow est en service (cinq exécutions tracées, paramètres et métriques), et le registre de modèles porte désormais une version : `edumatch-accessibilite` v1, enregistrée par `src/edumatch/models/registre.py` (`make register-model`) depuis l'exécution `678b04627c4945a69c4856c325d7493b` (commit `5162c9e`). **Cette version ne porte aucun stade ni alias** : l'étiquette `statut_evaluation` posée sur la version déclare en clair qu'elle ne bat pas le plancher en test, conformément aux mêmes chiffres que la section précédente. Deux dépôts de code distincts existent, sans recouvrement : la solution IA (ce dépôt) et l'intégration-déploiement (36 fichiers : workflows, Terraform, manifestes Kubernetes, monitoring).</w:t>
       </w:r>
     </w:p>
     <w:p>
@@ -3291,7 +3291,7 @@
           <w:b w:val="0"/>
           <w:i/>
         </w:rPr>
-        <w:t>À livrer à terme : rapport d'audit RGAA exécuté, première exécution de la chaîne d'intégration capturée, entraînement ajouté au graphe d'orchestration, modèle enregistré au registre, et capture vidéo de la solution en production. Présentation de la solution, dépôt n°1 (développement de la solution IA) et dépôt n°2 (intégration et déploiement continus) existent déjà, avec du code réel et distinct.</w:t>
+        <w:t>À livrer à terme : rapport d'audit RGAA exécuté, première exécution de la chaîne d'intégration capturée, un réentraînement qui bat effectivement le plancher pour que la porte de promotion publie une version, et capture vidéo de la solution en production. Présentation de la solution, dépôt n°1 (développement de la solution IA) et dépôt n°2 (intégration et déploiement continus) existent déjà, avec du code réel et distinct.</w:t>
       </w:r>
     </w:p>
     <w:p>

</xml_diff>

<commit_message>
docs: documentation réécrite et raccourcie
Phrases raccourcies ; avancement réduit à un tableau.
Chiffre Sirene du README corrigé (43 896 818 établissements).
</commit_message>
<xml_diff>
--- a/docs/sous-docs-projets/dossier/Projet_Certification_KIONGHAT_Johann.docx
+++ b/docs/sous-docs-projets/dossier/Projet_Certification_KIONGHAT_Johann.docx
@@ -107,7 +107,7 @@
           <w:p>
             <w:r/>
             <w:r>
-              <w:t>EduMatch : moteur de matching explicable entre candidats et formations, estimant les chances d'admission et les débouchés territoriaux, au service de l'orientation scolaire et professionnelle</w:t>
+              <w:t>EduMatch : moteur de matching explicable entre candidats et formations, estimant les chances d'admission et les débouchés territoriaux</w:t>
             </w:r>
           </w:p>
         </w:tc>
@@ -155,7 +155,7 @@
           <w:p>
             <w:r/>
             <w:r>
-              <w:t>Septembre 2026 (version 3, régénérée contre le dépôt le 2026-09-16)</w:t>
+              <w:t>Septembre 2026</w:t>
             </w:r>
           </w:p>
         </w:tc>
@@ -168,7 +168,7 @@
           <w:b w:val="0"/>
           <w:i/>
         </w:rPr>
-        <w:t>Ce document présente le projet et justifie ses choix structurants selon la forme « X plutôt que Y parce que… ». Les volumétries et les taux qui y figurent ont été vérifiés par téléchargement et recalculés à partir des fichiers sources ; ils sont reproductibles à partir des références citées.</w:t>
+        <w:t>Ce dossier explique le projet et justifie les choix faits, sous la forme « X plutôt que Y, parce que... ». Les chiffres cités viennent des fichiers sources et se recalculent avec les commandes indiquées.</w:t>
       </w:r>
     </w:p>
     <w:p>
@@ -198,7 +198,7 @@
           <w:b w:val="0"/>
           <w:i w:val="0"/>
         </w:rPr>
-        <w:t>EduMatch est une jeune entreprise EdTech française basée en Île-de-France, en phase d'amorçage (levée de type seed de 350 000 euros). Elle édite une plateforme SaaS d'orientation scolaire et professionnelle, sur un modèle B2B2C : ses clients sont des établissements (lycées, collèges, CFA, organismes de formation) et ses utilisateurs finaux des élèves, étudiants et personnes en reconversion.</w:t>
+        <w:t>EduMatch est une jeune entreprise EdTech basée en Île-de-France, en phase d'amorçage (levée seed de 350 000 euros). Elle édite une plateforme d'orientation scolaire en B2B2C : les clients sont des établissements (lycées, collèges, CFA, organismes de formation), les utilisateurs finaux des élèves et des personnes en reconversion.</w:t>
       </w:r>
     </w:p>
     <w:p>
@@ -207,7 +207,7 @@
           <w:b w:val="0"/>
           <w:i w:val="0"/>
         </w:rPr>
-        <w:t>Le secteur de l'orientation est doublement structurant. Il repose sur l'agrégation de données publiques de référence : les résultats d'admission Parcoursup publiés par le ministère, la base Sirene de l'INSEE qui décrit le tissu économique et donc les débouchés, les référentiels de formations et de métiers, et il est sensible et réglementé : le public combine des mineurs et des adultes, et un système qui influence l'accès à l'éducation relève des usages à haut risque au sens du règlement européen sur l'intelligence artificielle (annexe III, point 3). Ce double caractère rend les quatre blocs naturellement nécessaires.</w:t>
+        <w:t>Le secteur combine deux contraintes fortes : il s'appuie sur des données publiques (Parcoursup, Sirene, référentiels de formations et de métiers), et il est sensible, car le public compte des mineurs et un système qui influence l'accès à une formation est classé à haut risque par le règlement européen sur l'IA (annexe III, point 3). C'est ce qui rend les quatre blocs de compétences nécessaires.</w:t>
       </w:r>
     </w:p>
     <w:p>
@@ -216,7 +216,7 @@
           <w:b w:val="0"/>
           <w:i w:val="0"/>
         </w:rPr>
-        <w:t>La ségrégation par le genre est le trait le plus frappant de ces données. Sur la session Parcoursup 2025, qui couvre 14 252 formations, 2 775 d'entre elles, soit 19,7 pour cent sur dénominateur non nul (les formations n'admettant aucun candidat sont exclues du calcul, sans quoi un taux nul mécanique se lirait à tort comme une extrême faible féminisation), comptent moins de 20 pour cent de femmes parmi leurs admis, et 17,9 pour cent en comptent plus de 80 pour cent ; seules 21,5 pour cent se situent dans une zone équilibrée, entre 40 et 60 pour cent. L'écart est structurel : la médiane du taux de féminisation atteint 18 pour cent en école d'ingénieur, contre 86 pour cent en institut de formation en soins infirmiers et 90 pour cent dans les formations du travail social.</w:t>
+        <w:t>Le trait le plus marquant de ces données est la ségrégation par le genre. Sur la session Parcoursup 2025 (14 252 formations), 2 775 d'entre elles, soit 19,7 pour cent (hors formations sans aucun admis, sinon leur taux nul fausserait la lecture), comptent moins de 20 pour cent de femmes parmi leurs admis, et 17,9 pour cent en comptent plus de 80 pour cent. Seules 21,5 pour cent se situent entre 40 et 60 pour cent. L'écart est net entre filières : médiane de féminisation à 18 pour cent en école d'ingénieur, contre 86 pour cent en institut de soins infirmiers et 90 pour cent dans le travail social.</w:t>
       </w:r>
     </w:p>
     <w:p>
@@ -225,7 +225,7 @@
           <w:b w:val="0"/>
           <w:i w:val="0"/>
         </w:rPr>
-        <w:t>Il ne s'agit pas d'une sous-représentation globale : les femmes constituent 56,3 pour cent des admis, toutes formations confondues. Elles sont donc majoritaires, mais très inégalement réparties. Ce n'est pas l'accès à l'enseignement supérieur qui est en cause, c'est l'orientation qui y conduit, précisément l'objet de ce projet.</w:t>
+        <w:t>Ce n'est pas un problème d'accès global : les femmes sont 56,3 pour cent des admis, toutes formations confondues, donc majoritaires. Le problème est la répartition, pas l'accès. C'est l'orientation qui est en cause, exactement ce que ce projet outille.</w:t>
       </w:r>
     </w:p>
     <w:p>
@@ -234,7 +234,7 @@
           <w:b w:val="0"/>
           <w:i w:val="0"/>
         </w:rPr>
-        <w:t>À cette ségrégation s'ajoute une inégalité d'accès selon le baccalauréat d'origine. Sur la même session, 36,7 pour cent des vœux formulés par des bacheliers généraux ont donné lieu à une proposition d'admission, contre 29,5 pour cent pour les bacheliers technologiques et 26,9 pour cent pour les bacheliers professionnels : à vœu comparable, les chances d'un bachelier professionnel sont réduites de plus d'un quart.</w:t>
+        <w:t>À cela s'ajoute une inégalité selon le baccalauréat d'origine : 36,7 pour cent des vœux de bacheliers généraux ont reçu une proposition en 2025, contre 29,5 pour cent pour les technologiques et 26,9 pour cent pour les professionnels — à vœu comparable, un bachelier professionnel a un quart de chances en moins.</w:t>
       </w:r>
     </w:p>
     <w:p>
@@ -243,7 +243,7 @@
           <w:b w:val="0"/>
           <w:i/>
         </w:rPr>
-        <w:t>Précision de lecture : ces taux sont calculés par vœu et non par candidat : un lycéen formulant une dizaine de vœux conserve une probabilité élevée d'obtenir au moins une proposition, c'est l'accès à chaque formation prise isolément qui est inégal. Il s'agit en outre du taux agrégé sur l'ensemble des vœux, et non de la moyenne des taux formation par formation, qui accorderait le même poids à une formation recevant trente vœux et à une formation en recevant trente mille.</w:t>
+        <w:t>Précision : ces taux sont par vœu, pas par candidat (un lycéen formulant dix vœux garde de bonnes chances d'obtenir au moins une proposition, c'est l'accès à chaque formation prise isolément qui est inégal), et ils sont agrégés sur l'ensemble des vœux, pas moyennés formation par formation.</w:t>
       </w:r>
     </w:p>
     <w:p>
@@ -252,7 +252,7 @@
           <w:b w:val="0"/>
           <w:i w:val="0"/>
         </w:rPr>
-        <w:t>Ces deux phénomènes n'appellent pas la même réponse du système, et la distinction est structurante. L'inégalité d'accès selon le baccalauréat est ce que le moteur doit estimer et restituer honnêtement au candidat : c'est la réalité de la sélection, et la lui cacher serait lui nuire. La ségrégation par le genre est au contraire ce que le système ne doit en aucun cas amplifier : aucune variable de genre n'entre dans le modèle, et l'audit d'équité vérifie qu'aucune variable de substitution ne la reconstitue. Mesurer l'une, neutraliser l'autre : c'est l'exigence de conception centrale du projet.</w:t>
+        <w:t>Ces deux phénomènes appellent des réponses opposées. L'inégalité selon le baccalauréat, le moteur doit l'estimer et la dire honnêtement : c'est la réalité de la sélection, la cacher nuirait au candidat. La ségrégation par le genre, à l'inverse, le système ne doit jamais l'amplifier : aucune variable de genre n'entre dans le modèle, et l'audit d'équité vérifie qu'aucune variable de substitution ne la reconstitue. Mesurer l'une, neutraliser l'autre : c'est le principe de conception du projet.</w:t>
       </w:r>
     </w:p>
     <w:p>
@@ -261,7 +261,7 @@
           <w:b w:val="0"/>
           <w:i/>
         </w:rPr>
-        <w:t>Source : ministère de l'Enseignement supérieur et de la Recherche, données ouvertes Parcoursup, session 2025 (jeu fr-esr-parcoursup, Licence Ouverte Etalab v2.0). Les valeurs ci-dessus ont été recalculées à partir du fichier source.</w:t>
+        <w:t>Source : ministère de l'Enseignement supérieur et de la Recherche, données ouvertes Parcoursup, session 2025 (Licence Ouverte Etalab v2.0). Valeurs recalculées à partir du fichier source.</w:t>
       </w:r>
     </w:p>
     <w:p>
@@ -283,16 +283,7 @@
           <w:b w:val="0"/>
           <w:i w:val="0"/>
         </w:rPr>
-        <w:t>Trois causes structurelles expliquent les mauvais choix d'orientation : un manque d'information sur les formations et leurs débouchés, des déterminismes sociaux et territoriaux qui orientent selon le milieu d'origine, et des stéréotypes de genre qui enferment les choix.</w:t>
-      </w:r>
-    </w:p>
-    <w:p>
-      <w:r>
-        <w:rPr>
-          <w:b w:val="0"/>
-          <w:i w:val="0"/>
-        </w:rPr>
-        <w:t>Ces causes ont une conséquence directe sur la conception d'EduMatch : le système ne doit surtout pas les reproduire, ce qui fait de la non-discrimination et de l'explicabilité une exigence de cœur, et non un habillage réglementaire.</w:t>
+        <w:t>Trois causes structurelles expliquent les mauvais choix d'orientation : le manque d'information sur les formations et leurs débouchés, les déterminismes sociaux et territoriaux, et les stéréotypes de genre. Le système ne doit surtout pas les reproduire, ce qui fait de la non-discrimination et de l'explicabilité une exigence de fond, pas un habillage réglementaire.</w:t>
       </w:r>
     </w:p>
     <w:p>
@@ -462,7 +453,7 @@
           <w:p>
             <w:r/>
             <w:r>
-              <w:t>MODÈLE APPRIS (LightGBM, entraîné et tracé dans MLflow), explicabilité SHAP produite (TreeSHAP, précalculée sur les 440 030 cellules) — résultat de performance défavorable en test, détaillé en section 7</w:t>
+              <w:t>Modèle appris (LightGBM, tracé dans MLflow), explicabilité SHAP produite (TreeSHAP, précalculée sur 440 030 cellules) — résultat de performance défavorable en test, détaillé en section 7</w:t>
             </w:r>
           </w:p>
         </w:tc>
@@ -520,7 +511,7 @@
           <w:b w:val="0"/>
           <w:i w:val="0"/>
         </w:rPr>
-        <w:t>Les trois termes sont combinés de façon multiplicative : si l'un s'annule, la recommandation disparaît. Recommander une formation accessible mais sans affinité, ou adéquate mais sans aucun employeur du secteur dans un rayon atteignable, serait une mauvaise orientation.</w:t>
+        <w:t>Les trois termes se multiplient : si l'un s'annule, la recommandation disparaît. Recommander une formation accessible mais sans rapport avec les goûts, ou adaptée mais sans aucun employeur du secteur à proximité, serait une mauvaise orientation.</w:t>
       </w:r>
     </w:p>
     <w:p>
@@ -529,7 +520,7 @@
           <w:b/>
           <w:i w:val="0"/>
         </w:rPr>
-        <w:t>Périmètre de la certification. Le produit EduMatch comporte plusieurs fonctionnalités, mais la certification porte sur un seul système décisionnel :</w:t>
+        <w:t>Périmètre de la certification : le produit EduMatch comporte plusieurs fonctionnalités, la certification porte sur un seul système décisionnel.</w:t>
       </w:r>
     </w:p>
     <w:tbl>
@@ -592,7 +583,7 @@
           <w:p>
             <w:r/>
             <w:r>
-              <w:t>Composant central et seul modèle industrialisé de bout en bout (blocs 1 à 4). Décision automatisée à fort enjeu : c'est lui qui ancre les exigences d'explicabilité, de non-discrimination et de supervision humaine.</w:t>
+              <w:t>Composant central, seul modèle industrialisé de bout en bout (blocs 1 à 4).</w:t>
             </w:r>
           </w:p>
         </w:tc>
@@ -605,7 +596,7 @@
           <w:p>
             <w:r/>
             <w:r>
-              <w:t>Chatbot fondé sur la génération augmentée par récupération (RAG)</w:t>
+              <w:t>Chatbot RAG (génération augmentée par récupération)</w:t>
             </w:r>
           </w:p>
         </w:tc>
@@ -616,7 +607,7 @@
           <w:p>
             <w:r/>
             <w:r>
-              <w:t>Brique secondaire. Il restitue en langue naturelle, avec citation des sources officielles, les éléments qui fondent une recommandation. Intégré et supervisé, mais non industrialisé au même niveau d'exigence.</w:t>
+              <w:t>Brique secondaire : restitue en langue naturelle, avec citation des sources, les éléments qui fondent une recommandation. Intégré et supervisé, pas industrialisé au même niveau.</w:t>
             </w:r>
           </w:p>
         </w:tc>
@@ -628,7 +619,7 @@
           <w:b w:val="0"/>
           <w:i/>
         </w:rPr>
-        <w:t>Le périmètre certifiant se limite à ces deux briques. L'écran de supervision destiné aux conseillers d'orientation n'est pas une fonctionnalité produit : c'est un composant de conformité, imposé par l'exigence de contrôle humain de l'AI Act, traité en section 7.</w:t>
+        <w:t>L'écran de supervision des conseillers n'est pas une fonctionnalité produit : c'est un composant de conformité, imposé par l'exigence de contrôle humain de l'AI Act (section 7).</w:t>
       </w:r>
     </w:p>
     <w:p>
@@ -637,7 +628,7 @@
           <w:b w:val="0"/>
           <w:i w:val="0"/>
         </w:rPr>
-        <w:t>Le projet est soumis à des contraintes qui imposent des arbitrages :</w:t>
+        <w:t>Le projet impose de vrais arbitrages :</w:t>
       </w:r>
     </w:p>
     <w:p>
@@ -645,7 +636,7 @@
         <w:pStyle w:val="ListBullet"/>
       </w:pPr>
       <w:r>
-        <w:t>Volumétrie et hétérogénéité : cinq sources publiques dont les tailles s'échelonnent sur plus de deux ordres de grandeur, du référentiel de quelques mégaoctets à une base de 43,9 millions d'établissements. Les confondre conduirait soit à sous-dimensionner, soit à surdimensionner l'architecture (section 2).</w:t>
+        <w:t>Volumétrie et hétérogénéité : cinq sources publiques, de quelques mégaoctets à 43,9 millions d'établissements (section 2).</w:t>
       </w:r>
     </w:p>
     <w:p>
@@ -653,7 +644,7 @@
         <w:pStyle w:val="ListBullet"/>
       </w:pPr>
       <w:r>
-        <w:t>Performance et fraîcheur : la recommandation doit être calculée en latence interactive, alors que les sources se mettent à jour à des rythmes très différents : Parcoursup une fois par an à l'issue de la campagne, Sirene chaque mois, les référentiels de façon continue.</w:t>
+        <w:t>Performance et fraîcheur : recommandation en temps interactif, sources mises à jour à des rythmes très différents (annuel, mensuel, continu).</w:t>
       </w:r>
     </w:p>
     <w:p>
@@ -661,7 +652,7 @@
         <w:pStyle w:val="ListBullet"/>
       </w:pPr>
       <w:r>
-        <w:t>Budget : structure de coûts d'une startup en amorçage, imposant un pilotage FinOps de l'inférence et un arbitrage permanent entre services managés et auto-hébergement.</w:t>
+        <w:t>Budget : structure de coûts d'une startup en amorçage, à surveiller côté inférence.</w:t>
       </w:r>
     </w:p>
     <w:p>
@@ -669,7 +660,7 @@
         <w:pStyle w:val="ListBullet"/>
       </w:pPr>
       <w:r>
-        <w:t>Conformité : traitement de données personnelles de mineurs et d'adultes. Les caractéristiques scolaires et les appétences transmises au moteur, mises en correspondance avec des formations, constituent un profilage produisant une décision automatisée au sens de l'article 22. Cela exige une base légale, le consentement, la minimisation, la transparence sur la logique et une analyse d'impact. S'y ajoutent l'explicabilité et la non-discrimination exigées par l'AI Act, et le respect des licences de réutilisation (section 3).</w:t>
+        <w:t>Conformité : données de mineurs et d'adultes ; le profilage relève de l'article 22 (base légale, consentement, minimisation, transparence, analyse d'impact) et de l'AI Act (explicabilité, non-discrimination), plus le respect des licences (section 3).</w:t>
       </w:r>
     </w:p>
     <w:p>
@@ -710,7 +701,7 @@
           <w:p>
             <w:r/>
             <w:r>
-              <w:t>Fixent la stratégie produit et arbitrent le rapport valeur / coût / conformité ; sponsors du projet.</w:t>
+              <w:t>Stratégie produit, arbitrage valeur / coût / conformité.</w:t>
             </w:r>
           </w:p>
         </w:tc>
@@ -734,7 +725,7 @@
           <w:p>
             <w:r/>
             <w:r>
-              <w:t>Pilote le backlog, les sprints et la coordination de l'équipe.</w:t>
+              <w:t>Pilote le backlog et les sprints.</w:t>
             </w:r>
           </w:p>
         </w:tc>
@@ -758,7 +749,7 @@
           <w:p>
             <w:r/>
             <w:r>
-              <w:t>Conçoit l'architecture, arbitre les choix technologiques, pilote la gouvernance des données et de l'IA et la mise en production.</w:t>
+              <w:t>Conçoit l'architecture, arbitre les choix, pilote la gouvernance et la mise en production.</w:t>
             </w:r>
           </w:p>
         </w:tc>
@@ -782,7 +773,7 @@
           <w:p>
             <w:r/>
             <w:r>
-              <w:t>Garant de la conformité RGPD : données de mineurs et d'adultes, licéité de la réutilisation des données publiques.</w:t>
+              <w:t>Garant RGPD : mineurs et adultes, licéité des données publiques réutilisées.</w:t>
             </w:r>
           </w:p>
         </w:tc>
@@ -806,7 +797,7 @@
           <w:p>
             <w:r/>
             <w:r>
-              <w:t>Met en œuvre les pipelines, le moteur et le RAG sous la responsabilité de l'architecte.</w:t>
+              <w:t>Met en œuvre les pipelines, le moteur et le RAG.</w:t>
             </w:r>
           </w:p>
         </w:tc>
@@ -830,7 +821,7 @@
           <w:p>
             <w:r/>
             <w:r>
-              <w:t>Superviseurs humains des recommandations : ils revoient, contextualisent et peuvent écarter une recommandation.</w:t>
+              <w:t>Superviseurs humains : revoient, contextualisent, peuvent écarter une recommandation.</w:t>
             </w:r>
           </w:p>
         </w:tc>
@@ -843,7 +834,7 @@
           <w:p>
             <w:r/>
             <w:r>
-              <w:t>Établissements clients et utilisateurs</w:t>
+              <w:t>Établissements et utilisateurs</w:t>
             </w:r>
           </w:p>
         </w:tc>
@@ -854,7 +845,7 @@
           <w:p>
             <w:r/>
             <w:r>
-              <w:t>Lycées, CFA, organismes de formation ; élèves, étudiants, personnes en reconversion et familles.</w:t>
+              <w:t>Lycées, CFA, organismes de formation ; élèves, étudiants, personnes en reconversion.</w:t>
             </w:r>
           </w:p>
         </w:tc>
@@ -878,7 +869,7 @@
           <w:p>
             <w:r/>
             <w:r>
-              <w:t>Ministère de l'Enseignement supérieur (Parcoursup) ; INSEE (base Sirene) ; France Compétences, ONISEP, IDEO métier.</w:t>
+              <w:t>MESR (Parcoursup), INSEE (Sirene), France Compétences, ONISEP, IDEO.</w:t>
             </w:r>
           </w:p>
         </w:tc>
@@ -902,7 +893,7 @@
           <w:p>
             <w:r/>
             <w:r>
-              <w:t>Garantit la conformité RGAA pour les personnes en situation de handicap.</w:t>
+              <w:t>Conformité RGAA pour les personnes en situation de handicap.</w:t>
             </w:r>
           </w:p>
         </w:tc>
@@ -927,7 +918,7 @@
           <w:b w:val="0"/>
           <w:i w:val="0"/>
         </w:rPr>
-        <w:t>J'ai conçu et développé moi-même la première version d'EduMatch : un MVP fonctionnel qui valide le concept et sert aujourd'hui de point de départ. Il repose sur un front Next.js et React (TypeScript, Redux) et un back FastAPI ; l'assistant RAG y enchaîne embeddings CamemBERT, recherche vectorielle FAISS, orchestration LangChain et génération Mistral-small. Ces choix ont été faits pour livrer vite et prouver la valeur du produit, non pour la production à grande échelle : l'ingestion reste semi-manuelle, sans orchestration ni contrôle qualité, l'infrastructure n'est pensée ni pour la conformité ni pour la montée en charge, et le moteur d'orientation n'est pas encore développé. Le présent projet est la suite directe de ce travail : restructurer et industrialiser cette base.</w:t>
+        <w:t>J'ai conçu et développé la première version d'EduMatch, un MVP qui valide le concept et sert de point de départ : front Next.js/React (TypeScript, Redux), back FastAPI, assistant RAG en CamemBERT, FAISS, LangChain et Mistral-small. Ces choix visaient à livrer vite, pas à tenir en production : ingestion semi-manuelle sans orchestration ni contrôle qualité, infrastructure non pensée pour la conformité ni la charge, et le moteur d'orientation n'existait pas. Ce projet reprend cette base pour la restructurer et l'industrialiser.</w:t>
       </w:r>
     </w:p>
     <w:p>
@@ -936,7 +927,7 @@
           <w:b/>
           <w:i w:val="0"/>
         </w:rPr>
-        <w:t>Les trois sources, leur rôle et leur volumétrie.</w:t>
+        <w:t>Les sources, leur rôle et leur volumétrie.</w:t>
       </w:r>
     </w:p>
     <w:p>
@@ -945,7 +936,7 @@
           <w:b w:val="0"/>
           <w:i w:val="0"/>
         </w:rPr>
-        <w:t>Chaque source répond à une question précise du système : aucune n'est présente pour justifier une architecture, et aucune ne peut être retirée sans amputer une des dimensions de la décision.</w:t>
+        <w:t>Chaque source répond à une question précise : aucune n'est là pour la forme, aucune ne peut être retirée sans amputer une dimension de la décision.</w:t>
       </w:r>
     </w:p>
     <w:tbl>
@@ -1027,7 +1018,7 @@
           <w:p>
             <w:r/>
             <w:r>
-              <w:t>Parcoursup, sessions 2018 à 2025 (MESR)</w:t>
+              <w:t>Parcoursup, sessions 2018-2025 (MESR)</w:t>
             </w:r>
           </w:p>
         </w:tc>
@@ -1038,7 +1029,7 @@
           <w:p>
             <w:r/>
             <w:r>
-              <w:t>Résultats d'admission par formation et par profil de candidat. Source du label du modèle appris.</w:t>
+              <w:t>Résultats d'admission par formation et profil. Source du label du modèle appris.</w:t>
             </w:r>
           </w:p>
         </w:tc>
@@ -1049,7 +1040,7 @@
           <w:p>
             <w:r/>
             <w:r>
-              <w:t>104 274 formation-années, 118 colonnes (2025), 82 Mo mesurés sur les 8 CSV posés sur disque. 77 159 cellules exploitables par millésime</w:t>
+              <w:t>104 274 formation-années, 118 colonnes (2025), 82 Mo sur 8 CSV. 77 159 cellules exploitables par millésime</w:t>
             </w:r>
           </w:p>
         </w:tc>
@@ -1084,7 +1075,7 @@
           <w:p>
             <w:r/>
             <w:r>
-              <w:t>Tissu économique : activité, commune, effectifs, créations et cessations depuis 1973. Densité et dynamique des employeurs par secteur et par bassin.</w:t>
+              <w:t>Tissu économique : activité, commune, effectifs, créations et cessations depuis 1973.</w:t>
             </w:r>
           </w:p>
         </w:tc>
@@ -1095,7 +1086,7 @@
           <w:p>
             <w:r/>
             <w:r>
-              <w:t>43 896 818 établissements et 29 922 486 unités légales ; 6,44 Go compressés (ZIP) et 4,63 Go en Parquet pour les quatre fichiers retenus, stock du 1er août 2026</w:t>
+              <w:t>43 896 818 établissements, 29 922 486 unités légales ; 6,44 Go compressés, 4,63 Go en Parquet pour les quatre fichiers retenus, stock du 1er août 2026</w:t>
             </w:r>
           </w:p>
         </w:tc>
@@ -1130,7 +1121,7 @@
           <w:p>
             <w:r/>
             <w:r>
-              <w:t>Description des formations, des métiers et des certifications ; support de la mise en correspondance entre activité économique et formation.</w:t>
+              <w:t>Description des formations, métiers et certifications ; correspondance activité / formation.</w:t>
             </w:r>
           </w:p>
         </w:tc>
@@ -1141,7 +1132,7 @@
           <w:p>
             <w:r/>
             <w:r>
-              <w:t>IDÉO : 5 869 formations, 1 534 métiers, 24 278 structures (15,9 Mo). RNCP et Répertoire spécifique : 30 484 fiches dont 7 000 actives (export du 29 août 2026, republié chaque jour)</w:t>
+              <w:t>IDÉO : 5 869 formations, 1 534 métiers, 24 278 structures (15,9 Mo). RNCP et Répertoire spécifique : 30 484 fiches dont 7 000 actives (export du 29 août 2026)</w:t>
             </w:r>
           </w:p>
         </w:tc>
@@ -1152,7 +1143,7 @@
           <w:p>
             <w:r/>
             <w:r>
-              <w:t>ONISEP et IDÉO : ODbL — partage à l'identique obligatoire sur tout dérivé redistribué. RNCP (France Compétences) : Licence Ouverte v2.0</w:t>
+              <w:t>ONISEP et IDÉO : ODbL — partage à l'identique. RNCP : Licence Ouverte v2.0</w:t>
             </w:r>
           </w:p>
         </w:tc>
@@ -1164,7 +1155,7 @@
           <w:b w:val="0"/>
           <w:i w:val="0"/>
         </w:rPr>
-        <w:t>Les données présentent les trois dimensions (3V) de façon non triviale :</w:t>
+        <w:t>Les trois dimensions (3V) sont non triviales ici :</w:t>
       </w:r>
     </w:p>
     <w:p>
@@ -1172,7 +1163,7 @@
         <w:pStyle w:val="ListBullet"/>
       </w:pPr>
       <w:r>
-        <w:t>Volume : 43,9 millions d'établissements à joindre et agréger par secteur et par territoire, soit 25 à 30 Go décompressés, à côté d'un référentiel d'admission d'une centaine de mégaoctets.</w:t>
+        <w:t>Volume : 43,9 millions d'établissements à joindre et agréger, 25 à 30 Go décompressés, face à un référentiel d'admission d'une centaine de mégaoctets.</w:t>
       </w:r>
     </w:p>
     <w:p>
@@ -1180,7 +1171,7 @@
         <w:pStyle w:val="ListBullet"/>
       </w:pPr>
       <w:r>
-        <w:t>Vélocité : publications périodiques traitées en batch (Parcoursup annuel, Sirene mensuel, référentiels continus), face à des recommandations servies en latence interactive.</w:t>
+        <w:t>Vélocité : publications en batch à des rythmes très différents, pour des recommandations servies en temps interactif.</w:t>
       </w:r>
     </w:p>
     <w:p>
@@ -1188,7 +1179,7 @@
         <w:pStyle w:val="ListBullet"/>
       </w:pPr>
       <w:r>
-        <w:t>Variété : fichiers CSV structurés, fichiers Parquet volumineux, réponses d'API, référentiels et données déclaratives des candidats. L'hétérogénéité des nomenclatures (activité NAF, métier ROME, codes de formation) est au cœur du défi de pipeline.</w:t>
+        <w:t>Variété : CSV, Parquet volumineux, API, référentiels, données déclaratives. L'hétérogénéité des nomenclatures (NAF, ROME, codes de formation) est le cœur du défi.</w:t>
       </w:r>
     </w:p>
     <w:p>
@@ -1209,7 +1200,7 @@
         <w:pStyle w:val="ListBullet"/>
       </w:pPr>
       <w:r>
-        <w:t>RGPD et loi Informatique et Libertés. L'architecture sépare nettement deux régimes, ce qui réduit fortement la surface de risque. L'entraînement du modèle ne mobilise aucune donnée à caractère personnel : les résultats Parcoursup sont des comptages agrégés par formation et la base Sirene décrit des établissements, non des personnes. Les données personnelles n'interviennent qu'à l'inférence, lorsqu'un candidat renseigne ses caractéristiques scolaires et ses centres d'intérêt. Il ne s'agit pas d'un profil de compte alimenté par l'usage de l'application : aucune donnée de navigation, d'historique ou de comportement n'intervient, ni à l'entraînement, ni à l'inférence.</w:t>
+        <w:t>RGPD : l'entraînement ne mobilise aucune donnée personnelle (Parcoursup = comptages agrégés, Sirene = établissements). Les données personnelles n'interviennent qu'à l'inférence, quand un candidat renseigne bac, mention, statut de boursier, territoire et centres d'intérêt — rien de plus, par minimisation. Aucune donnée de navigation ou de comportement n'intervient.</w:t>
       </w:r>
     </w:p>
     <w:p>
@@ -1217,7 +1208,7 @@
         <w:pStyle w:val="ListBullet"/>
       </w:pPr>
       <w:r>
-        <w:t>Ces informations se limitent au type de baccalauréat, à la mention, au statut de boursier, au territoire et aux centres d'intérêt déclarés : c'est le strict nécessaire au calcul, en application du principe de minimisation. Le public comprenant des mineurs, la base légale repose sur le consentement, recueilli auprès du titulaire de l'autorité parentale en dessous de quinze ans. La recommandation constituant une décision individuelle automatisée au sens de l'article 22, l'utilisateur dispose d'un droit à l'information sur la logique sous-jacente : c'est la fonction des explications produites par SHAP. Les droits d'accès, de rectification, d'effacement et d'opposition au profilage sont mis en œuvre.</w:t>
+        <w:t>Base légale et droits : le public comptant des mineurs, la base légale est le consentement du titulaire de l'autorité parentale en dessous de quinze ans. La recommandation est une décision automatisée (article 22) : droit à l'explication, assuré par SHAP. Droits d'accès, de rectification, d'effacement et d'opposition mis en œuvre.</w:t>
       </w:r>
     </w:p>
     <w:p>
@@ -1225,7 +1216,7 @@
         <w:pStyle w:val="ListBullet"/>
       </w:pPr>
       <w:r>
-        <w:t>Un arbitrage doit être explicité entre deux exigences en tension. L'article 12 du règlement sur l'IA impose la journalisation des inférences pour assurer la traçabilité des décisions ; le RGPD impose au contraire une limitation des durées de conservation. La conciliation retenue est une durée définie et documentée, au terme de laquelle les journaux sont pseudonymisés puis agrégés, de façon à conserver la capacité d'audit sans conserver l'identification. Une analyse d'impact est conduite, le profilage systématique de mineurs la rendant obligatoire.</w:t>
+        <w:t>Tension conservation / traçabilité : l'article 12 de l'AI Act impose de journaliser les inférences, le RGPD impose de limiter la conservation. Solution : une durée définie, puis pseudonymisation et agrégation des journaux. Une analyse d'impact est menée, le profilage systématique de mineurs la rendant obligatoire.</w:t>
       </w:r>
     </w:p>
     <w:p>
@@ -1233,7 +1224,7 @@
         <w:pStyle w:val="ListBullet"/>
       </w:pPr>
       <w:r>
-        <w:t>Réutilisation des données publiques : les jeux du ministère et de l'INSEE sont diffusés sous Licence Ouverte v2.0 (Etalab), qui autorise la réutilisation, y compris commerciale, sous réserve de mention de la source. Un registre des sources et de leurs conditions de réutilisation est tenu et audité au même titre que le registre des traitements.</w:t>
+        <w:t>Réutilisation : les jeux du ministère et de l'INSEE sont en Licence Ouverte v2.0 (usage commercial autorisé, source à mentionner). Un registre des sources et licences est tenu.</w:t>
       </w:r>
     </w:p>
     <w:p>
@@ -1241,7 +1232,7 @@
         <w:pStyle w:val="ListBullet"/>
       </w:pPr>
       <w:r>
-        <w:t>Règlement européen sur l'IA : le système relève de l'annexe III, point 3, qui vise les systèmes destinés à déterminer l'accès ou l'admission de personnes physiques à des établissements d'enseignement. Il en découle des obligations de gestion des risques, de gouvernance des données, de documentation, de journalisation, de transparence, de contrôle humain, d'exactitude et de robustesse, détaillées au bloc 1.</w:t>
+        <w:t>AI Act : le système relève de l'annexe III, point 3 (accès à l'enseignement) : gestion des risques, gouvernance des données, documentation, journalisation, transparence, contrôle humain, exactitude et robustesse (détail bloc 1).</w:t>
       </w:r>
     </w:p>
     <w:p>
@@ -1249,7 +1240,7 @@
         <w:pStyle w:val="ListBullet"/>
       </w:pPr>
       <w:r>
-        <w:t>Sécurité (ISO 27001) et souveraineté : chiffrement, moindre privilège, journalisation. L'hébergement européen est retenu comme mesure de réduction du risque lié au traitement de données de mineurs.</w:t>
+        <w:t>Sécurité et souveraineté : chiffrement, moindre privilège, journalisation (ISO 27001). Hébergement européen retenu pour réduire le risque lié aux données de mineurs.</w:t>
       </w:r>
     </w:p>
     <w:p>
@@ -1271,7 +1262,7 @@
           <w:b w:val="0"/>
           <w:i/>
         </w:rPr>
-        <w:t>Ce que le projet rend inévitable : données personnelles de mineurs et d'adultes, réutilisation de plusieurs sources publiques aux licences distinctes, contexte multi-parties prenantes et exigence de conformité AI Act non triviale.</w:t>
+        <w:t>Ce que le projet impose : données de mineurs et d'adultes, plusieurs sources publiques sous des licences différentes, plusieurs parties prenantes, une conformité AI Act non triviale.</w:t>
       </w:r>
     </w:p>
     <w:p>
@@ -1280,7 +1271,7 @@
           <w:b w:val="0"/>
           <w:i w:val="0"/>
         </w:rPr>
-        <w:t>Le plan de gouvernance est écrit et versionné : une politique de classification des données (publiques, internes, personnelles, sensibles) et des règles d'usage associées, dont six sur sept sont aujourd'hui contrôlées automatiquement plutôt que déclarées sur le papier ; une répartition des rôles entre un Data Owner côté direction, des Data Stewards côté équipe data et un DPO garant de la conformité, chacun avec son périmètre de décision ; un registre des traitements couvrant huit traitements identifiés (T1 à T8), avec finalité, base légale, durée et destinataires, et l'état réel de chacun déclaré plutôt que supposé. La documentation des origines, schémas, fraîcheurs et lignages est produite par l'outillage du pipeline lui-même (tests de qualité et graphe de lignage généré par dbt), sans catalogue supplémentaire à exploiter.</w:t>
+        <w:t>Le plan de gouvernance est écrit et versionné : classification des données (publiques, internes, personnelles, sensibles) avec des règles d'usage, dont six sur sept sont contrôlées automatiquement plutôt que déclarées sur le papier ; rôles répartis entre un Data Owner côté direction, des Data Stewards côté équipe data et un DPO ; registre de huit traitements (T1 à T8) avec finalité, base légale, durée, destinataires, chacun avec son état réel. Origines, schémas, fraîcheurs et lignages sont documentés par le pipeline lui-même (tests de qualité, lignage dbt), sans outil de catalogage séparé.</w:t>
       </w:r>
     </w:p>
     <w:p>
@@ -1289,7 +1280,7 @@
           <w:b w:val="0"/>
           <w:i w:val="0"/>
         </w:rPr>
-        <w:t>La gestion des risques couvre onze risques identifiés (R1 à R11), répartis sur quatre familles : la violation de données de mineurs (chiffrement, minimisation, hébergement européen), la discrimination des recommandations (audit d'équité, indicateurs de parité, explicabilité), la non-conformité de réutilisation (registre des licences) et l'obsolescence des données (contrôles de fraîcheur bloquants dans le pipeline).</w:t>
+        <w:t>La gestion des risques couvre onze risques (R1 à R11) sur quatre familles : violation de données de mineurs, discrimination des recommandations, non-conformité de réutilisation, obsolescence des données.</w:t>
       </w:r>
     </w:p>
     <w:tbl>
@@ -1378,7 +1369,7 @@
           <w:p>
             <w:r/>
             <w:r>
-              <w:t>Registre des onze risques, révisé à chaque campagne d'orientation</w:t>
+              <w:t>Registre des onze risques, révisé à chaque campagne</w:t>
             </w:r>
           </w:p>
         </w:tc>
@@ -1413,7 +1404,7 @@
           <w:p>
             <w:r/>
             <w:r>
-              <w:t>Contrôles de qualité automatisés, audit d'équité, registre des sources</w:t>
+              <w:t>Contrôles qualité automatisés, audit d'équité, registre des sources</w:t>
             </w:r>
           </w:p>
         </w:tc>
@@ -1483,7 +1474,7 @@
           <w:p>
             <w:r/>
             <w:r>
-              <w:t>Traçabilité horodatée de chaque recommandation produite, purge exécutable par paliers</w:t>
+              <w:t>Traçabilité horodatée de chaque recommandation, purge par paliers</w:t>
             </w:r>
           </w:p>
         </w:tc>
@@ -1518,7 +1509,7 @@
           <w:p>
             <w:r/>
             <w:r>
-              <w:t>Notice utilisateur — à écrire ; restitution des facteurs déterminants par SHAP, produite</w:t>
+              <w:t>Notice utilisateur — à écrire ; restitution SHAP produite</w:t>
             </w:r>
           </w:p>
         </w:tc>
@@ -1553,7 +1544,7 @@
           <w:p>
             <w:r/>
             <w:r>
-              <w:t>Écran conseiller : revue, contextualisation, possibilité d'écarter, motif obligatoire</w:t>
+              <w:t>Écran conseiller : revue, contextualisation, écartement motivé</w:t>
             </w:r>
           </w:p>
         </w:tc>
@@ -1588,7 +1579,7 @@
           <w:p>
             <w:r/>
             <w:r>
-              <w:t>Protocole d'évaluation temporel, seuils de performance, tests. Résultat mesuré défavorable au modèle appris en test (section 7) — reporté, non atténué</w:t>
+              <w:t>Protocole temporel, seuils, tests. Résultat mesuré défavorable au modèle appris en test (section 7)</w:t>
             </w:r>
           </w:p>
         </w:tc>
@@ -1600,7 +1591,7 @@
           <w:b w:val="0"/>
           <w:i w:val="0"/>
         </w:rPr>
-        <w:t>L'analyse d'impact (AIPD), obligatoire du fait du profilage systématique de mineurs, refait le test de nécessité une fois les mesures disponibles, et non avant. Ce test échoue sur le terme appris : une règle de dénombrement déjà construite (le taux de la session précédente) fait mieux que le modèle en précision et en calibration sur la session de test la plus récente. L'avis qui en découle est scindé plutôt que global : défavorable à la restitution, à des candidats réels, de l'estimation produite par le modèle appris ; favorable, sous réserves, au reste du dispositif (affinité, débouchés, explications SHAP, écran de supervision, journalisation et purge) ; favorable, sans réserve de fond, à l'exploitation en environnement de démonstration. Le seuil qui lèverait le premier point est écrit avant toute nouvelle mesure : un modèle réentraîné descendant sous 0,0701 de MAE pondérée et 0,0322 d'ECE sur une session de test non consultée pendant le réglage.</w:t>
+        <w:t>L'analyse d'impact, obligatoire du fait du profilage de mineurs, refait le test de nécessité une fois les mesures disponibles, pas avant. Ce test échoue sur le terme appris : une règle déjà construite, le taux de la session précédente, fait mieux que le modèle en précision et en calibration sur la session la plus récente. L'avis est donc scindé : défavorable à la restitution du terme appris à des candidats réels ; favorable sous réserves au reste du dispositif ; favorable sans réserve à l'exploitation en démonstration. Le seuil qui lèverait la réserve est écrit à l'avance : un modèle réentraîné sous 0,0701 de MAE pondérée et 0,0322 d'ECE sur une session non consultée pendant le réglage.</w:t>
       </w:r>
     </w:p>
     <w:p>
@@ -1609,7 +1600,7 @@
           <w:b w:val="0"/>
           <w:i w:val="0"/>
         </w:rPr>
-        <w:t>La conformité est maintenue par une procédure d'audit écrite, calée sur le calendrier Parcoursup, avec douze points de contrôle et trois déclencheurs ; une procédure de mise à jour, déjà appliquée à trois reprises, complète le dispositif. Ce qui reste ouvert dans ce bloc n'est pas de la rédaction supplémentaire : une notice d'information lisible par un lecteur mineur, et un identifiant de corrélation pour rendre purgeable le journal de supervision, restent à écrire.</w:t>
+        <w:t>La conformité est suivie par une procédure d'audit calée sur le calendrier Parcoursup (douze points de contrôle, trois déclencheurs), déjà appliquée trois fois. Restent à écrire : une notice d'information lisible par un mineur, et un identifiant de corrélation pour rendre purgeable le journal de supervision.</w:t>
       </w:r>
     </w:p>
     <w:p>
@@ -1618,7 +1609,7 @@
           <w:b w:val="0"/>
           <w:i/>
         </w:rPr>
-        <w:t>À livrer à terme : présentation synthétique devant le jury. Le reste des livrables du bloc existe : plan de gouvernance des données, analyse d'impact, Model Card, registre des sources. Évaluation : lecture jury environ 15 min, présentation 15 min, questions 15 min.</w:t>
+        <w:t>À livrer : présentation devant le jury. Le reste existe : plan de gouvernance, analyse d'impact, Model Card, registre des sources. Évaluation : lecture 15 min, présentation 15 min, questions 15 min.</w:t>
       </w:r>
     </w:p>
     <w:p>
@@ -1640,7 +1631,7 @@
           <w:b w:val="0"/>
           <w:i/>
         </w:rPr>
-        <w:t>Ce que le projet rend inévitable : des volumétries séparées par plus de deux ordres de grandeur, une saisonnalité marquée imposant l'élasticité, et des exigences de disponibilité et de souveraineté.</w:t>
+        <w:t>Ce que le projet impose : des volumétries séparées par plus de deux ordres de grandeur, une saisonnalité marquée qui impose l'élasticité, des exigences de disponibilité et de souveraineté.</w:t>
       </w:r>
     </w:p>
     <w:p>
@@ -1658,7 +1649,7 @@
           <w:b w:val="0"/>
           <w:i w:val="0"/>
         </w:rPr>
-        <w:t>La couche de volume traite des dizaines de gigaoctets de données publiques ne contenant aucune donnée personnelle : la base Sirene. La couche de décision traite des référentiels compacts mais sensibles, et sert l'inférence. Cette séparation sert simultanément la performance et la conformité : le périmètre soumis au RGPD est réduit au strict nécessaire, et le calcul lourd s'exécute là où le risque de violation est structurellement nul.</w:t>
+        <w:t>La couche de volume traite des dizaines de gigaoctets sans donnée personnelle (Sirene). La couche de décision traite des référentiels compacts mais sensibles, et sert l'inférence. Cette séparation sert la performance et la conformité en même temps : le périmètre RGPD reste réduit, et le calcul lourd s'exécute là où le risque est nul.</w:t>
       </w:r>
     </w:p>
     <w:p>
@@ -1667,7 +1658,7 @@
           <w:b w:val="0"/>
           <w:i w:val="0"/>
         </w:rPr>
-        <w:t>Modélisation : un modèle relationnel normalisé sous PostgreSQL portera le transactionnel (utilisateurs, établissements, historique des recommandations) — à construire, ce périmètre n'existe pas encore. Le modèle analytique en étoile qui structure les données d'orientation, lui, est construit (E16) : la table de faits porte les cellules d'observation, avec pour dimensions la formation, le candidat, la session et le territoire. Le choix de PostgreSQL plutôt que de conserver Firestore est justifié par le besoin de cohérence relationnelle et de requêtes analytiques que le NoSQL documentaire sert mal ; le modèle en étoile est retenu pour la prédominance des lectures analytiques.</w:t>
+        <w:t>Modélisation : le transactionnel (utilisateurs, établissements, historique) sera porté par PostgreSQL relationnel — reste à construire. Le modèle analytique en étoile pour les données d'orientation, lui, est construit : la table de faits porte les cellules d'observation, avec pour dimensions formation, candidat, session, territoire. PostgreSQL est retenu plutôt que Firestore pour la cohérence relationnelle et les requêtes analytiques ; le modèle en étoile convient à la prédominance des lectures analytiques.</w:t>
       </w:r>
     </w:p>
     <w:p>
@@ -1676,7 +1667,7 @@
           <w:b w:val="0"/>
           <w:i w:val="0"/>
         </w:rPr>
-        <w:t>Infrastructure. Le service et l'entraînement sont conteneurisés (Docker, construction en deux étapes, exécution non-root, sonde de santé, étiquette d'image portant l'empreinte du commit) et orchestrés localement (Airflow, quatre DAG). Le code d'infrastructure cible existe dans le second dépôt : Terraform pour un cloud souverain européen (Scaleway plutôt qu'un hyperscaler hors Union européenne, arbitrage assumé au regard des données de mineurs — réseau privé, cluster Kubernetes managé, registre d'images, stockage objet, instance Airflow), manifestes Kubernetes complets (déploiement, service, autoscaling horizontal, politique réseau, budget de disruption, compte de service). **Rien de tout cela n'est déployé à ce jour** : aucun compte fournisseur n'est ouvert, aucun `apply` n'a été exécuté, et `terraform validate` lui-même n'a pas pu être lancé faute de binaire installé sur le poste de développement. C'est le point le plus exposé du projet, je le déclare comme tel plutôt que de le présenter comme fait.</w:t>
+        <w:t>Infrastructure : le service et l'entraînement sont conteneurisés (Docker, deux étapes, non-root, sonde de santé, image étiquetée par le commit) et orchestrés en local (Airflow, quatre DAG). Le code cible existe dans le second dépôt : Terraform pour un cloud souverain européen (Scaleway plutôt qu'un hyperscaler hors Union européenne, à cause des données de mineurs) et des manifestes Kubernetes complets. Rien n'est déployé à ce jour : aucun compte fournisseur ouvert, aucun apply exécuté, terraform validate lui-même n'a pas pu tourner faute de binaire installé sur mon poste. C'est le point le plus exposé du projet, je le déclare comme tel.</w:t>
       </w:r>
     </w:p>
     <w:p>
@@ -1685,7 +1676,7 @@
           <w:b w:val="0"/>
           <w:i w:val="0"/>
         </w:rPr>
-        <w:t>Sécurité, en l'état. Le cloisonnement réseau est réel : réseau privé Terraform, politique réseau Kubernetes à entrée et sortie restreintes, exécution non-root et système de fichiers en lecture seule côté conteneurs, gabarit de secret jamais commité. Le chiffrement, en revanche, n'est implémenté nulle part dans le code d'infrastructure actuel, ni au repos sur le stockage objet ni sur la base ; la gestion des accès par rôles se limite au compte de service de la supervision, sans rôle applicatif distinct — deux manques déclarés, à traiter avant tout déploiement réel. La supervision (Prometheus, Grafana, cinq alertes actionnables dont l'absence d'instrumentation elle-même) est écrite et versionnée dans le second dépôt, mais n'a jamais tourné : aucune capture, faute d'environnement où l'exécuter.</w:t>
+        <w:t>Sécurité, en l'état : le cloisonnement réseau est réel (réseau privé Terraform, politique réseau Kubernetes restrictive, conteneurs non-root en lecture seule, aucun secret commité). Le chiffrement, lui, n'est implémenté nulle part dans le code d'infrastructure actuel, et la gestion des accès par rôle se limite au compte de service de la supervision — deux manques à traiter avant tout déploiement réel. La supervision (Prometheus, Grafana, cinq alertes) est écrite dans le second dépôt mais n'a jamais tourné, faute d'environnement.</w:t>
       </w:r>
     </w:p>
     <w:tbl>
@@ -1713,22 +1704,17 @@
           </w:p>
           <w:p>
             <w:r>
-              <w:t>Le volume de données ne justifie pas à lui seul une orchestration élastique : ce serait un argument faible, et il faut le dire. La justification est ailleurs, dans la saisonnalité de l'activité.</w:t>
+              <w:t>Le volume seul ne justifie pas une orchestration élastique. La vraie raison est la saisonnalité : pic de janvier à mai, creux en juillet-août, rapport de charge de l'ordre de 1 à 6.</w:t>
             </w:r>
           </w:p>
           <w:p>
             <w:r>
-              <w:t>L'usage d'EduMatch suit le calendrier de l'orientation : le pic se situe de janvier à mai (formulation des vœux, salons, conseils de classe) et le creux en juillet et août. Le rapport entre charge de pointe et charge de creux est de l'ordre de 1 à 6.</w:t>
+              <w:t>Un dimensionnement fixe ferait payer toute l'année la capacité du pic, pour un taux d'utilisation moyen d'environ 30 pour cent. L'autoscaling dimensionne à la charge réelle — un enjeu de coûts direct pour une startup en amorçage.</w:t>
             </w:r>
           </w:p>
           <w:p>
             <w:r>
-              <w:t>Un dimensionnement fixe imposerait de payer douze mois par an la capacité du pic, soit un taux d'utilisation moyen d'environ 30 pour cent. L'autoscaling permet de dimensionner à la charge réelle. Pour une startup en amorçage, cet arbitrage est un enjeu FinOps direct, et il est également plus sobre en ressources (GreenOps).</w:t>
-            </w:r>
-          </w:p>
-          <w:p>
-            <w:r>
-              <w:t>Kubernetes managé est donc retenu plutôt qu'un cluster auto-géré, dont la charge d'exploitation serait excessive pour une équipe réduite, et plutôt que le PaaS actuel, qui n'offre ni autoscaling fin ni maîtrise de l'infrastructure. Les conteneurs serverless ont été envisagés puis écartés en raison des démarrages à froid, incompatibles avec la latence interactive attendue.</w:t>
+              <w:t>Je retiens Kubernetes managé plutôt qu'un cluster auto-géré (trop lourd à exploiter pour une petite équipe) ou le PaaS actuel (pas d'autoscaling fin). Le serverless a été écarté pour ses démarrages à froid, incompatibles avec la latence interactive attendue.</w:t>
             </w:r>
           </w:p>
         </w:tc>
@@ -1741,7 +1727,7 @@
           <w:b w:val="0"/>
           <w:i/>
         </w:rPr>
-        <w:t>À livrer à terme : infrastructure effectivement déployée sur un compte fournisseur, chiffrement et rôles applicatifs, capture de la supervision en fonctionnement, et la vidéo de l'infrastructure en production. Les diagrammes C4 (niveaux 1 et 2, Mermaid) et le code d'infrastructure as code existent d'ores et déjà. Évaluation : lecture environ 20 min, présentation 5 min, questions 15 min.</w:t>
+        <w:t>À livrer : infrastructure déployée, chiffrement et rôles applicatifs, capture de la supervision, vidéo de l'infrastructure en production. Les diagrammes C4 et le code d'infrastructure existent déjà. Évaluation : lecture 20 min, présentation 5 min, questions 15 min.</w:t>
       </w:r>
     </w:p>
     <w:p>
@@ -1763,7 +1749,7 @@
           <w:b w:val="0"/>
           <w:i/>
         </w:rPr>
-        <w:t>Ce que le projet rend inévitable : trois sources publiques de formats et de fréquences différents, des volumétries séparées par plus de deux ordres de grandeur, et la réconciliation de trois nomenclatures indépendantes.</w:t>
+        <w:t>Ce que le projet impose : trois sources publiques de formats et de fréquences différents, des volumétries séparées par plus de deux ordres de grandeur, la réconciliation de trois nomenclatures indépendantes.</w:t>
       </w:r>
     </w:p>
     <w:p>
@@ -1772,7 +1758,7 @@
           <w:b/>
           <w:i w:val="0"/>
         </w:rPr>
-        <w:t>Ingestion. Trois connecteurs, tous sur mesure, les connecteurs génériques étant inadaptés à ces sources publiques françaises :</w:t>
+        <w:t>Ingestion : trois connecteurs sur mesure, les connecteurs génériques étant inadaptés à ces sources publiques françaises.</w:t>
       </w:r>
     </w:p>
     <w:tbl>
@@ -1850,7 +1836,7 @@
           <w:p>
             <w:r/>
             <w:r>
-              <w:t>API du portail de données ouvertes du ministère, huit millésimes</w:t>
+              <w:t>API du portail de données ouvertes, huit millésimes</w:t>
             </w:r>
           </w:p>
         </w:tc>
@@ -1861,7 +1847,7 @@
           <w:p>
             <w:r/>
             <w:r>
-              <w:t>Annuelle, à l'issue de la campagne</w:t>
+              <w:t>Annuelle, fin de campagne</w:t>
             </w:r>
           </w:p>
         </w:tc>
@@ -1909,7 +1895,7 @@
           <w:p>
             <w:r/>
             <w:r>
-              <w:t>Référentiels ONISEP, IDEO et RNCP</w:t>
+              <w:t>Référentiels ONISEP, IDEO, RNCP</w:t>
             </w:r>
           </w:p>
         </w:tc>
@@ -1943,7 +1929,7 @@
           <w:b w:val="0"/>
           <w:i w:val="0"/>
         </w:rPr>
-        <w:t>Les connecteurs sont idempotents et écrivent de façon atomique : un fichier déjà présent n'est pas retéléchargé, et une interruption ne laisse jamais un fichier tronqué que le pipeline croirait complet.</w:t>
+        <w:t>Les connecteurs sont idempotents et écrivent de façon atomique : un fichier déjà présent n'est pas retéléchargé, une interruption ne laisse jamais un fichier tronqué que le pipeline croirait complet.</w:t>
       </w:r>
     </w:p>
     <w:p>
@@ -1952,7 +1938,7 @@
           <w:b/>
           <w:i w:val="0"/>
         </w:rPr>
-        <w:t>Transformation. Deux chaînes distinctes, en cohérence avec les ordres de grandeur.</w:t>
+        <w:t>Transformation : deux chaînes distinctes, en cohérence avec les ordres de grandeur.</w:t>
       </w:r>
     </w:p>
     <w:p>
@@ -1960,7 +1946,7 @@
         <w:pStyle w:val="ListBullet"/>
       </w:pPr>
       <w:r>
-        <w:t>Chaîne de décision, traitée en mono-nœud avec Polars puis dbt : réconciliation des huit millésimes Parcoursup dont les schémas ont évolué, nettoyage, normalisation et construction des cellules d'observation. Volumétrie de l'ordre de la centaine de mégaoctets.</w:t>
+        <w:t>Chaîne de décision, mono-nœud (Polars puis dbt) : réconciliation des huit millésimes Parcoursup, nettoyage, construction des cellules d'observation. De l'ordre de la centaine de mégaoctets.</w:t>
       </w:r>
     </w:p>
     <w:p>
@@ -1968,7 +1954,7 @@
         <w:pStyle w:val="ListBullet"/>
       </w:pPr>
       <w:r>
-        <w:t>Chaîne de volume, agrégation de la base Sirene par commune et par secteur d'activité, calcul des dynamiques de créations et cessations sur dix ans, puis élargissement au bassin d'emploi. Volumétrie de l'ordre de la dizaine de gigaoctets. Deux moteurs implémentés et testés contre le même résultat : Polars en exécution courante, PySpark branché sur le mode cluster.</w:t>
+        <w:t>Chaîne de volume, agrégation Sirene par commune et secteur, dynamique des créations et cessations sur dix ans, élargissement au bassin d'emploi. De l'ordre de la dizaine de gigaoctets. Deux moteurs testés contre le même résultat : Polars en usage courant, PySpark branché en mode cluster.</w:t>
       </w:r>
     </w:p>
     <w:p>
@@ -1977,7 +1963,7 @@
           <w:b w:val="0"/>
           <w:i w:val="0"/>
         </w:rPr>
-        <w:t>Le nettoyage de la chaîne Sirene mérite une précision, car il conditionne la faisabilité : les 43,9 millions de lignes ne sont jamais nettoyées ligne à ligne. Le format Parquet étant orienté colonnes, seules neuf colonnes sur cinquante-quatre sont lues, et le filtrage (établissements actifs, employeurs, diffusibles) est poussé au niveau du fichier. Le volume est ainsi réduit avant toute transformation, et les contrôles qualité s'appliquent ensuite à des agrégats de quelques centaines de milliers de lignes, inspectables et testables.</w:t>
+        <w:t>Le nettoyage de Sirene conditionne la faisabilité : les 43,9 millions de lignes ne sont jamais nettoyées ligne à ligne. Le format Parquet range les données par colonne ; je n'en lis que neuf sur cinquante-quatre, et le filtre (actifs, employeurs, diffusibles) s'applique dès la lecture du fichier. Le volume est réduit avant toute transformation, et les contrôles qualité portent ensuite sur des agrégats de quelques centaines de milliers de lignes, inspectables.</w:t>
       </w:r>
     </w:p>
     <w:tbl>
@@ -2005,22 +1991,17 @@
           </w:p>
           <w:p>
             <w:r>
-              <w:t>Quelques dizaines de milliers de formations, soit 82 Mo mesurés sur disque, ne justifient en aucun cas un cluster distribué. La chaîne de décision est donc traitée en mono-nœud avec Polars et dbt : ce point-là ne fait pas débat.</w:t>
+              <w:t>Quelques dizaines de milliers de formations (82 Mo sur disque) ne justifient pas un cluster distribué : la chaîne de décision reste en mono-nœud, sans débat.</w:t>
             </w:r>
           </w:p>
           <w:p>
             <w:r>
-              <w:t>Pour la chaîne de volume, la question a été tranchée par la mesure et non par principe. Sur le fichier Sirene complet (43 896 818 lignes, 54 colonnes, réduites à 9 colonnes utiles), même filtre, même regroupement en 1 929 179 cellules : Polars traite le fichier en 18,2 secondes, PySpark en 87,0 secondes (démarrage de la JVM inclus) — Spark est 4,8 fois plus lent que Polars sur ce volume, pour un résultat rigoureusement identique. La conclusion n'est pas que Spark est inutile, mais qu'il n'apporte rien tant que le calcul tient sur un seul nœud.</w:t>
+              <w:t>Pour la chaîne de volume, j'ai mesuré plutôt que décidé par principe. Sur Sirene complet (43 896 818 lignes, 54 colonnes réduites à 9), même filtre, même regroupement en 1 929 179 cellules : Polars traite le fichier en 18,2 secondes, PySpark en 87,0 secondes (JVM comprise) — Spark est 4,8 fois plus lent, pour un résultat identique.</w:t>
             </w:r>
           </w:p>
           <w:p>
             <w:r>
-              <w:t>Ce qui empêche d'écarter Spark pour autant : l'une des quatre sources Sirene retenues, l'historique des établissements, compte à elle seule 95 865 102 lignes, et le stock est republié chaque mois. Une fusion future de plusieurs de ces fichiers change d'ordre de grandeur. Le job Spark est donc implémenté, testé (même résultat que Polars, vérifié ligne à ligne sur un échantillon commun) et branché sur le mode cluster de la configuration (`execution.moteur_volume`) — prêt à prendre le relais sans réécriture, mais pas employé par défaut faute de bénéfice mesuré aujourd'hui.</w:t>
-            </w:r>
-          </w:p>
-          <w:p>
-            <w:r>
-              <w:t>Le seuil qui ferait basculer l'exécution courante vers Spark : la fusion de plusieurs des quatre fichiers Sirene retenus, ou tout calcul intermédiaire qui ne tiendrait plus dans la mémoire d'un poste de développement. Tant que ce seuil n'est pas franchi, Polars reste le chemin de production réel, et le choix contraire — imposer Spark par principe — serait pénalisable au titre des critères d'arbitrage, de FinOps et de GreenOps.</w:t>
+              <w:t>Un des quatre fichiers Sirene retenus, l'historique des établissements, compte à lui seul 95 865 102 lignes, republié chaque mois : une fusion future changerait d'ordre de grandeur. Le job Spark est donc implémenté, testé (même résultat que Polars) et branché en mode cluster, prêt sans réécriture. Seuil de bascule : fusion de plusieurs fichiers Sirene, ou calcul qui ne tiendrait plus en mémoire sur un poste de développement. Tant que ce seuil n'est pas franchi, Polars reste le chemin réel.</w:t>
             </w:r>
           </w:p>
         </w:tc>
@@ -2033,7 +2014,7 @@
           <w:b/>
           <w:i w:val="0"/>
         </w:rPr>
-        <w:t>Réconciliation des nomenclatures. C'est le cœur de la difficulté technique du pipeline. Trois nomenclatures indépendantes doivent être mises en correspondance :</w:t>
+        <w:t>Réconciliation des nomenclatures : le cœur de la difficulté technique. Trois nomenclatures indépendantes à mettre en correspondance.</w:t>
       </w:r>
     </w:p>
     <w:tbl>
@@ -2204,7 +2185,7 @@
           <w:b w:val="0"/>
           <w:i w:val="0"/>
         </w:rPr>
-        <w:t>Cette table de correspondance conditionne la qualité du terme de débouchés : sans elle, l'existence d'employeurs du secteur correspondant à une formation ne peut être établie. Elle est construite, versionnée, testée et documentée comme un actif de données à part entière. Son taux de couverture, jusqu'à la NAF, est mesuré : 61,4 % des formations du référentiel ONISEP portant un code RNCP renseigné sont rattachées à une division NAF. **Mais aucun des huit millésimes Parcoursup ne porte de code RNCP, NSF ou ROME** : la chaîne relie le référentiel ONISEP à la NAF, pas les formations Parcoursup elles-mêmes. Le seul rapprochement mesuré entre les deux est un appariement textuel des libellés de formation, et il ne couvre que **7 libellés distincts sur 712, soit 6 017 lignes sur 440 030 (1,4 %)** — les sept correspondances ont été relues à la main, ce sont des diplômes d'État très normés dont l'intitulé varie peu d'une source à l'autre. Pour les 98,6 % de lignes restantes, le terme de débouchés du score de matching (section 7) est marqué explicitement indisponible, jamais mis à zéro en silence.</w:t>
+        <w:t>Cette table conditionne la qualité du terme de débouchés : sans elle, impossible de savoir s'il existe des employeurs du secteur en face d'une formation. Elle est construite, versionnée, testée. Sa couverture, jusqu'à la NAF, est mesurée : 61,4 % des formations ONISEP portant un code RNCP sont rattachées à une division NAF. Mais aucun des huit millésimes Parcoursup ne porte de code RNCP, NSF ou ROME : la chaîne relie ONISEP à la NAF, pas les formations Parcoursup elles-mêmes. Le seul rapprochement mesuré entre les deux, un appariement textuel des libellés, ne couvre que 7 libellés sur 712, soit 6 017 lignes sur 440 030 (1,4 %) — sept diplômes d'État très normés, relus à la main. Pour les 98,6 % restants, le terme de débouchés est marqué indisponible, jamais mis à zéro en silence.</w:t>
       </w:r>
     </w:p>
     <w:p>
@@ -2222,7 +2203,7 @@
           <w:b w:val="0"/>
           <w:i w:val="0"/>
         </w:rPr>
-        <w:t>Les contrôles qualité (E14) portent sur le schéma, la complétude et la cohérence, au moyen de contrôles versionnés (schémas Pandera pour Parcoursup, compteurs écrits à la main pour Sirene et les référentiels, retenus après mesure du coût de Great Expectations sur ce volume — inutile ici) : un taux hors de l'intervalle admissible, un effectif incohérent ou un millésime manquant bloquent la mise à jour, vérifié par une exécution réelle qui sort en échec sur les données du dépôt et par un scénario de panne rejouable par une commande. Ce blocage n'est pas une précaution facultative : sans lui, une donnée corrompue se propage jusqu'au modèle sans que personne ne le constate. La conformité RGPD est assurée par la minimisation et la traçabilité, la couche de volume ne contenant par construction aucune donnée à caractère personnel.</w:t>
+        <w:t>Les contrôles qualité portent sur le schéma, la complétude et la cohérence (schémas Pandera pour Parcoursup, compteurs écrits à la main pour Sirene et les référentiels — Great Expectations écarté après mesure de son coût, inutile ici) : un taux hors intervalle, un effectif incohérent ou un millésime manquant bloquent la mise à jour, vérifié par une exécution réelle et un scénario de panne rejouable. Sans ce blocage, une donnée corrompue se propage jusqu'au modèle sans que personne ne le voie. La couche de volume ne contient par construction aucune donnée personnelle.</w:t>
       </w:r>
     </w:p>
     <w:p>
@@ -2231,7 +2212,7 @@
           <w:b w:val="0"/>
           <w:i w:val="0"/>
         </w:rPr>
-        <w:t>Apache Airflow orchestre la chaîne : quatre DAG, un par cadence réelle de source (annuelle pour Parcoursup, mensuelle pour Sirene, quotidienne pour les référentiels, et un DAG de purge), couvrant ingestion, qualité, silver, gold, variables, agrégats et réconciliation des nomenclatures, treize tâches distinctes au total (`src/edumatch/orchestration/taches.py`). La reprise sur erreur est décidée en code, pas confiée au retry natif d'Airflow (désactivé) : un vocabulaire d'erreur transitoire contre définitive, une temporisation croissante, deux scénarios de panne rejouables. **Le réentraînement et l'évaluation du modèle sont désormais dans le graphe** : le DAG annuel `edumatch_parcoursup` compte huit tâches et se termine par `reentrainer_modele` puis `evaluer_modele`, déclenchées après la détection de dérive et derrière le même contrôle qualité bloquant que le reste de la chaîne. Une porte de promotion (`src/edumatch/orchestration/promotion.py`) refuse de publier un modèle réentraîné qui ne bat pas strictement le plancher E21 en test : à ce jour, elle refuse, pour la même raison que la section suivante détaille. La supervision (volumétrie traitée, taux d'échec, durée d'exécution) reste à ajouter au pipeline lui-même ; les alertes aujourd'hui écrites portent sur le service d'inférence, pas sur le pipeline.</w:t>
+        <w:t>Airflow orchestre la chaîne : quatre DAG, un par cadence réelle (annuelle, mensuelle, quotidienne, plus un DAG de purge), treize tâches au total. La reprise sur erreur est décidée en code plutôt que confiée au retry natif d'Airflow (désactivé) : erreur transitoire ou définitive, temporisation croissante, deux scénarios de panne rejouables. Le réentraînement et l'évaluation du modèle sont dans le graphe : le DAG annuel se termine par ces deux tâches, déclenchées après détection de dérive, derrière le même contrôle qualité bloquant. Une porte de promotion refuse de publier un modèle réentraîné qui ne bat pas strictement le plancher en test — à ce jour, elle refuse, pour la raison détaillée au bloc 4. La supervision du pipeline lui-même reste à ajouter ; les alertes écrites aujourd'hui portent sur le service d'inférence.</w:t>
       </w:r>
     </w:p>
     <w:p>
@@ -2240,7 +2221,7 @@
           <w:b w:val="0"/>
           <w:i/>
         </w:rPr>
-        <w:t>À livrer à terme : capture vidéo du pipeline en production, avec panne et reprise. Le diagramme du pipeline et le code sont déjà sur le dépôt. Évaluation : lecture environ 20 min, présentation 5 min, questions 15 min.</w:t>
+        <w:t>À livrer : capture vidéo du pipeline en production, avec panne et reprise. Le diagramme et le code sont déjà sur le dépôt. Évaluation : lecture 20 min, présentation 5 min, questions 15 min.</w:t>
       </w:r>
     </w:p>
     <w:p>
@@ -2262,7 +2243,7 @@
           <w:b w:val="0"/>
           <w:i/>
         </w:rPr>
-        <w:t>Ce que le projet rend inévitable : une décision automatisée à fort enjeu, une exigence d'explicabilité de droit et non de confort, des données sujettes à dérive, et un environnement de production.</w:t>
+        <w:t>Ce que le projet impose : une décision automatisée à fort enjeu, une explicabilité de droit et non de confort, des données sujettes à dérive, un environnement de production.</w:t>
       </w:r>
     </w:p>
     <w:p>
@@ -2280,7 +2261,7 @@
           <w:b w:val="0"/>
           <w:i w:val="0"/>
         </w:rPr>
-        <w:t>La recommandation combine trois termes. Un seul composant est appris ; les deux autres reposent sur des règles métier et des agrégats calculés. Cette répartition est un choix d'architecte : on n'apprend que ce qui ne peut pas être établi autrement.</w:t>
+        <w:t>La recommandation combine trois termes. Un seul est appris ; les deux autres reposent sur des règles et des agrégats. C'est un choix d'architecte : je n'apprends que ce qui ne peut pas être établi autrement.</w:t>
       </w:r>
     </w:p>
     <w:tbl>
@@ -2384,7 +2365,7 @@
           <w:p>
             <w:r/>
             <w:r>
-              <w:t>Intérêts déclarés dans la requête, référentiels de domaines</w:t>
+              <w:t>Intérêts déclarés, référentiels de domaines</w:t>
             </w:r>
           </w:p>
         </w:tc>
@@ -2395,7 +2376,7 @@
           <w:p>
             <w:r/>
             <w:r>
-              <w:t>Règles et pondérations métier. Aucun apprentissage, aucune donnée stockée : la valeur est fournie dans l'appel.</w:t>
+              <w:t>Règles et pondérations métier. Aucun apprentissage, aucune donnée stockée.</w:t>
             </w:r>
           </w:p>
         </w:tc>
@@ -2430,7 +2411,7 @@
           <w:p>
             <w:r/>
             <w:r>
-              <w:t>Parcoursup, huit millésimes bruts ; six exploitables pour l'entraînement (2020-2025), le numérateur du label n'étant pas publié en 2018-2019</w:t>
+              <w:t>Parcoursup, huit millésimes bruts, six exploitables (2020-2025)</w:t>
             </w:r>
           </w:p>
         </w:tc>
@@ -2441,7 +2422,7 @@
           <w:p>
             <w:r/>
             <w:r>
-              <w:t>MODÈLE APPRIS (LightGBM, entraîné et tracé dans MLflow). C'est le composant d'intelligence artificielle du système ; l'explicabilité SHAP est produite (TreeSHAP), mais le modèle ne bat pas son plancher en test (détail plus bas).</w:t>
+              <w:t>Modèle appris (LightGBM, tracé dans MLflow). Explicabilité SHAP produite, mais le modèle ne bat pas son plancher en test (détail plus bas).</w:t>
             </w:r>
           </w:p>
         </w:tc>
@@ -2487,7 +2468,7 @@
           <w:p>
             <w:r/>
             <w:r>
-              <w:t>Agrégats de densité et de dynamique des employeurs du secteur dans le bassin de vie. Aucun apprentissage.</w:t>
+              <w:t>Agrégats de densité et de dynamique des employeurs. Aucun apprentissage.</w:t>
             </w:r>
           </w:p>
         </w:tc>
@@ -2499,7 +2480,7 @@
           <w:b w:val="0"/>
           <w:i w:val="0"/>
         </w:rPr>
-        <w:t>Les trois termes sont combinés de façon multiplicative, module écrit et testé (`matching/score.py`, `affinite.py`, `debouches.py`, E28) : un terme nul supprime la recommandation, propriété vérifiée séparément pour les trois termes. Si l'affinité est nulle, la formation ne correspond pas ; si l'accessibilité est nulle, elle est hors de portée ; si les débouchés sont nuls ou indisponibles, elle ne mène nulle part démontrable. Une somme pondérée ne le permettrait pas.</w:t>
+        <w:t>Les trois termes se multiplient, module testé : un terme nul supprime la recommandation, vérifié pour les trois termes séparément. Une somme pondérée ne donnerait pas cette garantie.</w:t>
       </w:r>
     </w:p>
     <w:p>
@@ -2508,7 +2489,7 @@
           <w:b w:val="0"/>
           <w:i w:val="0"/>
         </w:rPr>
-        <w:t>Le terme de débouchés répond directement à la première cause identifiée en section 1.2, le manque d'information sur les débouchés, et il n'est donc pas une variable ajoutée mais une dimension constitutive de la décision. **Sa couverture réelle est faible et mesurée** : seules 6 017 lignes sur 440 030 (1,4 %) disposent d'un appariement vérifié entre une formation Parcoursup et une activité économique, faute de code RNCP, NSF ou ROME porté par le fichier Parcoursup lui-même (détail en section 6). Pour les autres lignes, le terme est marqué explicitement indisponible plutôt que mis à zéro en silence. Les variables issues de Sirene n'ont, pour la même raison, jamais pu entrer dans la table de variables du modèle d'accessibilité : l'hypothèse d'un effet de la densité d'employeurs sur la sélectivité reste non testée, faute de rattachement, et non infirmée par une mesure. Voir l'étude d'ablation en fin de section.</w:t>
+        <w:t>Le terme de débouchés répond à la première cause identifiée en 1.2, le manque d'information sur les débouchés : ce n'est pas une variable ajoutée, c'est une dimension de la décision. Sa couverture réelle est faible et mesurée : 6 017 lignes sur 440 030 (1,4 %) seulement ont un appariement vérifié entre une formation Parcoursup et une activité économique, faute de code RNCP, NSF ou ROME porté par Parcoursup lui-même (section 6). Pour les autres lignes, le terme est marqué indisponible. Pour la même raison, les variables Sirene n'ont jamais pu entrer dans le modèle d'accessibilité : l'hypothèse d'un effet de la densité d'employeurs sur la sélectivité reste non testée, pas infirmée. Voir l'ablation en fin de section.</w:t>
       </w:r>
     </w:p>
     <w:tbl>
@@ -2536,22 +2517,17 @@
           </w:p>
           <w:p>
             <w:r>
-              <w:t>Il serait tentant d'apprendre les trois termes. Ce serait une erreur d'architecture.</w:t>
+              <w:t>L'affinité est une préférence exprimée par le candidat lui-même : rien à prédire, la valeur est dans la requête, la pondération relève de règles arbitrées avec des conseillers d'orientation.</w:t>
             </w:r>
           </w:p>
           <w:p>
             <w:r>
-              <w:t>L'affinité est une préférence exprimée par le candidat lui-même. Rien n'est à prédire : la valeur est déclarée dans la requête, et la pondération par domaine relève de règles métier arbitrées avec les conseillers d'orientation. Y substituer un modèle reviendrait à prétendre deviner un goût que l'utilisateur vient d'énoncer.</w:t>
+              <w:t>Les débouchés sont un dénombrement : la densité d'employeurs d'un secteur se calcule exactement depuis Sirene ; en faire une prédiction n'ajouterait rien et retirerait de la transparence.</w:t>
             </w:r>
           </w:p>
           <w:p>
             <w:r>
-              <w:t>Les débouchés sont un dénombrement. La densité d'employeurs d'un secteur dans un bassin se calcule exactement à partir de la base Sirene ; la transformer en prédiction n'apporterait aucune information et retirerait de la transparence, puisque le chiffre exact est disponible.</w:t>
-            </w:r>
-          </w:p>
-          <w:p>
-            <w:r>
-              <w:t>L'accessibilité, en revanche, doit être apprise. Elle dépend d'une combinaison de facteurs (sélectivité historique, capacité, tension, territoire, caractéristiques du candidat) dont l'interaction n'est décrite par aucune table. C'est le seul endroit où un modèle apporte quelque chose qu'une règle ne saurait produire.</w:t>
+              <w:t>L'accessibilité, elle, doit être apprise : elle dépend d'une combinaison de facteurs (sélectivité historique, capacité, tension, territoire, profil du candidat) qu'aucune table ne décrit. C'est le seul endroit où un modèle apporte ce qu'une règle ne peut pas produire.</w:t>
             </w:r>
           </w:p>
         </w:tc>
@@ -2564,7 +2540,7 @@
           <w:b w:val="0"/>
           <w:i w:val="0"/>
         </w:rPr>
-        <w:t>Algorithme. Le modèle d'accessibilité est entraîné par gradient boosting (LightGBM) sur les résultats d'admission publiés, entraînement tracé dans MLflow (paramètres, métriques, artefact du modèle). Le gradient boosting est retenu plutôt qu'un réseau de neurones : les variables sont tabulaires, le coût d'inférence doit rester faible, et l'explicabilité par valeurs de Shapley y est exacte et directement applicable. Il est couplé à SHAP (`models/explain.py`), qui fournit pour chaque recommandation les facteurs déterminants, exigence directe de l'AI Act et du droit à explication du RGPD : l'axiome d'efficacité de SHAP est vérifié à 2,1 × 10⁻¹⁵ près sur le modèle réel et par un test indépendant sur un modèle jouet, le précalcul complet est mesuré (440 030 cellules, 8,3 minutes, 99,8 Mo), et la route `/explain` de l'API le sert.</w:t>
+        <w:t>Algorithme : le modèle d'accessibilité est un gradient boosting (LightGBM) entraîné sur les résultats d'admission publiés, tracé dans MLflow. Je le préfère à un réseau de neurones : les variables sont tabulaires, l'inférence doit rester légère, et les valeurs de Shapley y sont exactes. Il est couplé à SHAP, qui donne pour chaque recommandation les facteurs déterminants — exigé par l'AI Act et le droit à explication du RGPD. L'axiome d'efficacité de SHAP est vérifié à 2,1 × 10⁻¹⁵ près sur le modèle réel et par un test indépendant sur un modèle jouet ; le précalcul complet (440 030 cellules, 8,3 minutes, 99,8 Mo) alimente la route /explain de l'API.</w:t>
       </w:r>
     </w:p>
     <w:tbl>
@@ -2592,17 +2568,17 @@
           </w:p>
           <w:p>
             <w:r>
-              <w:t>EduMatch est en phase d'amorçage et ne dispose d'aucun historique d'usage. C'est la situation du démarrage à froid, problème classique des systèmes de recommandation : il est impossible d'apprendre sur un comportement qui n'existe pas encore.</w:t>
+              <w:t>EduMatch démarre et n'a aucun historique d'usage : c'est le problème classique du démarrage à froid, impossible d'apprendre sur un comportement qui n'existe pas encore.</w:t>
             </w:r>
           </w:p>
           <w:p>
             <w:r>
-              <w:t>La réponse retenue est celle qui fait référence dans le domaine : apprendre la partie prédictive sur des données publiques déjà disponibles, et traiter le reste par des règles et des taux observés. Les résultats d'admission de Parcoursup contiennent précisément l'information recherchée, la sélectivité effective d'une formation pour un type de candidat donné, et ils sont publiés chaque année depuis 2018.</w:t>
+              <w:t>La réponse retenue : apprendre la partie prédictive sur des données publiques déjà là, et traiter le reste par des règles et des taux observés. Les résultats Parcoursup donnent exactement l'information recherchée, publiée chaque année depuis 2018.</w:t>
             </w:r>
           </w:p>
           <w:p>
             <w:r>
-              <w:t>Cette décomposition a une conséquence favorable : le seul composant appris repose sur un label observé et vérifiable, et non sur un indicateur de substitution construit à partir d'un comportement supposé. Le modèle est donc évaluable de façon honnête dès la première campagne.</w:t>
+              <w:t>Conséquence favorable : le seul composant appris repose sur un label observé et vérifiable, pas sur un indicateur de substitution — le modèle est évaluable honnêtement dès la première campagne.</w:t>
             </w:r>
           </w:p>
         </w:tc>
@@ -2615,7 +2591,7 @@
           <w:b w:val="0"/>
           <w:i w:val="0"/>
         </w:rPr>
-        <w:t>Le chatbot RAG, brique secondaire, est construit et réécrit pour ce projet plutôt que repris du MVP décrit en section 2 (`src/edumatch/rag/`) : il restitue en langue naturelle, avec citation des sources officielles, les éléments qui fondent une recommandation, sans faire l'objet du dispositif de réentraînement et de détection de dérive du modèle d'accessibilité. Le corpus (7 403 documents issus des référentiels ONISEP) est indexé par recherche lexicale (TF-IDF) plutôt que par embeddings et base vectorielle, écartés faute de volume qui en justifierait le coût ; la citation est garantie par construction, puisque la liste des sources est bâtie à partir des documents retrouvés avant l'appel au modèle de langage, jamais depuis ce que ce dernier prétend avoir consulté. Les briques du MVP (CamemBERT, FAISS, LangChain, Mistral-small) n'ont donc pas été reprises : la sobriété technique est ici la réponse d'architecte à un composant hors du périmètre certifiant principal.</w:t>
+        <w:t>Le chatbot RAG, brique secondaire, est réécrit pour ce projet plutôt que repris du MVP : il restitue en langue naturelle, avec citation des sources officielles, ce qui fonde une recommandation, sans faire partie du dispositif de réentraînement du modèle d'accessibilité. Le corpus (7 403 documents ONISEP) est indexé par recherche lexicale (TF-IDF) plutôt que par embeddings et base vectorielle, écartés faute de volume qui en justifierait le coût ; la citation est garantie par construction, puisque la liste des sources vient des documents retrouvés avant l'appel au modèle de langage, jamais de ce que celui-ci prétend avoir lu. Les briques du MVP (CamemBERT, FAISS, LangChain, Mistral-small) ne sont pas reprises.</w:t>
       </w:r>
     </w:p>
     <w:p>
@@ -2633,7 +2609,7 @@
           <w:b w:val="0"/>
           <w:i w:val="0"/>
         </w:rPr>
-        <w:t>L'unité d'observation est la cellule, croisement d'une formation, d'une session, d'un type de baccalauréat et d'un statut de boursier. La cible est le taux d'admission observé de cette cellule, rapport entre les propositions d'admission et les vœux formulés en phase principale, deux grandeurs publiées.</w:t>
+        <w:t>L'unité d'observation est la cellule : formation × session × type de bac × statut de boursier. La cible est le taux d'admission observé de cette cellule, rapport entre propositions d'admission et vœux en phase principale — deux grandeurs publiées.</w:t>
       </w:r>
     </w:p>
     <w:tbl>
@@ -2696,7 +2672,7 @@
           <w:p>
             <w:r/>
             <w:r>
-              <w:t>Taux d'admission observé de la cellule, dans l'intervalle [0, 1]. Label mesuré et publié : ni simulé, ni dérivé d'un indicateur de substitution</w:t>
+              <w:t>Taux d'admission observé, dans [0, 1]. Mesuré et publié, ni simulé ni dérivé d'un indicateur de substitution</w:t>
             </w:r>
           </w:p>
         </w:tc>
@@ -2720,7 +2696,7 @@
           <w:p>
             <w:r/>
             <w:r>
-              <w:t>77 159 cellules exploitables pour la session 2025 ; 440 030 observations sur les six sessions où le label est calculable (2020-2025)</w:t>
+              <w:t>77 159 cellules pour la session 2025 ; 440 030 observations sur les six sessions où le label est calculable (2020-2025)</w:t>
             </w:r>
           </w:p>
         </w:tc>
@@ -2744,7 +2720,7 @@
           <w:p>
             <w:r/>
             <w:r>
-              <w:t>Chaque observation est pondérée par l'effectif de la cellule : une cellule de trois candidats porte un taux très bruité, une cellule de cinq cents une information fiable</w:t>
+              <w:t>Chaque observation pondérée par l'effectif de la cellule : une cellule de trois candidats porte un taux bruité, une cellule de cinq cents une information fiable</w:t>
             </w:r>
           </w:p>
         </w:tc>
@@ -2768,7 +2744,7 @@
           <w:p>
             <w:r/>
             <w:r>
-              <w:t>Strictement temporelle : entraînement 2020-2023 (286 463 cellules), validation 2024 (76 408), test 2025 (77 159). Bornée aux six sessions où le label existe réellement (le numérateur ventilé par type de baccalauréat n'est pas publié en 2018-2019) : y inclure ces deux millésimes aurait placé une cible absente dans l'entraînement. Une séparation aléatoire, elle, placerait la même formation de part et d'autre et produirait une fuite d'information</w:t>
+              <w:t>Strictement temporelle : entraînement 2020-2023 (286 463 cellules), validation 2024 (76 408), test 2025 (77 159). Bornée aux six sessions où le label existe (le numérateur par type de bac n'est pas publié en 2018-2019). Une séparation aléatoire placerait la même formation de part et d'autre et produirait une fuite d'information</w:t>
             </w:r>
           </w:p>
         </w:tc>
@@ -2859,7 +2835,7 @@
               <w:rPr>
                 <w:b/>
               </w:rPr>
-              <w:t>Plancher — taux de la session précédente (test 2025)</w:t>
+              <w:t>Plancher — taux session précédente (test 2025)</w:t>
             </w:r>
           </w:p>
         </w:tc>
@@ -2977,7 +2953,7 @@
           <w:b w:val="0"/>
           <w:i w:val="0"/>
         </w:rPr>
-        <w:t>En validation 2024, le modèle passait devant (0,0690 contre 0,0727 de MAE pondérée, 0,0030 contre 0,0141 d'ECE) ; en test 2025 il repasse derrière sur les deux métriques à la fois. La courbe d'apprentissage (10, 25, 50 et 100 % du volume d'entraînement : 0,0758, 0,0723, 0,0705, 0,0698 de MAE pondérée en validation) établit que ce n'est pas un manque de données — le gain marginal se divise par deux à chaque doublement du volume — mais une dérive temporelle entre les sessions d'entraînement (2020-2023) et la session de test (2025). Le protocole d'évaluation n'a pas été retouché après ce résultat pour le faire passer : le seuil que le modèle devait battre (0,0701 de MAE pondérée, à couverture égale) a été écrit avant l'entraînement, dans le document d'évaluation, et le résultat est rapporté tel qu'il est sorti. C'est ce résultat qui fonde l'avis du délégué à la protection des données, défavorable à la restitution de cette estimation à des candidats réels tant qu'il n'est pas corrigé (section 4).</w:t>
+        <w:t>En validation 2024, le modèle passait devant (0,0690 contre 0,0727 de MAE pondérée, 0,0030 contre 0,0141 d'ECE) ; en test 2025 il repasse derrière sur les deux métriques. La courbe d'apprentissage (10, 25, 50, 100 % du volume : 0,0758, 0,0723, 0,0705, 0,0698 de MAE pondérée en validation) montre que ce n'est pas un manque de données — le gain marginal se divise par deux à chaque doublement du volume — mais une dérive entre les sessions d'entraînement (2020-2023) et le test (2025). Le seuil à battre (0,0701 de MAE pondérée) a été écrit avant l'entraînement, et le résultat est rapporté tel qu'il est sorti. C'est ce résultat qui fonde l'avis défavorable du délégué à la protection des données sur la restitution de cette estimation à des candidats réels (section 4).</w:t>
       </w:r>
     </w:p>
     <w:p>
@@ -2986,7 +2962,7 @@
           <w:b w:val="0"/>
           <w:i w:val="0"/>
         </w:rPr>
-        <w:t>Restitution. L'estimation est présentée comme une fréquence observée et non comme une prédiction individuelle : « sur cent candidats ayant vos caractéristiques scolaires et ayant demandé cette formation, tel nombre a reçu une proposition ». Le modèle ne connaît ni les notes exactes, ni les appréciations, ni la lettre de motivation, alors que la sélection s'appuie sur l'ensemble du dossier. Cette formulation est écrite dans l'écran de supervision et servie par l'API (`src/edumatch/api/`, dix-neuf modules, huit fichiers de tests) ; elle porte en outre la mise en garde issue du résultat ci-dessus, attachée à chaque score produit plutôt que documentée à part.</w:t>
+        <w:t>Restitution : l'estimation est présentée comme une fréquence observée, pas une prédiction individuelle : « sur cent candidats avec votre profil ayant demandé cette formation, tel nombre a reçu une proposition ». Le modèle ne connaît ni les notes, ni les appréciations, ni la lettre de motivation, alors que la sélection s'appuie sur tout le dossier. Cette formulation figure dans l'écran de supervision et dans l'API, avec la mise en garde issue du résultat ci-dessus attachée à chaque score.</w:t>
       </w:r>
     </w:p>
     <w:tbl>
@@ -3014,22 +2990,17 @@
           </w:p>
           <w:p>
             <w:r>
-              <w:t>Aucune variable de genre n'entre dans le modèle. Elle est conservée exclusivement pour l'audit d'équité a posteriori, et les variables susceptibles d'agir comme substituts (établissement d'origine, académie) sont testées pour corrélation résiduelle.</w:t>
+              <w:t>Aucune variable de genre n'entre dans le modèle ; elle sert seulement à l'audit d'équité a posteriori. Les substituts possibles (établissement d'origine, académie) sont testés pour corrélation résiduelle.</w:t>
             </w:r>
           </w:p>
           <w:p>
             <w:r>
-              <w:t>L'objection habituelle est qu'exclure une variable prédictive dégrade la précision. La mesure montre qu'il n'en est rien ici. Sur les 11 099 formations recevant au moins trente vœux de chaque sexe, l'écart médian de taux d'admission entre femmes et hommes est nul, sa moyenne est de moins d'un demi-point, et il reste inférieur à cinq points dans 83,8 pour cent des cas.</w:t>
+              <w:t>On objecte souvent qu'exclure une variable prédictive coûte de la précision. La mesure montre que non ici : sur les 11 099 formations recevant au moins trente vœux de chaque sexe, l'écart médian de taux d'admission entre femmes et hommes est nul, la moyenne inférieure à un demi-point, et il reste sous cinq points dans 83,8 pour cent des cas.</w:t>
             </w:r>
           </w:p>
           <w:p>
             <w:r>
-              <w:t>L'explication est structurelle : la sélection s'appuie sur le dossier scolaire, non sur le sexe. Le genre agit massivement sur le choix des formations demandées, la ségrégation décrite en section 1.1, mais quasiment pas sur la probabilité d'être admis une fois le vœu formulé. L'information est donc déjà portée par la formation demandée et le dossier.</w:t>
-            </w:r>
-          </w:p>
-          <w:p>
-            <w:r>
-              <w:t>Même si un écart existait, l'utiliser serait exclu. D'une part il s'agirait d'une discrimination directe dans l'accès à l'éducation. D'autre part le système deviendrait un amplificateur de ségrégation par effet de boucle : annoncer à un garçon qu'il a moins de chances dans une filière féminisée le dissuaderait de postuler, renforçant la ségrégation que le modèle apprendrait l'année suivante.</w:t>
+              <w:t>La sélection s'appuie sur le dossier scolaire, pas sur le sexe : le genre agit sur le choix des formations demandées, pas sur la probabilité d'être admis une fois le vœu formulé. Même si un écart existait, l'utiliser serait exclu : ce serait une discrimination directe, et le système amplifierait la ségrégation en boucle.</w:t>
             </w:r>
           </w:p>
         </w:tc>
@@ -3042,7 +3013,7 @@
           <w:b w:val="0"/>
           <w:i w:val="0"/>
         </w:rPr>
-        <w:t>Audit d'équité, conduit sur les prédictions réelles du modèle entraîné (`models/fairness.py`, E26), sur quatre dimensions : type de baccalauréat, statut de boursier, genre et territoire. La définition d'équité privilégiée — la calibration par groupe, un taux prédit de 60 % doit correspondre à un taux observé de 60 % dans chaque groupe — est déclarée avant la mesure, parce qu'elle est incompatible avec la parité démographique et les cotes égalisées dès que les taux de base diffèrent entre groupes : c'est un théorème d'impossibilité, pas un arbitrage de goût.</w:t>
+        <w:t>Audit d'équité, sur les prédictions réelles du modèle, sur quatre dimensions : type de baccalauréat, statut de boursier, genre, territoire. La définition retenue — la calibration par groupe, un taux prédit de 60 % doit correspondre à un taux observé de 60 % dans chaque groupe — est déclarée avant la mesure, car elle est incompatible avec la parité démographique dès que les taux de base diffèrent entre groupes : un théorème d'impossibilité, pas un arbitrage de goût.</w:t>
       </w:r>
     </w:p>
     <w:tbl>
@@ -3213,7 +3184,7 @@
           <w:b w:val="0"/>
           <w:i w:val="0"/>
         </w:rPr>
-        <w:t>**Le système n'est pas équitable sur cette dimension**, et ce résultat n'est pas atténué : il fait mieux que le plancher sur la sélection (0,76 contre 0,63) mais moins bien sur la calibration, où il sur-annonce les chances d'admission sur les formations très féminisées avec une erreur presque deux fois supérieure à celle mesurée ailleurs. Le travail exploratoire en amont (section 1.1) avait déjà mesuré que l'établissement d'origine (28,9 % net d'information mutuelle, corrigée de la cardinalité) et la filière (19,5 % net) sont les substituts du genre les plus puissants parmi les variables candidates : l'établissement est exclu du modèle pour cette raison et pour sa cardinalité, la filière est conservée car sa suppression détruirait la capacité du modèle à distinguer les formations entre elles. L'audit confirme que l'exclusion de variables à l'entrée ne suffit pas : le dispositif d'équité du projet repose sur trois niveaux — exclusion du genre à l'entrée, mesure des substituts, audit a posteriori sur les prédictions — et non sur le seul retrait de colonnes. La dimension territoriale reste, à ce stade, non pénalisante dans les mesures conduites ; elle répond à la deuxième cause structurelle identifiée en section 1.2.</w:t>
+        <w:t>Le système n'est pas équitable sur cette dimension, et ce résultat n'est pas atténué : il fait mieux que le plancher sur la sélection (0,76 contre 0,63) mais moins bien sur la calibration, où il sur-annonce les chances sur les formations très féminisées. L'établissement d'origine (28,9 % net d'information mutuelle) et la filière (19,5 % net) sont les substituts du genre les plus puissants : l'établissement est exclu du modèle pour cette raison et pour sa cardinalité, la filière est conservée car sa suppression détruirait la capacité du modèle à distinguer les formations. L'audit confirme qu'exclure des variables à l'entrée ne suffit pas : le dispositif repose sur trois niveaux — exclusion du genre, mesure des substituts, audit a posteriori. La dimension territoriale reste, à ce stade, non pénalisante.</w:t>
       </w:r>
     </w:p>
     <w:tbl>
@@ -3241,17 +3212,17 @@
           </w:p>
           <w:p>
             <w:r>
-              <w:t>Une source de données qui n'est pas réellement utilisée par le modèle finit par paraître ajoutée artificiellement. Une étude d'ablation à sept variantes (`models/ablation.py`, E27) mesure ce que chaque bloc de variables apporte réellement, sur la validation 2024.</w:t>
+              <w:t>Une étude d'ablation à sept variantes mesure ce que chaque bloc de variables apporte, sur la validation 2024. Retirer les 35 variables décalées (dont le taux de la session précédente) fait passer la MAE pondérée de 0,0698 à 0,1120 (+0,0422) — l'essentiel de la performance vient de connaître ce taux.</w:t>
             </w:r>
           </w:p>
           <w:p>
             <w:r>
-              <w:t>Le résultat dominant : retirer les 35 variables décalées (dont le taux de la session précédente) fait passer la MAE pondérée de validation de 0,0698 à 0,1120 (+0,0422) — l'essentiel de la performance du modèle vient de connaître ce taux, les 45 autres variables affinent la prédiction sans la porter. Retirer les quatre substituts du genre encore présents (filière, sélectivité, département, académie) ne coûte que +0,0006 et ne répare pas l'équité : le ratio d'impact disparate du groupe le plus féminisé se dégrade légèrement (0,66 à 0,62) plutôt que de s'améliorer, ce qui confirme que l'information reconstituant le genre est diffuse dans les variables décalées, pas concentrée dans ces quatre colonnes.</w:t>
+              <w:t>Retirer les quatre substituts du genre encore présents (filière, sélectivité, département, académie) coûte seulement +0,0006 et ne répare pas l'équité : le ratio d'impact disparate du groupe le plus féminisé se dégrade légèrement (0,66 à 0,62), ce qui confirme que l'information sur le genre est diffuse, pas concentrée dans ces colonnes.</w:t>
             </w:r>
           </w:p>
           <w:p>
             <w:r>
-              <w:t>**L'apport de Sirene, en revanche, n'a pas pu être mesuré.** La chaîne de nomenclatures (section 6) ne relie aucune formation Parcoursup à une activité NAF par une clé fiable : Sirene n'est donc jamais entré dans la table de variables du modèle d'accessibilité, et il n'existe rien à retirer d'un modèle où cette source n'est pas entrée. Ce n'est pas un résultat d'apport nul — celui-là a été mesuré, pour les mentions et pour l'établissement d'origine, et rapporté comme tel — c'est une limite du dispositif, déclarée plutôt que déguisée en mesure. Le critère d'apport mesuré est donc rempli pour toutes les sources sauf Sirene, conditionné au rattachement effectif de la chaîne de nomenclatures.</w:t>
+              <w:t>L'apport de Sirene n'a pas pu être mesuré : la chaîne de nomenclatures ne relie aucune formation Parcoursup à une activité NAF par une clé fiable, Sirene n'est donc jamais entré dans la table de variables. Ce n'est pas un apport nul mesuré, c'est une limite du dispositif, déclarée plutôt que déguisée en mesure.</w:t>
             </w:r>
           </w:p>
         </w:tc>
@@ -3264,7 +3235,7 @@
           <w:b w:val="0"/>
           <w:i w:val="0"/>
         </w:rPr>
-        <w:t>Intégration. Le modèle est exposé par une API FastAPI conteneurisée (`src/edumatch/api/`, dix-neuf modules, huit fichiers de tests dont un consacré à la sécurité) : gestion des erreurs dédiée, authentification, limitation de débit, en-têtes de sécurité. Les recommandations alimentent l'écran de supervision consulté par les conseillers d'orientation, qui matérialise l'exigence de contrôle humain posée par l'article 14 du règlement sur l'IA : le conseiller y revoit chaque recommandation, la contextualise à partir du dossier réel de l'élève que le modèle ne connaît pas, et peut l'écarter en motivant sa décision — écartement bloqué côté client et côté serveur, vérifié par test. L'accessibilité RGAA de cet écran est couverte par des tests unitaires (structure sémantique, contraste calculé par la formule WCAG, focus jamais supprimé) et par une procédure d'audit navigateur écrite ; **cette procédure n'a pas encore été déroulée**, aucun rapport d'audit n'existe à ce jour.</w:t>
+        <w:t>Intégration : le modèle est exposé par une API FastAPI conteneurisée (gestion des erreurs, authentification, limitation de débit, en-têtes de sécurité). Les recommandations alimentent l'écran de supervision des conseillers, qui répond à l'exigence de contrôle humain de l'article 14 : le conseiller revoit chaque recommandation, la contextualise avec le dossier réel de l'élève que le modèle ne connaît pas, et peut l'écarter en motivant sa décision — écartement bloqué côté client et côté serveur, vérifié par test. L'accessibilité RGAA de cet écran est couverte par des tests unitaires (structure sémantique, contraste WCAG, focus jamais supprimé) et par une procédure d'audit navigateur écrite, mais pas encore déroulée : aucun rapport d'audit n'existe à ce jour.</w:t>
       </w:r>
     </w:p>
     <w:p>
@@ -3273,7 +3244,7 @@
           <w:b w:val="0"/>
           <w:i w:val="0"/>
         </w:rPr>
-        <w:t>CI/CD. Trois workflows GitHub Actions sont écrits dans le second dépôt (`edumatch-cicd`) : intégration (lint et tests), construction et publication d'images étiquetées par l'empreinte du commit, déploiement délibéré et non automatique. **Aucun de ces workflows n'a encore été exécuté** : une première exécution reste à déclencher pour révéler ce qu'un YAML non testé cache toujours. Le suivi d'expériences avec MLflow est en service (cinq exécutions tracées, paramètres et métriques), et le registre de modèles porte désormais une version : `edumatch-accessibilite` v1, enregistrée par `src/edumatch/models/registre.py` (`make register-model`) depuis l'exécution `678b04627c4945a69c4856c325d7493b` (commit `f431a16`). **Cette version ne porte aucun stade ni alias** : l'étiquette `statut_evaluation` posée sur la version déclare en clair qu'elle ne bat pas le plancher en test, conformément aux mêmes chiffres que la section précédente. Deux dépôts de code distincts existent, sans recouvrement : la solution IA (ce dépôt) et l'intégration-déploiement (36 fichiers : workflows, Terraform, manifestes Kubernetes, monitoring).</w:t>
+        <w:t>CI/CD : trois workflows GitHub Actions sont écrits dans le second dépôt (intégration, construction et publication d'images étiquetées par le commit, déploiement délibéré et non automatique). Aucun n'a encore été exécuté : une première exécution reste à déclencher pour voir ce qu'un YAML jamais testé cache toujours. Le suivi d'expériences MLflow est en service (cinq exécutions tracées), et le registre de modèles porte une version (edumatch-accessibilite v1), sans stade ni alias : l'étiquette posée dessus déclare en clair qu'elle ne bat pas le plancher en test. Deux dépôts de code distincts existent, sans recouvrement : la solution IA et l'intégration-déploiement (36 fichiers : workflows, Terraform, manifestes Kubernetes, monitoring).</w:t>
       </w:r>
     </w:p>
     <w:p>
@@ -3282,7 +3253,7 @@
           <w:b w:val="0"/>
           <w:i w:val="0"/>
         </w:rPr>
-        <w:t>Dérive, mesurée sur des données réelles (E34) : l'indice de stabilité de population (PSI) et le test de Kolmogorov-Smirnov sont calculés directement sur les six sessions où le label existe (2020-2025), pour trois familles distinctes — variables, cible, prédictions du modèle. Evidently a été écarté : sa dernière version compatible avec le reste du projet entraîne un conflit de dépendance transitive avec le paquet dont FastAPI dépend déjà, reproduit et non contourné (ADR 0018). Le seuil de 0,20 s'applique à la médiane du PSI des variables plutôt qu'à leur maximum, pour ne pas déclencher en permanence sur deux colonnes de nomenclature instable sans rapport avec la performance du modèle. Ce que cette mesure ne permet pas de conclure est écrit dans la décision, et c'est l'un des quatre résultats défavorables du projet à retenir : **le PSI à ce seuil n'aurait pas signalé la dégradation pourtant observée entre validation et test.** Il s'agit d'une dérive du concept — la relation entre les variables et la cible change alors que la distribution des entrées bouge à peine — à laquelle un indice de stabilité de population, qui ne compare que des distributions marginales, est aveugle par construction. Réentraînement, à construire : la détection journalise un avertissement mais ne déclenche encore rien, l'automatisation reste à coupler à l'orchestrateur. Le monitoring en production (Prometheus, Grafana, SLO déclaré sur la latence p95 et la disponibilité) est écrit et versionné dans le second dépôt, mais rien n'en a jamais tourné en production.</w:t>
+        <w:t>Dérive, mesurée sur les données réelles : l'indice de stabilité de population (PSI) et le test de Kolmogorov-Smirnov sont calculés sur les six sessions où le label existe (2020-2025), pour trois familles — variables, cible, prédictions. Evidently a été écarté, conflit de dépendance avec un paquet dont FastAPI dépend déjà. Le seuil de 0,20 s'applique à la médiane du PSI plutôt qu'à son maximum, pour ne pas déclencher en permanence sur des colonnes instables sans rapport avec la performance. C'est l'un des quatre résultats défavorables du projet : à ce seuil, le PSI n'aurait pas signalé la dégradation observée entre validation et test — c'est une dérive du concept, la relation entre les variables et la cible change alors que la distribution des entrées bouge à peine, à laquelle un indice qui ne compare que des distributions marginales est aveugle par construction. Le réentraînement automatique reste à construire : la détection journalise un avertissement mais ne déclenche encore rien. Le monitoring en production (Prometheus, Grafana, SLO sur la latence p95 et la disponibilité) est écrit dans le second dépôt, mais n'a jamais tourné en production.</w:t>
       </w:r>
     </w:p>
     <w:p>
@@ -3291,7 +3262,7 @@
           <w:b w:val="0"/>
           <w:i/>
         </w:rPr>
-        <w:t>À livrer à terme : rapport d'audit RGAA exécuté, première exécution de la chaîne d'intégration capturée, un réentraînement qui bat effectivement le plancher pour que la porte de promotion publie une version, et capture vidéo de la solution en production. Présentation de la solution, dépôt n°1 (développement de la solution IA) et dépôt n°2 (intégration et déploiement continus) existent déjà, avec du code réel et distinct.</w:t>
+        <w:t>À livrer : rapport d'audit RGAA exécuté, première exécution de la chaîne d'intégration capturée, un réentraînement qui bat le plancher pour que la porte de promotion publie une version, capture vidéo de la solution en production. La présentation, le dépôt n°1 (solution IA) et le dépôt n°2 (intégration et déploiement continus) existent déjà, avec du code réel et distinct.</w:t>
       </w:r>
     </w:p>
     <w:p>
@@ -3393,7 +3364,7 @@
           <w:p>
             <w:r/>
             <w:r>
-              <w:t>Lecture environ 15 min, présentation 15 min, questions 15 min</w:t>
+              <w:t>Lecture 15 min, présentation 15 min, questions 15 min</w:t>
             </w:r>
           </w:p>
         </w:tc>
@@ -3428,7 +3399,7 @@
           <w:p>
             <w:r/>
             <w:r>
-              <w:t>Lecture environ 20 min, présentation 5 min, questions 15 min</w:t>
+              <w:t>Lecture 20 min, présentation 5 min, questions 15 min</w:t>
             </w:r>
           </w:p>
         </w:tc>
@@ -3463,7 +3434,7 @@
           <w:p>
             <w:r/>
             <w:r>
-              <w:t>Lecture environ 20 min, présentation 5 min, questions 15 min</w:t>
+              <w:t>Lecture 20 min, présentation 5 min, questions 15 min</w:t>
             </w:r>
           </w:p>
         </w:tc>
@@ -3510,7 +3481,7 @@
           <w:b w:val="0"/>
           <w:i w:val="0"/>
         </w:rPr>
-        <w:t>Fil conducteur de la soutenance : partir des constats mesurés dans les données publiques. La ségrégation par le genre est massive alors même que les femmes sont majoritaires parmi les admis, et l'accès reste inégal selon le baccalauréat d'origine. Puis dérouler la chaîne complète, de la gouvernance à la solution, en montrant que chaque source répond à une question précise et qu'un seul composant est appris. Chaque choix est défendu par « X plutôt que Y parce que… ». Quatre résultats défavorables, mesurés et non atténués, structurent une part importante de cette défense : le modèle appris ne bat pas le taux de la session précédente en test (MAE pondérée 0,0758 contre 0,0701, ECE 0,0371 contre 0,0322), le ratio d'impact disparate sur les formations très féminisées est à 0,76, sous le seuil légal de 0,80, la couverture du terme de débouchés n'atteint que 1,4 % des lignes, et l'avis du délégué à la protection des données est scindé, défavorable à la restitution du terme appris à des candidats réels tant qu'il n'aura pas été corrigé. Chacun de ces résultats est mesuré, documenté et assumé plutôt que dissimulé, ce qui est présenté comme une garantie de rigueur plutôt que comme une faiblesse à minimiser.</w:t>
+        <w:t>Fil conducteur de la soutenance : partir des constats mesurés dans les données publiques — la ségrégation par le genre est massive alors que les femmes sont majoritaires parmi les admis, et l'accès reste inégal selon le baccalauréat. Puis dérouler la chaîne complète, de la gouvernance à la solution, en montrant que chaque source répond à une question précise et qu'un seul composant est appris, défendu par « X plutôt que Y parce que... ». Quatre résultats défavorables, mesurés et non atténués, structurent une part importante de cette défense : le modèle ne bat pas le taux de la session précédente en test (MAE pondérée 0,0758 contre 0,0701, ECE 0,0371 contre 0,0322), le ratio d'impact disparate sur les formations très féminisées est à 0,76, sous le seuil légal de 0,80, la couverture du terme de débouchés n'atteint que 1,4 % des lignes, et l'avis du délégué à la protection des données est scindé, défavorable à la restitution du terme appris à des candidats réels tant qu'il n'aura pas été corrigé. Chacun de ces résultats est mesuré, documenté et assumé, ce que je présente comme une garantie de rigueur plutôt qu'une faiblesse à minimiser.</w:t>
       </w:r>
     </w:p>
     <w:p>
@@ -3518,135 +3489,16 @@
         <w:pStyle w:val="Heading1"/>
       </w:pPr>
       <w:r>
-        <w:t>9. Autocontrôle avant dépôt</w:t>
+        <w:t>9. Relecture avant remise</w:t>
       </w:r>
     </w:p>
     <w:p>
-      <w:pPr>
-        <w:pStyle w:val="ListBullet"/>
-      </w:pPr>
       <w:r>
-        <w:t>Le secteur et l'organisation sont décrits : EdTech, startup en amorçage, Île-de-France.</w:t>
-      </w:r>
-    </w:p>
-    <w:p>
-      <w:pPr>
-        <w:pStyle w:val="ListBullet"/>
-      </w:pPr>
-      <w:r>
-        <w:t>La problématique est établie par la mesure, non par l'intuition : ségrégation de genre chiffrée et écart d'accès selon le baccalauréat, recalculés sur le fichier source.</w:t>
-      </w:r>
-    </w:p>
-    <w:p>
-      <w:pPr>
-        <w:pStyle w:val="ListBullet"/>
-      </w:pPr>
-      <w:r>
-        <w:t>Les contraintes forcent de vrais arbitrages : volumétrie, fraîcheur, budget, conformité.</w:t>
-      </w:r>
-    </w:p>
-    <w:p>
-      <w:pPr>
-        <w:pStyle w:val="ListBullet"/>
-      </w:pPr>
-      <w:r>
-        <w:t>L'environnement technique présente les 3V de façon non triviale, avec trois sources dont les volumétries sont vérifiées.</w:t>
-      </w:r>
-    </w:p>
-    <w:p>
-      <w:pPr>
-        <w:pStyle w:val="ListBullet"/>
-      </w:pPr>
-      <w:r>
-        <w:t>Des données personnelles, dont celles de mineurs, sont impliquées avec un enjeu RGPD réel, et la séparation entraînement / inférence est explicite.</w:t>
-      </w:r>
-    </w:p>
-    <w:p>
-      <w:pPr>
-        <w:pStyle w:val="ListBullet"/>
-      </w:pPr>
-      <w:r>
-        <w:t>Les parties prenantes sont nommées, dont le DPO et le superviseur humain.</w:t>
-      </w:r>
-    </w:p>
-    <w:p>
-      <w:pPr>
-        <w:pStyle w:val="ListBullet"/>
-      </w:pPr>
-      <w:r>
-        <w:t>Bloc 1 : gouvernance, rôles, risques, correspondance avec les obligations de l'AI Act, audits.</w:t>
-      </w:r>
-    </w:p>
-    <w:p>
-      <w:pPr>
-        <w:pStyle w:val="ListBullet"/>
-      </w:pPr>
-      <w:r>
-        <w:t>Bloc 2 : architecture séparée en deux couches, infrastructure, sécurisation, supervision.</w:t>
-      </w:r>
-    </w:p>
-    <w:p>
-      <w:pPr>
-        <w:pStyle w:val="ListBullet"/>
-      </w:pPr>
-      <w:r>
-        <w:t>Bloc 3 : trois connecteurs, deux chaînes dimensionnées séparément, réconciliation de trois nomenclatures, automatisation, qualité, supervision.</w:t>
-      </w:r>
-    </w:p>
-    <w:p>
-      <w:pPr>
-        <w:pStyle w:val="ListBullet"/>
-      </w:pPr>
-      <w:r>
-        <w:t>Bloc 4 : un seul modèle industrialisé, rôle de chaque source explicité, cible et protocole définis, calibration, courbe d'apprentissage, ablation, équité sur quatre dimensions, CI/CD écrit, dérive mesurée, deux dépôts de code réel et distinct.</w:t>
-      </w:r>
-    </w:p>
-    <w:p>
-      <w:pPr>
-        <w:pStyle w:val="ListBullet"/>
-      </w:pPr>
-      <w:r>
-        <w:t>Chaque choix important est justifié selon la forme « X plutôt que Y parce que… ».</w:t>
-      </w:r>
-    </w:p>
-    <w:p>
-      <w:pPr>
-        <w:pStyle w:val="ListBullet"/>
-      </w:pPr>
-      <w:r>
-        <w:t>Aucune donnée n'est simulée : toutes les sources sont publiques, réelles et sous licence vérifiée.</w:t>
-      </w:r>
-    </w:p>
-    <w:p>
-      <w:pPr>
-        <w:pStyle w:val="ListBullet"/>
-      </w:pPr>
-      <w:r>
-        <w:t>Les quatre résultats défavorables du projet sont présents dans le corps du dossier, avec leurs chiffres et leur diagnostic, et non tus ou relégués en annexe : performance du modèle sous son plancher en test, ratio d'impact disparate sous le seuil légal, couverture du terme de débouchés à 1,4 %, avis scindé et défavorable du délégué à la protection des données sur le terme appris.</w:t>
-      </w:r>
-    </w:p>
-    <w:p>
-      <w:pPr>
-        <w:pStyle w:val="ListBullet"/>
-      </w:pPr>
-      <w:r>
-        <w:t>Ce qui n'existe pas encore est écrit au futur, sans ambiguïté : déploiement cloud réel, exécution de la chaîne d'intégration, panne filmée, trois vidéos de production.</w:t>
-      </w:r>
-    </w:p>
-    <w:p>
-      <w:pPr>
-        <w:pStyle w:val="ListBullet"/>
-      </w:pPr>
-      <w:r>
-        <w:t>Les limites du dispositif sont déclarées, notamment sur la granularité disponible pour l'audit de genre et sur la portée d'une estimation fondée sur des caractéristiques agrégées.</w:t>
-      </w:r>
-    </w:p>
-    <w:p>
-      <w:pPr>
-        <w:pStyle w:val="ListBullet"/>
-      </w:pPr>
-      <w:r>
-        <w:t>Forme : document structuré en chapitres, en français, fichier nommé « KIONGHAT Johann ».</w:t>
+        <w:rPr>
+          <w:b w:val="0"/>
+          <w:i w:val="0"/>
+        </w:rPr>
+        <w:t>Avant de remettre ce dossier, j'ai relu chaque section pour vérifier que ce qui y est affirmé se retrouve dans le dépôt. La problématique s'appuie sur des chiffres recalculés à partir du fichier source. Chaque choix technique important est justifié sous la forme « X plutôt que Y parce que... », avec au moins une alternative écartée. Aucune donnée n'est simulée : toutes les sources sont publiques, réelles et sous licence vérifiée. Les quatre résultats défavorables du projet figurent dans le corps du texte, pas en annexe : la performance du modèle sous son plancher en test, le ratio d'impact disparate sous le seuil légal, la couverture du terme de débouchés à 1,4 %, l'avis scindé et défavorable du délégué à la protection des données sur le terme appris. Ce qui n'existe pas encore est écrit au futur : déploiement cloud réel, exécution de la chaîne d'intégration, panne filmée, vidéos de production.</w:t>
       </w:r>
     </w:p>
     <w:sectPr>

</xml_diff>

<commit_message>
docs: public du cas d'usage limité aux lycéens de terminale [B1]
Le matching ne traite que les lycéens candidats sur Parcoursup ; les
autres publics de la plateforme sont déclarés hors périmètre dans le
dossier, l'architecture et la stratégie de gouvernance.
</commit_message>
<xml_diff>
--- a/docs/sous-docs-projets/dossier/Projet_Certification_KIONGHAT_Johann.docx
+++ b/docs/sous-docs-projets/dossier/Projet_Certification_KIONGHAT_Johann.docx
@@ -199,6 +199,15 @@
           <w:i w:val="0"/>
         </w:rPr>
         <w:t>EduMatch est une jeune entreprise EdTech basée en Île-de-France, en phase d'amorçage (levée seed de 350 000 euros). Elle édite une plateforme d'orientation scolaire en B2B2C : les clients sont des établissements (lycées, collèges, CFA, organismes de formation), les utilisateurs finaux des élèves et des personnes en reconversion.</w:t>
+      </w:r>
+    </w:p>
+    <w:p>
+      <w:r>
+        <w:rPr>
+          <w:b/>
+          <w:i w:val="0"/>
+        </w:rPr>
+        <w:t>Le cas d'usage traité ici est une seule fonctionnalité de cette plateforme : le matching entre des lycéens de terminale et les formations proposées sur Parcoursup. Le modèle est appris sur les données Parcoursup, qui ne décrivent que l'accès des lycéens à l'enseignement supérieur. Les collégiens, les étudiants et les personnes en reconversion ne sont pas concernés par ce cas d'usage.</w:t>
       </w:r>
     </w:p>
     <w:p>
@@ -660,7 +669,7 @@
         <w:pStyle w:val="ListBullet"/>
       </w:pPr>
       <w:r>
-        <w:t>Conformité : données de mineurs et d'adultes ; le profilage relève de l'article 22 (base légale, consentement, minimisation, transparence, analyse d'impact) et de l'AI Act (explicabilité, non-discrimination), plus le respect des licences (section 3).</w:t>
+        <w:t>Conformité : données de lycéens, majoritairement mineurs (17-18 ans) ; le profilage relève de l'article 22 (base légale, consentement, minimisation, transparence, analyse d'impact) et de l'AI Act (explicabilité, non-discrimination), plus le respect des licences (section 3).</w:t>
       </w:r>
     </w:p>
     <w:p>
@@ -773,7 +782,7 @@
           <w:p>
             <w:r/>
             <w:r>
-              <w:t>Garant RGPD : mineurs et adultes, licéité des données publiques réutilisées.</w:t>
+              <w:t>Garant RGPD : lycéens majoritairement mineurs, licéité des données publiques réutilisées.</w:t>
             </w:r>
           </w:p>
         </w:tc>
@@ -845,7 +854,7 @@
           <w:p>
             <w:r/>
             <w:r>
-              <w:t>Lycées, CFA, organismes de formation ; élèves, étudiants, personnes en reconversion.</w:t>
+              <w:t>Pour ce cas d'usage : lycées clients et leurs élèves de terminale. Les autres publics de la plateforme sont hors périmètre.</w:t>
             </w:r>
           </w:p>
         </w:tc>
@@ -1262,7 +1271,7 @@
           <w:b w:val="0"/>
           <w:i/>
         </w:rPr>
-        <w:t>Ce que le projet impose : données de mineurs et d'adultes, plusieurs sources publiques sous des licences différentes, plusieurs parties prenantes, une conformité AI Act non triviale.</w:t>
+        <w:t>Ce que le projet impose : données de lycéens majoritairement mineurs, plusieurs sources publiques sous des licences différentes, plusieurs parties prenantes, une conformité AI Act non triviale.</w:t>
       </w:r>
     </w:p>
     <w:p>

</xml_diff>